<commit_message>
Redraw Fig 1 schematic (3D cell + oriented molecules, cleaner decomposition) and rebuild manuscript DOCX
</commit_message>
<xml_diff>
--- a/paper/symmc-flow_manuscript.docx
+++ b/paper/symmc-flow_manuscript.docx
@@ -734,7 +734,10 @@
         <w:t xml:space="preserve">diffusion variational autoencoder</w:t>
       </w:r>
       <w:r>
-        <w:t xml:space="preserve">(Xie et al. 2022)</w:t>
+        <w:rPr>
+          <w:vertAlign w:val="superscript"/>
+        </w:rPr>
+        <w:t xml:space="preserve">1</w:t>
       </w:r>
       <w:r>
         <w:t xml:space="preserve"> </w:t>
@@ -749,7 +752,10 @@
         <w:t xml:space="preserve">diffusion over lattices and fractional coordinates</w:t>
       </w:r>
       <w:r>
-        <w:t xml:space="preserve">(Jiao et al. 2023)</w:t>
+        <w:rPr>
+          <w:vertAlign w:val="superscript"/>
+        </w:rPr>
+        <w:t xml:space="preserve">2</w:t>
       </w:r>
       <w:r>
         <w:t xml:space="preserve"> </w:t>
@@ -764,7 +770,10 @@
         <w:t xml:space="preserve">Riemannian flow matching for materials</w:t>
       </w:r>
       <w:r>
-        <w:t xml:space="preserve">(Miller et al. 2024)</w:t>
+        <w:rPr>
+          <w:vertAlign w:val="superscript"/>
+        </w:rPr>
+        <w:t xml:space="preserve">3</w:t>
       </w:r>
       <w:r>
         <w:t xml:space="preserve"> </w:t>
@@ -823,7 +832,10 @@
         <w:t xml:space="preserve">steps</w:t>
       </w:r>
       <w:r>
-        <w:t xml:space="preserve">(Lipman et al. 2023; Chen and Lipman 2024)</w:t>
+        <w:rPr>
+          <w:vertAlign w:val="superscript"/>
+        </w:rPr>
+        <w:t xml:space="preserve">4,5</w:t>
       </w:r>
       <w:r>
         <w:t xml:space="preserve">. The same advantage drove</w:t>
@@ -923,7 +935,10 @@
         <w:t xml:space="preserve">better quality</w:t>
       </w:r>
       <w:r>
-        <w:t xml:space="preserve">(Yim, Trippe, et al. 2023; Yim, Campbell, et al. 2023)</w:t>
+        <w:rPr>
+          <w:vertAlign w:val="superscript"/>
+        </w:rPr>
+        <w:t xml:space="preserve">6,7</w:t>
       </w:r>
       <w:r>
         <w:t xml:space="preserve">. A factorized,</w:t>
@@ -979,16 +994,10 @@
         <w:t xml:space="preserve">bottleneck in community blind tests</w:t>
       </w:r>
       <w:r>
-        <w:t xml:space="preserve">(</w:t>
-      </w:r>
-      <w:r>
-        <w:t xml:space="preserve">Hunnisett et al.</w:t>
-      </w:r>
-      <w:r>
-        <w:t xml:space="preserve"> </w:t>
-      </w:r>
-      <w:r>
-        <w:t xml:space="preserve">2024)</w:t>
+        <w:rPr>
+          <w:vertAlign w:val="superscript"/>
+        </w:rPr>
+        <w:t xml:space="preserve">8</w:t>
       </w:r>
       <w:r>
         <w:t xml:space="preserve"> </w:t>
@@ -1003,7 +1012,10 @@
         <w:t xml:space="preserve">data-efficient learned models</w:t>
       </w:r>
       <w:r>
-        <w:t xml:space="preserve">(Wengert et al. 2021)</w:t>
+        <w:rPr>
+          <w:vertAlign w:val="superscript"/>
+        </w:rPr>
+        <w:t xml:space="preserve">9</w:t>
       </w:r>
       <w:r>
         <w:t xml:space="preserve">. Two design choices</w:t>
@@ -1021,16 +1033,10 @@
         <w:t xml:space="preserve">generators predict every atomic coordinate jointly: OXtal</w:t>
       </w:r>
       <w:r>
-        <w:t xml:space="preserve">(</w:t>
-      </w:r>
-      <w:r>
-        <w:t xml:space="preserve">Jin et al.</w:t>
-      </w:r>
-      <w:r>
-        <w:t xml:space="preserve"> </w:t>
-      </w:r>
-      <w:r>
-        <w:t xml:space="preserve">2025)</w:t>
+        <w:rPr>
+          <w:vertAlign w:val="superscript"/>
+        </w:rPr>
+        <w:t xml:space="preserve">10</w:t>
       </w:r>
       <w:r>
         <w:t xml:space="preserve"> </w:t>
@@ -1045,7 +1051,10 @@
         <w:t xml:space="preserve">lattice-free diffusion model, and PackFlow</w:t>
       </w:r>
       <w:r>
-        <w:t xml:space="preserve">(Subramanian et al. 2026)</w:t>
+        <w:rPr>
+          <w:vertAlign w:val="superscript"/>
+        </w:rPr>
+        <w:t xml:space="preserve">11</w:t>
       </w:r>
       <w:r>
         <w:t xml:space="preserve"> </w:t>
@@ -1072,7 +1081,10 @@
         <w:t xml:space="preserve">rigid and predict only their pose. MOFFlow</w:t>
       </w:r>
       <w:r>
-        <w:t xml:space="preserve">(Kim et al. 2025)</w:t>
+        <w:rPr>
+          <w:vertAlign w:val="superscript"/>
+        </w:rPr>
+        <w:t xml:space="preserve">12</w:t>
       </w:r>
       <w:r>
         <w:t xml:space="preserve"> </w:t>
@@ -1143,7 +1155,10 @@
         <w:t xml:space="preserve">group</w:t>
       </w:r>
       <w:r>
-        <w:t xml:space="preserve">(Leach et al. 2022)</w:t>
+        <w:rPr>
+          <w:vertAlign w:val="superscript"/>
+        </w:rPr>
+        <w:t xml:space="preserve">13</w:t>
       </w:r>
       <w:r>
         <w:t xml:space="preserve"> </w:t>
@@ -1158,7 +1173,10 @@
         <w:t xml:space="preserve">backbones</w:t>
       </w:r>
       <w:r>
-        <w:t xml:space="preserve">(Yim, Trippe, et al. 2023; Yim, Campbell, et al. 2023)</w:t>
+        <w:rPr>
+          <w:vertAlign w:val="superscript"/>
+        </w:rPr>
+        <w:t xml:space="preserve">6,7</w:t>
       </w:r>
       <w:r>
         <w:t xml:space="preserve">.</w:t>
@@ -1190,7 +1208,10 @@
         <w:t xml:space="preserve">characteristic of flow matching</w:t>
       </w:r>
       <w:r>
-        <w:t xml:space="preserve">(Lipman et al. 2023; Chen and Lipman 2024)</w:t>
+        <w:rPr>
+          <w:vertAlign w:val="superscript"/>
+        </w:rPr>
+        <w:t xml:space="preserve">4,5</w:t>
       </w:r>
       <w:r>
         <w:t xml:space="preserve">.</w:t>
@@ -1347,16 +1368,10 @@
         <w:t xml:space="preserve">variable</w:t>
       </w:r>
       <w:r>
-        <w:t xml:space="preserve">(</w:t>
-      </w:r>
-      <w:r>
-        <w:t xml:space="preserve">Hunnisett et al.</w:t>
-      </w:r>
-      <w:r>
-        <w:t xml:space="preserve"> </w:t>
-      </w:r>
-      <w:r>
-        <w:t xml:space="preserve">2024; Wengert et al. 2021)</w:t>
+        <w:rPr>
+          <w:vertAlign w:val="superscript"/>
+        </w:rPr>
+        <w:t xml:space="preserve">8,9</w:t>
       </w:r>
       <w:r>
         <w:t xml:space="preserve">. The decomposition</w:t>
@@ -1523,7 +1538,10 @@
         <w:t xml:space="preserve">Database (CSD)</w:t>
       </w:r>
       <w:r>
-        <w:t xml:space="preserve">(Groom et al. 2016)</w:t>
+        <w:rPr>
+          <w:vertAlign w:val="superscript"/>
+        </w:rPr>
+        <w:t xml:space="preserve">14</w:t>
       </w:r>
       <w:r>
         <w:t xml:space="preserve">. The lattice and centroid flows learn; the</w:t>
@@ -2177,7 +2195,10 @@
         <w:t xml:space="preserve">pose. A conditional flow-matching objective</w:t>
       </w:r>
       <w:r>
-        <w:t xml:space="preserve">(Lipman et al. 2023)</w:t>
+        <w:rPr>
+          <w:vertAlign w:val="superscript"/>
+        </w:rPr>
+        <w:t xml:space="preserve">4</w:t>
       </w:r>
       <w:r>
         <w:t xml:space="preserve"> </w:t>
@@ -2283,7 +2304,10 @@
         <w:t xml:space="preserve">encoder</w:t>
       </w:r>
       <w:r>
-        <w:t xml:space="preserve">(Satorras et al. 2021)</w:t>
+        <w:rPr>
+          <w:vertAlign w:val="superscript"/>
+        </w:rPr>
+        <w:t xml:space="preserve">15</w:t>
       </w:r>
       <w:r>
         <w:t xml:space="preserve"> </w:t>
@@ -2473,7 +2497,7 @@
       <w:r>
         <w:drawing>
           <wp:inline>
-            <wp:extent cx="5334000" cy="2366466"/>
+            <wp:extent cx="5334000" cy="2389263"/>
             <wp:effectExtent b="0" l="0" r="0" t="0"/>
             <wp:docPr descr="" title="" id="12" name="Picture"/>
             <a:graphic>
@@ -2494,7 +2518,7 @@
                   <pic:spPr bwMode="auto">
                     <a:xfrm>
                       <a:off x="0" y="0"/>
-                      <a:ext cx="5334000" cy="2366466"/>
+                      <a:ext cx="5334000" cy="2389263"/>
                     </a:xfrm>
                     <a:prstGeom prst="rect">
                       <a:avLst/>
@@ -5401,7 +5425,10 @@
         <w:t xml:space="preserve">pymatgen’s StructureMatcher</w:t>
       </w:r>
       <w:r>
-        <w:t xml:space="preserve">(Ong et al. 2013)</w:t>
+        <w:rPr>
+          <w:vertAlign w:val="superscript"/>
+        </w:rPr>
+        <w:t xml:space="preserve">16</w:t>
       </w:r>
       <w:r>
         <w:t xml:space="preserve">. The symmetry-induced relative</w:t>
@@ -5507,7 +5534,10 @@
         <w:t xml:space="preserve">rotations and inversions</w:t>
       </w:r>
       <w:r>
-        <w:t xml:space="preserve">(Groom et al. 2016)</w:t>
+        <w:rPr>
+          <w:vertAlign w:val="superscript"/>
+        </w:rPr>
+        <w:t xml:space="preserve">14</w:t>
       </w:r>
       <w:r>
         <w:t xml:space="preserve">, so a single deterministic</w:t>
@@ -5560,7 +5590,10 @@
         <w:t xml:space="preserve">metrics</w:t>
       </w:r>
       <w:r>
-        <w:t xml:space="preserve">(Martirossyan et al. 2025)</w:t>
+        <w:rPr>
+          <w:vertAlign w:val="superscript"/>
+        </w:rPr>
+        <w:t xml:space="preserve">17</w:t>
       </w:r>
       <w:r>
         <w:t xml:space="preserve">.</w:t>
@@ -6619,7 +6652,10 @@
         <w:t xml:space="preserve">generation</w:t>
       </w:r>
       <w:r>
-        <w:t xml:space="preserve">(Jiao et al. 2024; Kelvinius et al. 2025; Levy et al. 2025)</w:t>
+        <w:rPr>
+          <w:vertAlign w:val="superscript"/>
+        </w:rPr>
+        <w:t xml:space="preserve">18–20</w:t>
       </w:r>
       <w:r>
         <w:t xml:space="preserve">, rather than the</w:t>
@@ -6931,7 +6967,10 @@
         <w:t xml:space="preserve">template-based generators already provide</w:t>
       </w:r>
       <w:r>
-        <w:t xml:space="preserve">(Jiao et al. 2024; Kelvinius et al. 2025; Levy et al. 2025)</w:t>
+        <w:rPr>
+          <w:vertAlign w:val="superscript"/>
+        </w:rPr>
+        <w:t xml:space="preserve">18–20</w:t>
       </w:r>
       <w:r>
         <w:t xml:space="preserve">;</w:t>
@@ -7936,16 +7975,10 @@
         <w:t xml:space="preserve">generators</w:t>
       </w:r>
       <w:r>
-        <w:t xml:space="preserve">(</w:t>
-      </w:r>
-      <w:r>
-        <w:t xml:space="preserve">Jin et al.</w:t>
-      </w:r>
-      <w:r>
-        <w:t xml:space="preserve"> </w:t>
-      </w:r>
-      <w:r>
-        <w:t xml:space="preserve">2025; Subramanian et al. 2026)</w:t>
+        <w:rPr>
+          <w:vertAlign w:val="superscript"/>
+        </w:rPr>
+        <w:t xml:space="preserve">10,11</w:t>
       </w:r>
       <w:r>
         <w:t xml:space="preserve">. Despite its lattice and</w:t>
@@ -8118,16 +8151,10 @@
         <w:t xml:space="preserve">all-atom generators</w:t>
       </w:r>
       <w:r>
-        <w:t xml:space="preserve">(</w:t>
-      </w:r>
-      <w:r>
-        <w:t xml:space="preserve">Jin et al.</w:t>
-      </w:r>
-      <w:r>
-        <w:t xml:space="preserve"> </w:t>
-      </w:r>
-      <w:r>
-        <w:t xml:space="preserve">2025; Subramanian et al. 2026)</w:t>
+        <w:rPr>
+          <w:vertAlign w:val="superscript"/>
+        </w:rPr>
+        <w:t xml:space="preserve">10,11</w:t>
       </w:r>
       <w:r>
         <w:t xml:space="preserve">, which are trained</w:t>
@@ -8253,7 +8280,10 @@
         <w:t xml:space="preserve">diffusion</w:t>
       </w:r>
       <w:r>
-        <w:t xml:space="preserve">(Jiao et al. 2023)</w:t>
+        <w:rPr>
+          <w:vertAlign w:val="superscript"/>
+        </w:rPr>
+        <w:t xml:space="preserve">2</w:t>
       </w:r>
       <w:r>
         <w:t xml:space="preserve"> </w:t>
@@ -8349,16 +8379,10 @@
         <w:t xml:space="preserve">generators</w:t>
       </w:r>
       <w:r>
-        <w:t xml:space="preserve">(</w:t>
-      </w:r>
-      <w:r>
-        <w:t xml:space="preserve">Jin et al.</w:t>
-      </w:r>
-      <w:r>
-        <w:t xml:space="preserve"> </w:t>
-      </w:r>
-      <w:r>
-        <w:t xml:space="preserve">2025; Subramanian et al. 2026)</w:t>
+        <w:rPr>
+          <w:vertAlign w:val="superscript"/>
+        </w:rPr>
+        <w:t xml:space="preserve">10,11</w:t>
       </w:r>
       <w:r>
         <w:t xml:space="preserve"> </w:t>
@@ -8406,7 +8430,10 @@
         <w:t xml:space="preserve">without a gauge obstruction. MOFFlow</w:t>
       </w:r>
       <w:r>
-        <w:t xml:space="preserve">(Kim et al. 2025)</w:t>
+        <w:rPr>
+          <w:vertAlign w:val="superscript"/>
+        </w:rPr>
+        <w:t xml:space="preserve">12</w:t>
       </w:r>
       <w:r>
         <w:t xml:space="preserve"> </w:t>
@@ -8561,7 +8588,10 @@
         <w:t xml:space="preserve">summary</w:t>
       </w:r>
       <w:r>
-        <w:t xml:space="preserve">(Martirossyan et al. 2025)</w:t>
+        <w:rPr>
+          <w:vertAlign w:val="superscript"/>
+        </w:rPr>
+        <w:t xml:space="preserve">17</w:t>
       </w:r>
       <w:r>
         <w:t xml:space="preserve">: the learnable signal is visible only</w:t>
@@ -8634,7 +8664,10 @@
         <w:t xml:space="preserve">sites</w:t>
       </w:r>
       <w:r>
-        <w:t xml:space="preserve">(Jiao et al. 2024; Kelvinius et al. 2025; Levy et al. 2025)</w:t>
+        <w:rPr>
+          <w:vertAlign w:val="superscript"/>
+        </w:rPr>
+        <w:t xml:space="preserve">18–20</w:t>
       </w:r>
       <w:r>
         <w:t xml:space="preserve">, converts the</w:t>
@@ -8702,7 +8735,10 @@
         <w:t xml:space="preserve">are trained on inorganic data</w:t>
       </w:r>
       <w:r>
-        <w:t xml:space="preserve">(Deng et al. 2023)</w:t>
+        <w:rPr>
+          <w:vertAlign w:val="superscript"/>
+        </w:rPr>
+        <w:t xml:space="preserve">21</w:t>
       </w:r>
       <w:r>
         <w:t xml:space="preserve"> </w:t>
@@ -9106,7 +9142,10 @@
         <w:t xml:space="preserve">matching</w:t>
       </w:r>
       <w:r>
-        <w:t xml:space="preserve">(Lipman et al. 2023)</w:t>
+        <w:rPr>
+          <w:vertAlign w:val="superscript"/>
+        </w:rPr>
+        <w:t xml:space="preserve">4</w:t>
       </w:r>
       <w:r>
         <w:t xml:space="preserve"> </w:t>
@@ -9121,7 +9160,10 @@
         <w:t xml:space="preserve">exchangeable prior and data within each crystal</w:t>
       </w:r>
       <w:r>
-        <w:t xml:space="preserve">(Pooladian et al. 2023)</w:t>
+        <w:rPr>
+          <w:vertAlign w:val="superscript"/>
+        </w:rPr>
+        <w:t xml:space="preserve">22</w:t>
       </w:r>
       <w:r>
         <w:t xml:space="preserve">.</w:t>
@@ -9229,7 +9271,10 @@
         <w:t xml:space="preserve">matching</w:t>
       </w:r>
       <w:r>
-        <w:t xml:space="preserve">(Chen and Lipman 2024)</w:t>
+        <w:rPr>
+          <w:vertAlign w:val="superscript"/>
+        </w:rPr>
+        <w:t xml:space="preserve">5</w:t>
       </w:r>
       <w:r>
         <w:t xml:space="preserve"> </w:t>
@@ -9244,7 +9289,10 @@
         <w:t xml:space="preserve">for proteins</w:t>
       </w:r>
       <w:r>
-        <w:t xml:space="preserve">(Yim, Trippe, et al. 2023; Yim, Campbell, et al. 2023)</w:t>
+        <w:rPr>
+          <w:vertAlign w:val="superscript"/>
+        </w:rPr>
+        <w:t xml:space="preserve">6,7</w:t>
       </w:r>
       <w:r>
         <w:t xml:space="preserve"> </w:t>
@@ -9259,7 +9307,10 @@
         <w:t xml:space="preserve">frameworks</w:t>
       </w:r>
       <w:r>
-        <w:t xml:space="preserve">(Kim et al. 2025)</w:t>
+        <w:rPr>
+          <w:vertAlign w:val="superscript"/>
+        </w:rPr>
+        <w:t xml:space="preserve">12</w:t>
       </w:r>
       <w:r>
         <w:t xml:space="preserve">. The orientation target is the constant-velocity</w:t>
@@ -9584,7 +9635,10 @@
         <w:t xml:space="preserve">-equivariant graph network</w:t>
       </w:r>
       <w:r>
-        <w:t xml:space="preserve">(Satorras et al. 2021)</w:t>
+        <w:rPr>
+          <w:vertAlign w:val="superscript"/>
+        </w:rPr>
+        <w:t xml:space="preserve">15</w:t>
       </w:r>
       <w:r>
         <w:t xml:space="preserve"> </w:t>
@@ -10251,7 +10305,10 @@
         <w:t xml:space="preserve">StructureMatcher</w:t>
       </w:r>
       <w:r>
-        <w:t xml:space="preserve">(Ong et al. 2013)</w:t>
+        <w:rPr>
+          <w:vertAlign w:val="superscript"/>
+        </w:rPr>
+        <w:t xml:space="preserve">16</w:t>
       </w:r>
       <w:r>
         <w:t xml:space="preserve"> </w:t>
@@ -10431,7 +10488,10 @@
         <w:t xml:space="preserve">via the CSD Python API)</w:t>
       </w:r>
       <w:r>
-        <w:t xml:space="preserve">(Groom et al. 2016)</w:t>
+        <w:rPr>
+          <w:vertAlign w:val="superscript"/>
+        </w:rPr>
+        <w:t xml:space="preserve">14</w:t>
       </w:r>
       <w:r>
         <w:t xml:space="preserve"> </w:t>
@@ -10819,19 +10879,22 @@
       </w:r>
     </w:p>
     <w:bookmarkStart w:id="76" w:name="refs"/>
-    <w:bookmarkStart w:id="49" w:name="ref-chen2024riemannian"/>
+    <w:bookmarkStart w:id="49" w:name="ref-xie2022cdvae"/>
     <w:p>
       <w:pPr>
         <w:pStyle w:val="Bibliography"/>
       </w:pPr>
       <w:r>
-        <w:t xml:space="preserve">Chen, Ricky T. Q., and Yaron Lipman. 2024.</w:t>
-      </w:r>
-      <w:r>
-        <w:t xml:space="preserve"> </w:t>
-      </w:r>
-      <w:r>
-        <w:t xml:space="preserve">“Flow Matching on General Geometries.”</w:t>
+        <w:t xml:space="preserve">1</w:t>
+      </w:r>
+      <w:r>
+        <w:t xml:space="preserve"> </w:t>
+      </w:r>
+      <w:r>
+        <w:t xml:space="preserve">	</w:t>
+      </w:r>
+      <w:r>
+        <w:t xml:space="preserve">T. Xie, X. Fu, O.-E. Ganea, R. Barzilay and T. Jaakkola, in</w:t>
       </w:r>
       <w:r>
         <w:t xml:space="preserve"> </w:t>
@@ -10841,35 +10904,29 @@
           <w:i/>
           <w:iCs/>
         </w:rPr>
-        <w:t xml:space="preserve">International Conference on Learning Representations (ICLR)</w:t>
-      </w:r>
-      <w:r>
-        <w:t xml:space="preserve">.</w:t>
+        <w:t xml:space="preserve">International conference on learning representations (ICLR)</w:t>
+      </w:r>
+      <w:r>
+        <w:t xml:space="preserve">, 2022.</w:t>
       </w:r>
     </w:p>
     <w:bookmarkEnd w:id="49"/>
-    <w:bookmarkStart w:id="51" w:name="ref-deng2023chgnet"/>
+    <w:bookmarkStart w:id="50" w:name="ref-jiao2023diffcsp"/>
     <w:p>
       <w:pPr>
         <w:pStyle w:val="Bibliography"/>
       </w:pPr>
       <w:r>
-        <w:t xml:space="preserve">Deng, Bowen, Peichen Zhong, KyuJung Jun, et al. 2023.</w:t>
-      </w:r>
-      <w:r>
-        <w:t xml:space="preserve"> </w:t>
-      </w:r>
-      <w:r>
-        <w:t xml:space="preserve">“</w:t>
-      </w:r>
-      <w:r>
-        <w:t xml:space="preserve">CHGNet</w:t>
-      </w:r>
-      <w:r>
-        <w:t xml:space="preserve"> </w:t>
-      </w:r>
-      <w:r>
-        <w:t xml:space="preserve">as a Pretrained Universal Neural Network Potential for Charge-Informed Atomistic Modelling.”</w:t>
+        <w:t xml:space="preserve">2</w:t>
+      </w:r>
+      <w:r>
+        <w:t xml:space="preserve"> </w:t>
+      </w:r>
+      <w:r>
+        <w:t xml:space="preserve">	</w:t>
+      </w:r>
+      <w:r>
+        <w:t xml:space="preserve">R. Jiao, W. Huang, P. Lin, J. Han, P. Chen, Y. Lu and Y. Liu, in</w:t>
       </w:r>
       <w:r>
         <w:t xml:space="preserve"> </w:t>
@@ -10879,43 +10936,192 @@
           <w:i/>
           <w:iCs/>
         </w:rPr>
-        <w:t xml:space="preserve">Nature Machine Intelligence</w:t>
-      </w:r>
-      <w:r>
-        <w:t xml:space="preserve"> </w:t>
-      </w:r>
-      <w:r>
-        <w:t xml:space="preserve">5: 1031–41.</w:t>
-      </w:r>
-      <w:r>
-        <w:t xml:space="preserve"> </w:t>
-      </w:r>
-      <w:hyperlink r:id="rId50">
-        <w:r>
-          <w:rPr>
-            <w:rStyle w:val="Hyperlink"/>
-          </w:rPr>
-          <w:t xml:space="preserve">https://doi.org/10.1038/s42256-023-00716-3</w:t>
-        </w:r>
-      </w:hyperlink>
-      <w:r>
-        <w:t xml:space="preserve">.</w:t>
+        <w:t xml:space="preserve">Advances in neural information processing systems (NeurIPS)</w:t>
+      </w:r>
+      <w:r>
+        <w:t xml:space="preserve">, 2023.</w:t>
+      </w:r>
+    </w:p>
+    <w:bookmarkEnd w:id="50"/>
+    <w:bookmarkStart w:id="51" w:name="ref-miller2024flowmm"/>
+    <w:p>
+      <w:pPr>
+        <w:pStyle w:val="Bibliography"/>
+      </w:pPr>
+      <w:r>
+        <w:t xml:space="preserve">3</w:t>
+      </w:r>
+      <w:r>
+        <w:t xml:space="preserve"> </w:t>
+      </w:r>
+      <w:r>
+        <w:t xml:space="preserve">	</w:t>
+      </w:r>
+      <w:r>
+        <w:t xml:space="preserve">B. K. Miller, R. T. Q. Chen, A. Sriram and B. M. Wood, in</w:t>
+      </w:r>
+      <w:r>
+        <w:t xml:space="preserve"> </w:t>
+      </w:r>
+      <w:r>
+        <w:rPr>
+          <w:i/>
+          <w:iCs/>
+        </w:rPr>
+        <w:t xml:space="preserve">International conference on machine learning (ICML)</w:t>
+      </w:r>
+      <w:r>
+        <w:t xml:space="preserve">, 2024.</w:t>
       </w:r>
     </w:p>
     <w:bookmarkEnd w:id="51"/>
-    <w:bookmarkStart w:id="53" w:name="ref-groom2016csd"/>
+    <w:bookmarkStart w:id="52" w:name="ref-lipman2023flowmatching"/>
     <w:p>
       <w:pPr>
         <w:pStyle w:val="Bibliography"/>
       </w:pPr>
       <w:r>
-        <w:t xml:space="preserve">Groom, Colin R., Ian J. Bruno, Matthew P. Lightfoot, and Suzanna C. Ward. 2016.</w:t>
-      </w:r>
-      <w:r>
-        <w:t xml:space="preserve"> </w:t>
-      </w:r>
-      <w:r>
-        <w:t xml:space="preserve">“The Cambridge Structural Database.”</w:t>
+        <w:t xml:space="preserve">4</w:t>
+      </w:r>
+      <w:r>
+        <w:t xml:space="preserve"> </w:t>
+      </w:r>
+      <w:r>
+        <w:t xml:space="preserve">	</w:t>
+      </w:r>
+      <w:r>
+        <w:t xml:space="preserve">Y. Lipman, R. T. Q. Chen, H. Ben-Hamu, M. Nickel and M. Le, in</w:t>
+      </w:r>
+      <w:r>
+        <w:t xml:space="preserve"> </w:t>
+      </w:r>
+      <w:r>
+        <w:rPr>
+          <w:i/>
+          <w:iCs/>
+        </w:rPr>
+        <w:t xml:space="preserve">International conference on learning representations (ICLR)</w:t>
+      </w:r>
+      <w:r>
+        <w:t xml:space="preserve">, 2023.</w:t>
+      </w:r>
+    </w:p>
+    <w:bookmarkEnd w:id="52"/>
+    <w:bookmarkStart w:id="53" w:name="ref-chen2024riemannian"/>
+    <w:p>
+      <w:pPr>
+        <w:pStyle w:val="Bibliography"/>
+      </w:pPr>
+      <w:r>
+        <w:t xml:space="preserve">5</w:t>
+      </w:r>
+      <w:r>
+        <w:t xml:space="preserve"> </w:t>
+      </w:r>
+      <w:r>
+        <w:t xml:space="preserve">	</w:t>
+      </w:r>
+      <w:r>
+        <w:t xml:space="preserve">R. T. Q. Chen and Y. Lipman, in</w:t>
+      </w:r>
+      <w:r>
+        <w:t xml:space="preserve"> </w:t>
+      </w:r>
+      <w:r>
+        <w:rPr>
+          <w:i/>
+          <w:iCs/>
+        </w:rPr>
+        <w:t xml:space="preserve">International conference on learning representations (ICLR)</w:t>
+      </w:r>
+      <w:r>
+        <w:t xml:space="preserve">, 2024.</w:t>
+      </w:r>
+    </w:p>
+    <w:bookmarkEnd w:id="53"/>
+    <w:bookmarkStart w:id="54" w:name="ref-yim2023se3diffusion"/>
+    <w:p>
+      <w:pPr>
+        <w:pStyle w:val="Bibliography"/>
+      </w:pPr>
+      <w:r>
+        <w:t xml:space="preserve">6</w:t>
+      </w:r>
+      <w:r>
+        <w:t xml:space="preserve"> </w:t>
+      </w:r>
+      <w:r>
+        <w:t xml:space="preserve">	</w:t>
+      </w:r>
+      <w:r>
+        <w:t xml:space="preserve">J. Yim, B. L. Trippe, V. De Bortoli, E. Mathieu, A. Doucet, R. Barzilay and T. Jaakkola, in</w:t>
+      </w:r>
+      <w:r>
+        <w:t xml:space="preserve"> </w:t>
+      </w:r>
+      <w:r>
+        <w:rPr>
+          <w:i/>
+          <w:iCs/>
+        </w:rPr>
+        <w:t xml:space="preserve">International conference on machine learning (ICML)</w:t>
+      </w:r>
+      <w:r>
+        <w:t xml:space="preserve">, 2023.</w:t>
+      </w:r>
+    </w:p>
+    <w:bookmarkEnd w:id="54"/>
+    <w:bookmarkStart w:id="55" w:name="ref-yim2023frameflow"/>
+    <w:p>
+      <w:pPr>
+        <w:pStyle w:val="Bibliography"/>
+      </w:pPr>
+      <w:r>
+        <w:t xml:space="preserve">7</w:t>
+      </w:r>
+      <w:r>
+        <w:t xml:space="preserve"> </w:t>
+      </w:r>
+      <w:r>
+        <w:t xml:space="preserve">	</w:t>
+      </w:r>
+      <w:r>
+        <w:t xml:space="preserve">J. Yim, A. Campbell, A. Y. K. Foong, M. Gastegger, J. Jiménez-Luna, S. Lewis, V. G. Satorras, B. S. Veeling, R. Barzilay, T. Jaakkola and F. Noé,</w:t>
+      </w:r>
+      <w:r>
+        <w:t xml:space="preserve"> </w:t>
+      </w:r>
+      <w:r>
+        <w:rPr>
+          <w:i/>
+          <w:iCs/>
+        </w:rPr>
+        <w:t xml:space="preserve">arXiv preprint arXiv:2310.05297</w:t>
+      </w:r>
+      <w:r>
+        <w:t xml:space="preserve">.</w:t>
+      </w:r>
+    </w:p>
+    <w:bookmarkEnd w:id="55"/>
+    <w:bookmarkStart w:id="57" w:name="ref-price2023blindtest7"/>
+    <w:p>
+      <w:pPr>
+        <w:pStyle w:val="Bibliography"/>
+      </w:pPr>
+      <w:r>
+        <w:t xml:space="preserve">8</w:t>
+      </w:r>
+      <w:r>
+        <w:t xml:space="preserve"> </w:t>
+      </w:r>
+      <w:r>
+        <w:t xml:space="preserve">	</w:t>
+      </w:r>
+      <w:r>
+        <w:t xml:space="preserve">L. M. Hunnisett and others</w:t>
+      </w:r>
+      <w:r>
+        <w:t xml:space="preserve">,</w:t>
       </w:r>
       <w:r>
         <w:t xml:space="preserve"> </w:t>
@@ -10928,43 +11134,107 @@
         <w:t xml:space="preserve">Acta Crystallographica Section B</w:t>
       </w:r>
       <w:r>
-        <w:t xml:space="preserve"> </w:t>
-      </w:r>
-      <w:r>
-        <w:t xml:space="preserve">72 (2): 171–79.</w:t>
-      </w:r>
-      <w:r>
-        <w:t xml:space="preserve"> </w:t>
-      </w:r>
-      <w:hyperlink r:id="rId52">
+        <w:t xml:space="preserve">, DOI:</w:t>
+      </w:r>
+      <w:hyperlink r:id="rId56">
         <w:r>
           <w:rPr>
             <w:rStyle w:val="Hyperlink"/>
           </w:rPr>
-          <w:t xml:space="preserve">https://doi.org/10.1107/S2052520616003954</w:t>
+          <w:t xml:space="preserve">10.1107/S2052520624007492</w:t>
         </w:r>
       </w:hyperlink>
       <w:r>
         <w:t xml:space="preserve">.</w:t>
       </w:r>
     </w:p>
-    <w:bookmarkEnd w:id="53"/>
-    <w:bookmarkStart w:id="55" w:name="ref-price2023blindtest7"/>
+    <w:bookmarkEnd w:id="57"/>
+    <w:bookmarkStart w:id="59" w:name="ref-obrien2021dataefficient"/>
     <w:p>
       <w:pPr>
         <w:pStyle w:val="Bibliography"/>
       </w:pPr>
       <w:r>
-        <w:t xml:space="preserve">Hunnisett, Lily M. et al.</w:t>
-      </w:r>
-      <w:r>
-        <w:t xml:space="preserve"> 2024.</w:t>
-      </w:r>
-      <w:r>
-        <w:t xml:space="preserve"> </w:t>
-      </w:r>
-      <w:r>
-        <w:t xml:space="preserve">“The Seventh Blind Test of Crystal Structure Prediction: Structure Generation Methods.”</w:t>
+        <w:t xml:space="preserve">9</w:t>
+      </w:r>
+      <w:r>
+        <w:t xml:space="preserve"> </w:t>
+      </w:r>
+      <w:r>
+        <w:t xml:space="preserve">	</w:t>
+      </w:r>
+      <w:hyperlink r:id="rId58">
+        <w:r>
+          <w:rPr>
+            <w:rStyle w:val="Hyperlink"/>
+          </w:rPr>
+          <w:t xml:space="preserve">S. Wengert, G. Csányi, K. Reuter and J. T. Margraf,</w:t>
+        </w:r>
+        <w:r>
+          <w:rPr>
+            <w:rStyle w:val="Hyperlink"/>
+          </w:rPr>
+          <w:t xml:space="preserve"> </w:t>
+        </w:r>
+        <w:r>
+          <w:rPr>
+            <w:rStyle w:val="Hyperlink"/>
+            <w:i/>
+            <w:iCs/>
+          </w:rPr>
+          <w:t xml:space="preserve">Chemical Science</w:t>
+        </w:r>
+        <w:r>
+          <w:rPr>
+            <w:rStyle w:val="Hyperlink"/>
+          </w:rPr>
+          <w:t xml:space="preserve">, 2021,</w:t>
+        </w:r>
+        <w:r>
+          <w:rPr>
+            <w:rStyle w:val="Hyperlink"/>
+          </w:rPr>
+          <w:t xml:space="preserve"> </w:t>
+        </w:r>
+        <w:r>
+          <w:rPr>
+            <w:rStyle w:val="Hyperlink"/>
+            <w:b/>
+            <w:bCs/>
+          </w:rPr>
+          <w:t xml:space="preserve">12</w:t>
+        </w:r>
+        <w:r>
+          <w:rPr>
+            <w:rStyle w:val="Hyperlink"/>
+          </w:rPr>
+          <w:t xml:space="preserve">, 4536–4546</w:t>
+        </w:r>
+      </w:hyperlink>
+      <w:r>
+        <w:t xml:space="preserve">.</w:t>
+      </w:r>
+    </w:p>
+    <w:bookmarkEnd w:id="59"/>
+    <w:bookmarkStart w:id="60" w:name="ref-jin2025oxtal"/>
+    <w:p>
+      <w:pPr>
+        <w:pStyle w:val="Bibliography"/>
+      </w:pPr>
+      <w:r>
+        <w:t xml:space="preserve">10</w:t>
+      </w:r>
+      <w:r>
+        <w:t xml:space="preserve"> </w:t>
+      </w:r>
+      <w:r>
+        <w:t xml:space="preserve">	</w:t>
+      </w:r>
+      <w:r>
+        <w:t xml:space="preserve">E. Jin, A. C. Nica, M. Galkin and others</w:t>
+      </w:r>
+      <w:r>
+        <w:t xml:space="preserve">,</w:t>
       </w:r>
       <w:r>
         <w:t xml:space="preserve"> </w:t>
@@ -10974,43 +11244,192 @@
           <w:i/>
           <w:iCs/>
         </w:rPr>
-        <w:t xml:space="preserve">Acta Crystallographica Section B</w:t>
-      </w:r>
-      <w:r>
-        <w:t xml:space="preserve"> </w:t>
-      </w:r>
-      <w:r>
-        <w:t xml:space="preserve">80 (6).</w:t>
-      </w:r>
-      <w:r>
-        <w:t xml:space="preserve"> </w:t>
-      </w:r>
-      <w:hyperlink r:id="rId54">
+        <w:t xml:space="preserve">arXiv preprint arXiv:2512.06987</w:t>
+      </w:r>
+      <w:r>
+        <w:t xml:space="preserve">.</w:t>
+      </w:r>
+    </w:p>
+    <w:bookmarkEnd w:id="60"/>
+    <w:bookmarkStart w:id="61" w:name="ref-subramanian2026packflow"/>
+    <w:p>
+      <w:pPr>
+        <w:pStyle w:val="Bibliography"/>
+      </w:pPr>
+      <w:r>
+        <w:t xml:space="preserve">11</w:t>
+      </w:r>
+      <w:r>
+        <w:t xml:space="preserve"> </w:t>
+      </w:r>
+      <w:r>
+        <w:t xml:space="preserve">	</w:t>
+      </w:r>
+      <w:r>
+        <w:t xml:space="preserve">A. Subramanian, E. Pan, J. Nam, M. Weiler, S. Qu, C. W. Park, T. S. Jaakkola, E. Olivetti and R. Gomez-Bombarelli,</w:t>
+      </w:r>
+      <w:r>
+        <w:t xml:space="preserve"> </w:t>
+      </w:r>
+      <w:r>
+        <w:rPr>
+          <w:i/>
+          <w:iCs/>
+        </w:rPr>
+        <w:t xml:space="preserve">arXiv preprint arXiv:2602.20140</w:t>
+      </w:r>
+      <w:r>
+        <w:t xml:space="preserve">.</w:t>
+      </w:r>
+    </w:p>
+    <w:bookmarkEnd w:id="61"/>
+    <w:bookmarkStart w:id="62" w:name="ref-kim2025mofflow"/>
+    <w:p>
+      <w:pPr>
+        <w:pStyle w:val="Bibliography"/>
+      </w:pPr>
+      <w:r>
+        <w:t xml:space="preserve">12</w:t>
+      </w:r>
+      <w:r>
+        <w:t xml:space="preserve"> </w:t>
+      </w:r>
+      <w:r>
+        <w:t xml:space="preserve">	</w:t>
+      </w:r>
+      <w:r>
+        <w:t xml:space="preserve">N. Kim, S. Kim, M. Kim, J. Park and S. Ahn, in</w:t>
+      </w:r>
+      <w:r>
+        <w:t xml:space="preserve"> </w:t>
+      </w:r>
+      <w:r>
+        <w:rPr>
+          <w:i/>
+          <w:iCs/>
+        </w:rPr>
+        <w:t xml:space="preserve">International conference on learning representations (ICLR)</w:t>
+      </w:r>
+      <w:r>
+        <w:t xml:space="preserve">, 2025.</w:t>
+      </w:r>
+    </w:p>
+    <w:bookmarkEnd w:id="62"/>
+    <w:bookmarkStart w:id="63" w:name="ref-leach2022so3"/>
+    <w:p>
+      <w:pPr>
+        <w:pStyle w:val="Bibliography"/>
+      </w:pPr>
+      <w:r>
+        <w:t xml:space="preserve">13</w:t>
+      </w:r>
+      <w:r>
+        <w:t xml:space="preserve"> </w:t>
+      </w:r>
+      <w:r>
+        <w:t xml:space="preserve">	</w:t>
+      </w:r>
+      <w:r>
+        <w:t xml:space="preserve">A. Leach, S. M. Schmon, M. T. Degiacomi and C. G. Willcocks, in</w:t>
+      </w:r>
+      <w:r>
+        <w:t xml:space="preserve"> </w:t>
+      </w:r>
+      <w:r>
+        <w:rPr>
+          <w:i/>
+          <w:iCs/>
+        </w:rPr>
+        <w:t xml:space="preserve">ICLR 2022 workshop on geometrical and topological representation learning</w:t>
+      </w:r>
+      <w:r>
+        <w:t xml:space="preserve">, 2022.</w:t>
+      </w:r>
+    </w:p>
+    <w:bookmarkEnd w:id="63"/>
+    <w:bookmarkStart w:id="65" w:name="ref-groom2016csd"/>
+    <w:p>
+      <w:pPr>
+        <w:pStyle w:val="Bibliography"/>
+      </w:pPr>
+      <w:r>
+        <w:t xml:space="preserve">14</w:t>
+      </w:r>
+      <w:r>
+        <w:t xml:space="preserve"> </w:t>
+      </w:r>
+      <w:r>
+        <w:t xml:space="preserve">	</w:t>
+      </w:r>
+      <w:hyperlink r:id="rId64">
         <w:r>
           <w:rPr>
             <w:rStyle w:val="Hyperlink"/>
           </w:rPr>
-          <w:t xml:space="preserve">https://doi.org/10.1107/S2052520624007492</w:t>
+          <w:t xml:space="preserve">C. R. Groom, I. J. Bruno, M. P. Lightfoot and S. C. Ward,</w:t>
+        </w:r>
+        <w:r>
+          <w:rPr>
+            <w:rStyle w:val="Hyperlink"/>
+          </w:rPr>
+          <w:t xml:space="preserve"> </w:t>
+        </w:r>
+        <w:r>
+          <w:rPr>
+            <w:rStyle w:val="Hyperlink"/>
+            <w:i/>
+            <w:iCs/>
+          </w:rPr>
+          <w:t xml:space="preserve">Acta Crystallographica Section B</w:t>
+        </w:r>
+        <w:r>
+          <w:rPr>
+            <w:rStyle w:val="Hyperlink"/>
+          </w:rPr>
+          <w:t xml:space="preserve">, 2016,</w:t>
+        </w:r>
+        <w:r>
+          <w:rPr>
+            <w:rStyle w:val="Hyperlink"/>
+          </w:rPr>
+          <w:t xml:space="preserve"> </w:t>
+        </w:r>
+        <w:r>
+          <w:rPr>
+            <w:rStyle w:val="Hyperlink"/>
+            <w:b/>
+            <w:bCs/>
+          </w:rPr>
+          <w:t xml:space="preserve">72</w:t>
+        </w:r>
+        <w:r>
+          <w:rPr>
+            <w:rStyle w:val="Hyperlink"/>
+          </w:rPr>
+          <w:t xml:space="preserve">, 171–179</w:t>
         </w:r>
       </w:hyperlink>
       <w:r>
         <w:t xml:space="preserve">.</w:t>
       </w:r>
     </w:p>
-    <w:bookmarkEnd w:id="55"/>
-    <w:bookmarkStart w:id="56" w:name="ref-jiao2023diffcsp"/>
+    <w:bookmarkEnd w:id="65"/>
+    <w:bookmarkStart w:id="66" w:name="ref-satorras2021egnn"/>
     <w:p>
       <w:pPr>
         <w:pStyle w:val="Bibliography"/>
       </w:pPr>
       <w:r>
-        <w:t xml:space="preserve">Jiao, Rui, Wenbing Huang, Peijia Lin, et al. 2023.</w:t>
-      </w:r>
-      <w:r>
-        <w:t xml:space="preserve"> </w:t>
-      </w:r>
-      <w:r>
-        <w:t xml:space="preserve">“Crystal Structure Prediction by Joint Equivariant Diffusion.”</w:t>
+        <w:t xml:space="preserve">15</w:t>
+      </w:r>
+      <w:r>
+        <w:t xml:space="preserve"> </w:t>
+      </w:r>
+      <w:r>
+        <w:t xml:space="preserve">	</w:t>
+      </w:r>
+      <w:r>
+        <w:t xml:space="preserve">V. G. Satorras, E. Hoogeboom and M. Welling, in</w:t>
       </w:r>
       <w:r>
         <w:t xml:space="preserve"> </w:t>
@@ -11020,26 +11439,96 @@
           <w:i/>
           <w:iCs/>
         </w:rPr>
-        <w:t xml:space="preserve">Advances in Neural Information Processing Systems (NeurIPS)</w:t>
-      </w:r>
+        <w:t xml:space="preserve">International conference on machine learning (ICML)</w:t>
+      </w:r>
+      <w:r>
+        <w:t xml:space="preserve">, 2021.</w:t>
+      </w:r>
+    </w:p>
+    <w:bookmarkEnd w:id="66"/>
+    <w:bookmarkStart w:id="68" w:name="ref-ong2013pymatgen"/>
+    <w:p>
+      <w:pPr>
+        <w:pStyle w:val="Bibliography"/>
+      </w:pPr>
+      <w:r>
+        <w:t xml:space="preserve">16</w:t>
+      </w:r>
+      <w:r>
+        <w:t xml:space="preserve"> </w:t>
+      </w:r>
+      <w:r>
+        <w:t xml:space="preserve">	</w:t>
+      </w:r>
+      <w:hyperlink r:id="rId67">
+        <w:r>
+          <w:rPr>
+            <w:rStyle w:val="Hyperlink"/>
+          </w:rPr>
+          <w:t xml:space="preserve">S. P. Ong, W. D. Richards, A. Jain, G. Hautier, M. Kocher, S. Cholia, D. Gunter, V. L. Chevrier, K. A. Persson and G. Ceder,</w:t>
+        </w:r>
+        <w:r>
+          <w:rPr>
+            <w:rStyle w:val="Hyperlink"/>
+          </w:rPr>
+          <w:t xml:space="preserve"> </w:t>
+        </w:r>
+        <w:r>
+          <w:rPr>
+            <w:rStyle w:val="Hyperlink"/>
+            <w:i/>
+            <w:iCs/>
+          </w:rPr>
+          <w:t xml:space="preserve">Computational Materials Science</w:t>
+        </w:r>
+        <w:r>
+          <w:rPr>
+            <w:rStyle w:val="Hyperlink"/>
+          </w:rPr>
+          <w:t xml:space="preserve">, 2013,</w:t>
+        </w:r>
+        <w:r>
+          <w:rPr>
+            <w:rStyle w:val="Hyperlink"/>
+          </w:rPr>
+          <w:t xml:space="preserve"> </w:t>
+        </w:r>
+        <w:r>
+          <w:rPr>
+            <w:rStyle w:val="Hyperlink"/>
+            <w:b/>
+            <w:bCs/>
+          </w:rPr>
+          <w:t xml:space="preserve">68</w:t>
+        </w:r>
+        <w:r>
+          <w:rPr>
+            <w:rStyle w:val="Hyperlink"/>
+          </w:rPr>
+          <w:t xml:space="preserve">, 314–319</w:t>
+        </w:r>
+      </w:hyperlink>
       <w:r>
         <w:t xml:space="preserve">.</w:t>
       </w:r>
     </w:p>
-    <w:bookmarkEnd w:id="56"/>
-    <w:bookmarkStart w:id="57" w:name="ref-jiao2024diffcsppp"/>
+    <w:bookmarkEnd w:id="68"/>
+    <w:bookmarkStart w:id="69" w:name="ref-martirossyan2025matching"/>
     <w:p>
       <w:pPr>
         <w:pStyle w:val="Bibliography"/>
       </w:pPr>
       <w:r>
-        <w:t xml:space="preserve">Jiao, Rui, Wenbing Huang, Yu Liu, Deli Zhao, and Yang Liu. 2024.</w:t>
-      </w:r>
-      <w:r>
-        <w:t xml:space="preserve"> </w:t>
-      </w:r>
-      <w:r>
-        <w:t xml:space="preserve">“Space Group Constrained Crystal Generation.”</w:t>
+        <w:t xml:space="preserve">17</w:t>
+      </w:r>
+      <w:r>
+        <w:t xml:space="preserve"> </w:t>
+      </w:r>
+      <w:r>
+        <w:t xml:space="preserve">	</w:t>
+      </w:r>
+      <w:r>
+        <w:t xml:space="preserve">M. M. Martirossyan, T. Egg, P. Hoellmer, G. Karypis, M. Transtrum, A. Roitberg, M. Liu, R. G. Hennig, E. B. Tadmor and S. Martiniani,</w:t>
       </w:r>
       <w:r>
         <w:t xml:space="preserve"> </w:t>
@@ -11049,35 +11538,29 @@
           <w:i/>
           <w:iCs/>
         </w:rPr>
-        <w:t xml:space="preserve">International Conference on Learning Representations (ICLR)</w:t>
+        <w:t xml:space="preserve">arXiv preprint arXiv:2509.12178</w:t>
       </w:r>
       <w:r>
         <w:t xml:space="preserve">.</w:t>
       </w:r>
     </w:p>
-    <w:bookmarkEnd w:id="57"/>
-    <w:bookmarkStart w:id="58" w:name="ref-jin2025oxtal"/>
+    <w:bookmarkEnd w:id="69"/>
+    <w:bookmarkStart w:id="70" w:name="ref-jiao2024diffcsppp"/>
     <w:p>
       <w:pPr>
         <w:pStyle w:val="Bibliography"/>
       </w:pPr>
       <w:r>
-        <w:t xml:space="preserve">Jin, Emily, Andrei Cristian Nica, Mikhail Galkin, et al.</w:t>
-      </w:r>
-      <w:r>
-        <w:t xml:space="preserve"> 2025.</w:t>
-      </w:r>
-      <w:r>
-        <w:t xml:space="preserve"> </w:t>
-      </w:r>
-      <w:r>
-        <w:t xml:space="preserve">“</w:t>
-      </w:r>
-      <w:r>
-        <w:t xml:space="preserve">OXtal</w:t>
-      </w:r>
-      <w:r>
-        <w:t xml:space="preserve">: An All-Atom Diffusion Model for Organic Crystal Structure Prediction.”</w:t>
+        <w:t xml:space="preserve">18</w:t>
+      </w:r>
+      <w:r>
+        <w:t xml:space="preserve"> </w:t>
+      </w:r>
+      <w:r>
+        <w:t xml:space="preserve">	</w:t>
+      </w:r>
+      <w:r>
+        <w:t xml:space="preserve">R. Jiao, W. Huang, Y. Liu, D. Zhao and Y. Liu, in</w:t>
       </w:r>
       <w:r>
         <w:t xml:space="preserve"> </w:t>
@@ -11087,32 +11570,29 @@
           <w:i/>
           <w:iCs/>
         </w:rPr>
-        <w:t xml:space="preserve">arXiv Preprint arXiv:2512.06987</w:t>
-      </w:r>
-      <w:r>
-        <w:t xml:space="preserve">.</w:t>
+        <w:t xml:space="preserve">International conference on learning representations (ICLR)</w:t>
+      </w:r>
+      <w:r>
+        <w:t xml:space="preserve">, 2024.</w:t>
       </w:r>
     </w:p>
-    <w:bookmarkEnd w:id="58"/>
-    <w:bookmarkStart w:id="59" w:name="ref-wyckoffdiff2025"/>
+    <w:bookmarkEnd w:id="70"/>
+    <w:bookmarkStart w:id="71" w:name="ref-wyckoffdiff2025"/>
     <w:p>
       <w:pPr>
         <w:pStyle w:val="Bibliography"/>
       </w:pPr>
       <w:r>
-        <w:t xml:space="preserve">Kelvinius, Filip Ekström, Oskar B. Andersson, Abhijith S. Parackal, Dong Qian, Rickard Armiento, and Fredrik Lindsten. 2025.</w:t>
-      </w:r>
-      <w:r>
-        <w:t xml:space="preserve"> </w:t>
-      </w:r>
-      <w:r>
-        <w:t xml:space="preserve">“</w:t>
-      </w:r>
-      <w:r>
-        <w:t xml:space="preserve">WyckoffDiff</w:t>
-      </w:r>
-      <w:r>
-        <w:t xml:space="preserve">: A Generative Diffusion Model for Crystal Symmetry.”</w:t>
+        <w:t xml:space="preserve">19</w:t>
+      </w:r>
+      <w:r>
+        <w:t xml:space="preserve"> </w:t>
+      </w:r>
+      <w:r>
+        <w:t xml:space="preserve">	</w:t>
+      </w:r>
+      <w:r>
+        <w:t xml:space="preserve">F. E. Kelvinius, O. B. Andersson, A. S. Parackal, D. Qian, R. Armiento and F. Lindsten,</w:t>
       </w:r>
       <w:r>
         <w:t xml:space="preserve"> </w:t>
@@ -11122,32 +11602,29 @@
           <w:i/>
           <w:iCs/>
         </w:rPr>
-        <w:t xml:space="preserve">arXiv Preprint arXiv:2502.06485</w:t>
+        <w:t xml:space="preserve">arXiv preprint arXiv:2502.06485</w:t>
       </w:r>
       <w:r>
         <w:t xml:space="preserve">.</w:t>
       </w:r>
     </w:p>
-    <w:bookmarkEnd w:id="59"/>
-    <w:bookmarkStart w:id="60" w:name="ref-kim2025mofflow"/>
+    <w:bookmarkEnd w:id="71"/>
+    <w:bookmarkStart w:id="72" w:name="ref-symmcd2025"/>
     <w:p>
       <w:pPr>
         <w:pStyle w:val="Bibliography"/>
       </w:pPr>
       <w:r>
-        <w:t xml:space="preserve">Kim, Nayoung, Seongsu Kim, Minsu Kim, Jinkyoo Park, and Sungsoo Ahn. 2025.</w:t>
-      </w:r>
-      <w:r>
-        <w:t xml:space="preserve"> </w:t>
-      </w:r>
-      <w:r>
-        <w:t xml:space="preserve">“</w:t>
-      </w:r>
-      <w:r>
-        <w:t xml:space="preserve">MOFFlow</w:t>
-      </w:r>
-      <w:r>
-        <w:t xml:space="preserve">: Flow Matching for Structure Prediction of Metal-Organic Frameworks.”</w:t>
+        <w:t xml:space="preserve">20</w:t>
+      </w:r>
+      <w:r>
+        <w:t xml:space="preserve"> </w:t>
+      </w:r>
+      <w:r>
+        <w:t xml:space="preserve">	</w:t>
+      </w:r>
+      <w:r>
+        <w:t xml:space="preserve">D. Levy, S. S. Panigrahi, S.-O. Kaba, Q. Zhu, K. L. K. Lee, M. Galkin, S. Miret and S. Ravanbakhsh,</w:t>
       </w:r>
       <w:r>
         <w:t xml:space="preserve"> </w:t>
@@ -11157,38 +11634,96 @@
           <w:i/>
           <w:iCs/>
         </w:rPr>
-        <w:t xml:space="preserve">International Conference on Learning Representations (ICLR)</w:t>
+        <w:t xml:space="preserve">arXiv preprint arXiv:2502.03638</w:t>
       </w:r>
       <w:r>
         <w:t xml:space="preserve">.</w:t>
       </w:r>
     </w:p>
-    <w:bookmarkEnd w:id="60"/>
-    <w:bookmarkStart w:id="61" w:name="ref-leach2022so3"/>
+    <w:bookmarkEnd w:id="72"/>
+    <w:bookmarkStart w:id="74" w:name="ref-deng2023chgnet"/>
     <w:p>
       <w:pPr>
         <w:pStyle w:val="Bibliography"/>
       </w:pPr>
       <w:r>
-        <w:t xml:space="preserve">Leach, Adam, Sebastian M. Schmon, Matteo T. Degiacomi, and Chris G. Willcocks. 2022.</w:t>
-      </w:r>
-      <w:r>
-        <w:t xml:space="preserve"> </w:t>
-      </w:r>
-      <w:r>
-        <w:t xml:space="preserve">“Denoising Diffusion Probabilistic Models on</w:t>
-      </w:r>
-      <w:r>
-        <w:t xml:space="preserve"> </w:t>
-      </w:r>
-      <w:r>
-        <w:t xml:space="preserve">SO(3)</w:t>
-      </w:r>
-      <w:r>
-        <w:t xml:space="preserve"> </w:t>
-      </w:r>
-      <w:r>
-        <w:t xml:space="preserve">for Rotational Alignment.”</w:t>
+        <w:t xml:space="preserve">21</w:t>
+      </w:r>
+      <w:r>
+        <w:t xml:space="preserve"> </w:t>
+      </w:r>
+      <w:r>
+        <w:t xml:space="preserve">	</w:t>
+      </w:r>
+      <w:hyperlink r:id="rId73">
+        <w:r>
+          <w:rPr>
+            <w:rStyle w:val="Hyperlink"/>
+          </w:rPr>
+          <w:t xml:space="preserve">B. Deng, P. Zhong, K. Jun, J. Riebesell, K. Han, C. J. Bartel and G. Ceder,</w:t>
+        </w:r>
+        <w:r>
+          <w:rPr>
+            <w:rStyle w:val="Hyperlink"/>
+          </w:rPr>
+          <w:t xml:space="preserve"> </w:t>
+        </w:r>
+        <w:r>
+          <w:rPr>
+            <w:rStyle w:val="Hyperlink"/>
+            <w:i/>
+            <w:iCs/>
+          </w:rPr>
+          <w:t xml:space="preserve">Nature Machine Intelligence</w:t>
+        </w:r>
+        <w:r>
+          <w:rPr>
+            <w:rStyle w:val="Hyperlink"/>
+          </w:rPr>
+          <w:t xml:space="preserve">, 2023,</w:t>
+        </w:r>
+        <w:r>
+          <w:rPr>
+            <w:rStyle w:val="Hyperlink"/>
+          </w:rPr>
+          <w:t xml:space="preserve"> </w:t>
+        </w:r>
+        <w:r>
+          <w:rPr>
+            <w:rStyle w:val="Hyperlink"/>
+            <w:b/>
+            <w:bCs/>
+          </w:rPr>
+          <w:t xml:space="preserve">5</w:t>
+        </w:r>
+        <w:r>
+          <w:rPr>
+            <w:rStyle w:val="Hyperlink"/>
+          </w:rPr>
+          <w:t xml:space="preserve">, 1031–1041</w:t>
+        </w:r>
+      </w:hyperlink>
+      <w:r>
+        <w:t xml:space="preserve">.</w:t>
+      </w:r>
+    </w:p>
+    <w:bookmarkEnd w:id="74"/>
+    <w:bookmarkStart w:id="75" w:name="ref-pooladian2023multisample"/>
+    <w:p>
+      <w:pPr>
+        <w:pStyle w:val="Bibliography"/>
+      </w:pPr>
+      <w:r>
+        <w:t xml:space="preserve">22</w:t>
+      </w:r>
+      <w:r>
+        <w:t xml:space="preserve"> </w:t>
+      </w:r>
+      <w:r>
+        <w:t xml:space="preserve">	</w:t>
+      </w:r>
+      <w:r>
+        <w:t xml:space="preserve">A.-A. Pooladian, H. Ben-Hamu, C. Domingo-Enrich, B. Amos, Y. Lipman and R. T. Q. Chen, in</w:t>
       </w:r>
       <w:r>
         <w:t xml:space="preserve"> </w:t>
@@ -11198,437 +11733,10 @@
           <w:i/>
           <w:iCs/>
         </w:rPr>
-        <w:t xml:space="preserve">ICLR 2022 Workshop on Geometrical and Topological Representation Learning</w:t>
-      </w:r>
-      <w:r>
-        <w:t xml:space="preserve">.</w:t>
-      </w:r>
-    </w:p>
-    <w:bookmarkEnd w:id="61"/>
-    <w:bookmarkStart w:id="62" w:name="ref-symmcd2025"/>
-    <w:p>
-      <w:pPr>
-        <w:pStyle w:val="Bibliography"/>
-      </w:pPr>
-      <w:r>
-        <w:t xml:space="preserve">Levy, Daniel, Siba Smarak Panigrahi, Sékou-Oumar Kaba, et al. 2025.</w:t>
-      </w:r>
-      <w:r>
-        <w:t xml:space="preserve"> </w:t>
-      </w:r>
-      <w:r>
-        <w:t xml:space="preserve">“</w:t>
-      </w:r>
-      <w:r>
-        <w:t xml:space="preserve">SymmCD</w:t>
-      </w:r>
-      <w:r>
-        <w:t xml:space="preserve">: Symmetry-Preserving Crystal Generation with Diffusion Models.”</w:t>
-      </w:r>
-      <w:r>
-        <w:t xml:space="preserve"> </w:t>
-      </w:r>
-      <w:r>
-        <w:rPr>
-          <w:i/>
-          <w:iCs/>
-        </w:rPr>
-        <w:t xml:space="preserve">arXiv Preprint arXiv:2502.03638</w:t>
-      </w:r>
-      <w:r>
-        <w:t xml:space="preserve">.</w:t>
-      </w:r>
-    </w:p>
-    <w:bookmarkEnd w:id="62"/>
-    <w:bookmarkStart w:id="63" w:name="ref-lipman2023flowmatching"/>
-    <w:p>
-      <w:pPr>
-        <w:pStyle w:val="Bibliography"/>
-      </w:pPr>
-      <w:r>
-        <w:t xml:space="preserve">Lipman, Yaron, Ricky T. Q. Chen, Heli Ben-Hamu, Maximilian Nickel, and Matt Le. 2023.</w:t>
-      </w:r>
-      <w:r>
-        <w:t xml:space="preserve"> </w:t>
-      </w:r>
-      <w:r>
-        <w:t xml:space="preserve">“Flow Matching for Generative Modeling.”</w:t>
-      </w:r>
-      <w:r>
-        <w:t xml:space="preserve"> </w:t>
-      </w:r>
-      <w:r>
-        <w:rPr>
-          <w:i/>
-          <w:iCs/>
-        </w:rPr>
-        <w:t xml:space="preserve">International Conference on Learning Representations (ICLR)</w:t>
-      </w:r>
-      <w:r>
-        <w:t xml:space="preserve">.</w:t>
-      </w:r>
-    </w:p>
-    <w:bookmarkEnd w:id="63"/>
-    <w:bookmarkStart w:id="64" w:name="ref-martirossyan2025matching"/>
-    <w:p>
-      <w:pPr>
-        <w:pStyle w:val="Bibliography"/>
-      </w:pPr>
-      <w:r>
-        <w:t xml:space="preserve">Martirossyan, Maya M., Thomas Egg, Philipp Hoellmer, et al. 2025.</w:t>
-      </w:r>
-      <w:r>
-        <w:t xml:space="preserve"> </w:t>
-      </w:r>
-      <w:r>
-        <w:t xml:space="preserve">“All That Structure Matches Does Not Glitter.”</w:t>
-      </w:r>
-      <w:r>
-        <w:t xml:space="preserve"> </w:t>
-      </w:r>
-      <w:r>
-        <w:rPr>
-          <w:i/>
-          <w:iCs/>
-        </w:rPr>
-        <w:t xml:space="preserve">arXiv Preprint arXiv:2509.12178</w:t>
-      </w:r>
-      <w:r>
-        <w:t xml:space="preserve">.</w:t>
-      </w:r>
-    </w:p>
-    <w:bookmarkEnd w:id="64"/>
-    <w:bookmarkStart w:id="65" w:name="ref-miller2024flowmm"/>
-    <w:p>
-      <w:pPr>
-        <w:pStyle w:val="Bibliography"/>
-      </w:pPr>
-      <w:r>
-        <w:t xml:space="preserve">Miller, Benjamin Kurt, Ricky T. Q. Chen, Anuroop Sriram, and Brandon M. Wood. 2024.</w:t>
-      </w:r>
-      <w:r>
-        <w:t xml:space="preserve"> </w:t>
-      </w:r>
-      <w:r>
-        <w:t xml:space="preserve">“</w:t>
-      </w:r>
-      <w:r>
-        <w:t xml:space="preserve">FlowMM</w:t>
-      </w:r>
-      <w:r>
-        <w:t xml:space="preserve">: Generating Materials with Riemannian Flow Matching.”</w:t>
-      </w:r>
-      <w:r>
-        <w:t xml:space="preserve"> </w:t>
-      </w:r>
-      <w:r>
-        <w:rPr>
-          <w:i/>
-          <w:iCs/>
-        </w:rPr>
-        <w:t xml:space="preserve">International Conference on Machine Learning (ICML)</w:t>
-      </w:r>
-      <w:r>
-        <w:t xml:space="preserve">.</w:t>
-      </w:r>
-    </w:p>
-    <w:bookmarkEnd w:id="65"/>
-    <w:bookmarkStart w:id="67" w:name="ref-ong2013pymatgen"/>
-    <w:p>
-      <w:pPr>
-        <w:pStyle w:val="Bibliography"/>
-      </w:pPr>
-      <w:r>
-        <w:t xml:space="preserve">Ong, Shyue Ping, William Davidson Richards, Anubhav Jain, et al. 2013.</w:t>
-      </w:r>
-      <w:r>
-        <w:t xml:space="preserve"> </w:t>
-      </w:r>
-      <w:r>
-        <w:t xml:space="preserve">“Python Materials Genomics (Pymatgen): A Robust, Open-Source Python Library for Materials Analysis.”</w:t>
-      </w:r>
-      <w:r>
-        <w:t xml:space="preserve"> </w:t>
-      </w:r>
-      <w:r>
-        <w:rPr>
-          <w:i/>
-          <w:iCs/>
-        </w:rPr>
-        <w:t xml:space="preserve">Computational Materials Science</w:t>
-      </w:r>
-      <w:r>
-        <w:t xml:space="preserve"> </w:t>
-      </w:r>
-      <w:r>
-        <w:t xml:space="preserve">68: 314–19.</w:t>
-      </w:r>
-      <w:r>
-        <w:t xml:space="preserve"> </w:t>
-      </w:r>
-      <w:hyperlink r:id="rId66">
-        <w:r>
-          <w:rPr>
-            <w:rStyle w:val="Hyperlink"/>
-          </w:rPr>
-          <w:t xml:space="preserve">https://doi.org/10.1016/j.commatsci.2012.10.028</w:t>
-        </w:r>
-      </w:hyperlink>
-      <w:r>
-        <w:t xml:space="preserve">.</w:t>
-      </w:r>
-    </w:p>
-    <w:bookmarkEnd w:id="67"/>
-    <w:bookmarkStart w:id="68" w:name="ref-pooladian2023multisample"/>
-    <w:p>
-      <w:pPr>
-        <w:pStyle w:val="Bibliography"/>
-      </w:pPr>
-      <w:r>
-        <w:t xml:space="preserve">Pooladian, Aram-Alexandre, Heli Ben-Hamu, Carles Domingo-Enrich, Brandon Amos, Yaron Lipman, and Ricky T. Q. Chen. 2023.</w:t>
-      </w:r>
-      <w:r>
-        <w:t xml:space="preserve"> </w:t>
-      </w:r>
-      <w:r>
-        <w:t xml:space="preserve">“Multisample Flow Matching: Straightening Flows with Minibatch Couplings.”</w:t>
-      </w:r>
-      <w:r>
-        <w:t xml:space="preserve"> </w:t>
-      </w:r>
-      <w:r>
-        <w:rPr>
-          <w:i/>
-          <w:iCs/>
-        </w:rPr>
-        <w:t xml:space="preserve">International Conference on Machine Learning (ICML)</w:t>
-      </w:r>
-      <w:r>
-        <w:t xml:space="preserve">.</w:t>
-      </w:r>
-    </w:p>
-    <w:bookmarkEnd w:id="68"/>
-    <w:bookmarkStart w:id="69" w:name="ref-satorras2021egnn"/>
-    <w:p>
-      <w:pPr>
-        <w:pStyle w:val="Bibliography"/>
-      </w:pPr>
-      <w:r>
-        <w:t xml:space="preserve">Satorras, Víctor Garcia, Emiel Hoogeboom, and Max Welling. 2021.</w:t>
-      </w:r>
-      <w:r>
-        <w:t xml:space="preserve"> </w:t>
-      </w:r>
-      <w:r>
-        <w:t xml:space="preserve">“</w:t>
-      </w:r>
-      <w:r>
-        <w:t xml:space="preserve">E</w:t>
-      </w:r>
-      <w:r>
-        <w:t xml:space="preserve">(n) Equivariant Graph Neural Networks.”</w:t>
-      </w:r>
-      <w:r>
-        <w:t xml:space="preserve"> </w:t>
-      </w:r>
-      <w:r>
-        <w:rPr>
-          <w:i/>
-          <w:iCs/>
-        </w:rPr>
-        <w:t xml:space="preserve">International Conference on Machine Learning (ICML)</w:t>
-      </w:r>
-      <w:r>
-        <w:t xml:space="preserve">.</w:t>
-      </w:r>
-    </w:p>
-    <w:bookmarkEnd w:id="69"/>
-    <w:bookmarkStart w:id="70" w:name="ref-subramanian2026packflow"/>
-    <w:p>
-      <w:pPr>
-        <w:pStyle w:val="Bibliography"/>
-      </w:pPr>
-      <w:r>
-        <w:t xml:space="preserve">Subramanian, Akshay, Elton Pan, Juno Nam, et al. 2026.</w:t>
-      </w:r>
-      <w:r>
-        <w:t xml:space="preserve"> </w:t>
-      </w:r>
-      <w:r>
-        <w:t xml:space="preserve">“</w:t>
-      </w:r>
-      <w:r>
-        <w:t xml:space="preserve">PackFlow</w:t>
-      </w:r>
-      <w:r>
-        <w:t xml:space="preserve">: Generative Molecular Crystal Structure Prediction via Reinforcement Learning Alignment.”</w:t>
-      </w:r>
-      <w:r>
-        <w:t xml:space="preserve"> </w:t>
-      </w:r>
-      <w:r>
-        <w:rPr>
-          <w:i/>
-          <w:iCs/>
-        </w:rPr>
-        <w:t xml:space="preserve">arXiv Preprint arXiv:2602.20140</w:t>
-      </w:r>
-      <w:r>
-        <w:t xml:space="preserve">.</w:t>
-      </w:r>
-    </w:p>
-    <w:bookmarkEnd w:id="70"/>
-    <w:bookmarkStart w:id="72" w:name="ref-obrien2021dataefficient"/>
-    <w:p>
-      <w:pPr>
-        <w:pStyle w:val="Bibliography"/>
-      </w:pPr>
-      <w:r>
-        <w:t xml:space="preserve">Wengert, Simon, Gábor Csányi, Karsten Reuter, and Johannes T. Margraf. 2021.</w:t>
-      </w:r>
-      <w:r>
-        <w:t xml:space="preserve"> </w:t>
-      </w:r>
-      <w:r>
-        <w:t xml:space="preserve">“Data-Efficient Machine Learning for Molecular Crystal Structure Prediction.”</w:t>
-      </w:r>
-      <w:r>
-        <w:t xml:space="preserve"> </w:t>
-      </w:r>
-      <w:r>
-        <w:rPr>
-          <w:i/>
-          <w:iCs/>
-        </w:rPr>
-        <w:t xml:space="preserve">Chemical Science</w:t>
-      </w:r>
-      <w:r>
-        <w:t xml:space="preserve"> </w:t>
-      </w:r>
-      <w:r>
-        <w:t xml:space="preserve">12: 4536–46.</w:t>
-      </w:r>
-      <w:r>
-        <w:t xml:space="preserve"> </w:t>
-      </w:r>
-      <w:hyperlink r:id="rId71">
-        <w:r>
-          <w:rPr>
-            <w:rStyle w:val="Hyperlink"/>
-          </w:rPr>
-          <w:t xml:space="preserve">https://doi.org/10.1039/D0SC05765G</w:t>
-        </w:r>
-      </w:hyperlink>
-      <w:r>
-        <w:t xml:space="preserve">.</w:t>
-      </w:r>
-    </w:p>
-    <w:bookmarkEnd w:id="72"/>
-    <w:bookmarkStart w:id="73" w:name="ref-xie2022cdvae"/>
-    <w:p>
-      <w:pPr>
-        <w:pStyle w:val="Bibliography"/>
-      </w:pPr>
-      <w:r>
-        <w:t xml:space="preserve">Xie, Tian, Xiang Fu, Octavian-Eugen Ganea, Regina Barzilay, and Tommi Jaakkola. 2022.</w:t>
-      </w:r>
-      <w:r>
-        <w:t xml:space="preserve"> </w:t>
-      </w:r>
-      <w:r>
-        <w:t xml:space="preserve">“Crystal Diffusion Variational Autoencoder for Periodic Material Generation.”</w:t>
-      </w:r>
-      <w:r>
-        <w:t xml:space="preserve"> </w:t>
-      </w:r>
-      <w:r>
-        <w:rPr>
-          <w:i/>
-          <w:iCs/>
-        </w:rPr>
-        <w:t xml:space="preserve">International Conference on Learning Representations (ICLR)</w:t>
-      </w:r>
-      <w:r>
-        <w:t xml:space="preserve">.</w:t>
-      </w:r>
-    </w:p>
-    <w:bookmarkEnd w:id="73"/>
-    <w:bookmarkStart w:id="74" w:name="ref-yim2023frameflow"/>
-    <w:p>
-      <w:pPr>
-        <w:pStyle w:val="Bibliography"/>
-      </w:pPr>
-      <w:r>
-        <w:t xml:space="preserve">Yim, Jason, Andrew Campbell, Andrew Y. K. Foong, et al. 2023.</w:t>
-      </w:r>
-      <w:r>
-        <w:t xml:space="preserve"> </w:t>
-      </w:r>
-      <w:r>
-        <w:t xml:space="preserve">“Fast Protein Backbone Generation with</w:t>
-      </w:r>
-      <w:r>
-        <w:t xml:space="preserve"> </w:t>
-      </w:r>
-      <w:r>
-        <w:t xml:space="preserve">SE(3)</w:t>
-      </w:r>
-      <w:r>
-        <w:t xml:space="preserve"> </w:t>
-      </w:r>
-      <w:r>
-        <w:t xml:space="preserve">Flow Matching.”</w:t>
-      </w:r>
-      <w:r>
-        <w:t xml:space="preserve"> </w:t>
-      </w:r>
-      <w:r>
-        <w:rPr>
-          <w:i/>
-          <w:iCs/>
-        </w:rPr>
-        <w:t xml:space="preserve">arXiv Preprint arXiv:2310.05297</w:t>
-      </w:r>
-      <w:r>
-        <w:t xml:space="preserve">.</w:t>
-      </w:r>
-    </w:p>
-    <w:bookmarkEnd w:id="74"/>
-    <w:bookmarkStart w:id="75" w:name="ref-yim2023se3diffusion"/>
-    <w:p>
-      <w:pPr>
-        <w:pStyle w:val="Bibliography"/>
-      </w:pPr>
-      <w:r>
-        <w:t xml:space="preserve">Yim, Jason, Brian L. Trippe, Valentin De Bortoli, et al. 2023.</w:t>
-      </w:r>
-      <w:r>
-        <w:t xml:space="preserve"> </w:t>
-      </w:r>
-      <w:r>
-        <w:t xml:space="preserve">“</w:t>
-      </w:r>
-      <w:r>
-        <w:t xml:space="preserve">SE(3)</w:t>
-      </w:r>
-      <w:r>
-        <w:t xml:space="preserve"> </w:t>
-      </w:r>
-      <w:r>
-        <w:t xml:space="preserve">Diffusion Model with Application to Protein Backbone Generation.”</w:t>
-      </w:r>
-      <w:r>
-        <w:t xml:space="preserve"> </w:t>
-      </w:r>
-      <w:r>
-        <w:rPr>
-          <w:i/>
-          <w:iCs/>
-        </w:rPr>
-        <w:t xml:space="preserve">International Conference on Machine Learning (ICML)</w:t>
-      </w:r>
-      <w:r>
-        <w:t xml:space="preserve">.</w:t>
+        <w:t xml:space="preserve">International conference on machine learning (ICML)</w:t>
+      </w:r>
+      <w:r>
+        <w:t xml:space="preserve">, 2023.</w:t>
       </w:r>
     </w:p>
     <w:bookmarkEnd w:id="75"/>

</xml_diff>

<commit_message>
Clean Fig 1 to box-and-text layout with fitted labels; rebuild manuscript DOCX
</commit_message>
<xml_diff>
--- a/paper/symmc-flow_manuscript.docx
+++ b/paper/symmc-flow_manuscript.docx
@@ -2497,7 +2497,7 @@
       <w:r>
         <w:drawing>
           <wp:inline>
-            <wp:extent cx="5334000" cy="2389263"/>
+            <wp:extent cx="5334000" cy="2280109"/>
             <wp:effectExtent b="0" l="0" r="0" t="0"/>
             <wp:docPr descr="" title="" id="12" name="Picture"/>
             <a:graphic>
@@ -2518,7 +2518,7 @@
                   <pic:spPr bwMode="auto">
                     <a:xfrm>
                       <a:off x="0" y="0"/>
-                      <a:ext cx="5334000" cy="2389263"/>
+                      <a:ext cx="5334000" cy="2280109"/>
                     </a:xfrm>
                     <a:prstGeom prst="rect">
                       <a:avLst/>

</xml_diff>

<commit_message>
Pre-submission consistency: 3-seed coset number, characterization framing, reconcile de-novo/isolated orient error; rebuild DOCX
</commit_message>
<xml_diff>
--- a/paper/symmc-flow_manuscript.docx
+++ b/paper/symmc-flow_manuscript.docx
@@ -220,13 +220,19 @@
         </m:r>
       </m:oMath>
       <w:r>
-        <w:t xml:space="preserve">, and use it to</w:t>
-      </w:r>
-      <w:r>
-        <w:t xml:space="preserve"> </w:t>
-      </w:r>
-      <w:r>
-        <w:t xml:space="preserve">characterize the orientation field on</w:t>
+        <w:t xml:space="preserve">, and use it as a</w:t>
+      </w:r>
+      <w:r>
+        <w:t xml:space="preserve"> </w:t>
+      </w:r>
+      <w:r>
+        <w:t xml:space="preserve">diagnostic study to characterize what the orientation field can and cannot</w:t>
+      </w:r>
+      <w:r>
+        <w:t xml:space="preserve"> </w:t>
+      </w:r>
+      <w:r>
+        <w:t xml:space="preserve">learn on</w:t>
       </w:r>
       <w:r>
         <w:t xml:space="preserve"> </w:t>
@@ -494,14 +500,14 @@
         <w:t xml:space="preserve"> </w:t>
       </w:r>
       <w:r>
-        <w:t xml:space="preserve">coset identity raises the learnable signal to</w:t>
-      </w:r>
-      <w:r>
-        <w:t xml:space="preserve"> </w:t>
-      </w:r>
-      <m:oMath>
-        <m:r>
-          <m:t>51</m:t>
+        <w:t xml:space="preserve">coset identity raises the learnable signal to roughly</w:t>
+      </w:r>
+      <w:r>
+        <w:t xml:space="preserve"> </w:t>
+      </w:r>
+      <m:oMath>
+        <m:r>
+          <m:t>48</m:t>
         </m:r>
         <m:r>
           <m:rPr>
@@ -511,7 +517,16 @@
         </m:r>
       </m:oMath>
       <w:r>
-        <w:t xml:space="preserve">, showing the residual</w:t>
+        <w:t xml:space="preserve"> </w:t>
+      </w:r>
+      <w:r>
+        <w:t xml:space="preserve">(three-seed mean),</w:t>
+      </w:r>
+      <w:r>
+        <w:t xml:space="preserve"> </w:t>
+      </w:r>
+      <w:r>
+        <w:t xml:space="preserve">showing the residual</w:t>
       </w:r>
       <w:r>
         <w:t xml:space="preserve"> </w:t>
@@ -6511,7 +6526,7 @@
       </w:r>
       <m:oMath>
         <m:r>
-          <m:t>51</m:t>
+          <m:t>50.6</m:t>
         </m:r>
         <m:r>
           <m:rPr>
@@ -6691,7 +6706,16 @@
       </w:r>
       <m:oMath>
         <m:r>
-          <m:t>51</m:t>
+          <m:t>47.9</m:t>
+        </m:r>
+        <m:r>
+          <m:rPr>
+            <m:sty m:val="p"/>
+          </m:rPr>
+          <m:t>±</m:t>
+        </m:r>
+        <m:r>
+          <m:t>3.2</m:t>
         </m:r>
         <m:r>
           <m:rPr>
@@ -6701,7 +6725,33 @@
         </m:r>
       </m:oMath>
       <w:r>
-        <w:t xml:space="preserve">, with reference copies</w:t>
+        <w:t xml:space="preserve"> </w:t>
+      </w:r>
+      <w:r>
+        <w:t xml:space="preserve">over three seeds</w:t>
+      </w:r>
+      <w:r>
+        <w:t xml:space="preserve"> </w:t>
+      </w:r>
+      <w:r>
+        <w:t xml:space="preserve">(</w:t>
+      </w:r>
+      <m:oMath>
+        <m:r>
+          <m:t>50.6</m:t>
+        </m:r>
+        <m:r>
+          <m:rPr>
+            <m:sty m:val="p"/>
+          </m:rPr>
+          <m:t>%</m:t>
+        </m:r>
+      </m:oMath>
+      <w:r>
+        <w:t xml:space="preserve"> </w:t>
+      </w:r>
+      <w:r>
+        <w:t xml:space="preserve">on the single run shown in the table), with reference copies</w:t>
       </w:r>
       <w:r>
         <w:t xml:space="preserve"> </w:t>
@@ -6767,39 +6817,7 @@
         </w:r>
       </w:hyperlink>
       <w:r>
-        <w:t xml:space="preserve">b); over three seeds the coset-conditioned non-reference</w:t>
-      </w:r>
-      <w:r>
-        <w:t xml:space="preserve"> </w:t>
-      </w:r>
-      <w:r>
-        <w:t xml:space="preserve">drop is</w:t>
-      </w:r>
-      <w:r>
-        <w:t xml:space="preserve"> </w:t>
-      </w:r>
-      <m:oMath>
-        <m:r>
-          <m:t>47.9</m:t>
-        </m:r>
-        <m:r>
-          <m:rPr>
-            <m:sty m:val="p"/>
-          </m:rPr>
-          <m:t>±</m:t>
-        </m:r>
-        <m:r>
-          <m:t>3.2</m:t>
-        </m:r>
-        <m:r>
-          <m:rPr>
-            <m:sty m:val="p"/>
-          </m:rPr>
-          <m:t>%</m:t>
-        </m:r>
-      </m:oMath>
-      <w:r>
-        <w:t xml:space="preserve">. Most of the ceiling is therefore the difficulty of</w:t>
+        <w:t xml:space="preserve">b). Most of the ceiling is therefore the difficulty of</w:t>
       </w:r>
       <w:r>
         <w:t xml:space="preserve"> </w:t>
@@ -6921,7 +6939,7 @@
       </w:r>
       <m:oMath>
         <m:r>
-          <m:t>51</m:t>
+          <m:t>50.6</m:t>
         </m:r>
         <m:r>
           <m:rPr>
@@ -7827,7 +7845,81 @@
         </m:sSup>
       </m:oMath>
       <w:r>
-        <w:t xml:space="preserve">. Every head contributes; in particular the</w:t>
+        <w:t xml:space="preserve"> </w:t>
+      </w:r>
+      <w:r>
+        <w:t xml:space="preserve">(medians over best-of-</w:t>
+      </w:r>
+      <m:oMath>
+        <m:r>
+          <m:t>20</m:t>
+        </m:r>
+      </m:oMath>
+      <w:r>
+        <w:t xml:space="preserve"> </w:t>
+      </w:r>
+      <w:r>
+        <w:t xml:space="preserve">draws; this de-novo orientation error is not directly comparable to the</w:t>
+      </w:r>
+      <w:r>
+        <w:t xml:space="preserve"> </w:t>
+      </w:r>
+      <w:r>
+        <w:t xml:space="preserve">orientation-isolated</w:t>
+      </w:r>
+      <w:r>
+        <w:t xml:space="preserve"> </w:t>
+      </w:r>
+      <m:oMath>
+        <m:sSup>
+          <m:e>
+            <m:r>
+              <m:t>68</m:t>
+            </m:r>
+          </m:e>
+          <m:sup>
+            <m:r>
+              <m:rPr>
+                <m:sty m:val="p"/>
+              </m:rPr>
+              <m:t>∘</m:t>
+            </m:r>
+          </m:sup>
+        </m:sSup>
+      </m:oMath>
+      <w:r>
+        <w:t xml:space="preserve"> </w:t>
+      </w:r>
+      <w:r>
+        <w:t xml:space="preserve">of Table </w:t>
+      </w:r>
+      <w:hyperlink w:anchor="tab:matchrate">
+        <w:r>
+          <w:rPr>
+            <w:rStyle w:val="Hyperlink"/>
+          </w:rPr>
+          <w:t xml:space="preserve">3</w:t>
+        </w:r>
+      </w:hyperlink>
+      <w:r>
+        <w:t xml:space="preserve">, which is a mean over</w:t>
+      </w:r>
+      <w:r>
+        <w:t xml:space="preserve"> </w:t>
+      </w:r>
+      <w:r>
+        <w:t xml:space="preserve">best-of-</w:t>
+      </w:r>
+      <m:oMath>
+        <m:r>
+          <m:t>8</m:t>
+        </m:r>
+      </m:oMath>
+      <w:r>
+        <w:t xml:space="preserve"> </w:t>
+      </w:r>
+      <w:r>
+        <w:t xml:space="preserve">draws taken with the true packing supplied). Every head contributes; in particular the</w:t>
       </w:r>
       <w:r>
         <w:t xml:space="preserve"> </w:t>

</xml_diff>

<commit_message>
De-AI pass: trim rhetorical tics (delineates/underscores/redundant genuinely); rebuild DOCX
</commit_message>
<xml_diff>
--- a/paper/symmc-flow_manuscript.docx
+++ b/paper/symmc-flow_manuscript.docx
@@ -578,7 +578,7 @@
         <w:t xml:space="preserve"> </w:t>
       </w:r>
       <w:r>
-        <w:t xml:space="preserve">The result delineates exactly what a rigid-body</w:t>
+        <w:t xml:space="preserve">The result maps out what a rigid-body</w:t>
       </w:r>
       <w:r>
         <w:t xml:space="preserve"> </w:t>
@@ -4541,7 +4541,7 @@
         <w:t xml:space="preserve"> </w:t>
       </w:r>
       <w:r>
-        <w:t xml:space="preserve">(the genuinely symmetry-determined targets), and report the latter.</w:t>
+        <w:t xml:space="preserve">(the symmetry-determined targets), and report the latter.</w:t>
       </w:r>
       <w:r>
         <w:t xml:space="preserve"> </w:t>
@@ -8671,7 +8671,7 @@
         <w:t xml:space="preserve"> </w:t>
       </w:r>
       <w:r>
-        <w:t xml:space="preserve">reconstruction rate underscores why a single match-rate number is an unreliable</w:t>
+        <w:t xml:space="preserve">reconstruction rate shows why a single match-rate number is an unreliable</w:t>
       </w:r>
       <w:r>
         <w:t xml:space="preserve"> </w:t>
@@ -8774,7 +8774,7 @@
         <w:t xml:space="preserve"> </w:t>
       </w:r>
       <w:r>
-        <w:t xml:space="preserve">lookup, leaving only the genuinely free pose to be sampled. This suggests that</w:t>
+        <w:t xml:space="preserve">lookup, leaving only the free pose to be sampled. This suggests that</w:t>
       </w:r>
       <w:r>
         <w:t xml:space="preserve"> </w:t>

</xml_diff>

<commit_message>
Add ORCID + Zenodo DOI; redraw Fig 1 as a visual schematic (unit cell, oriented molecules, SO(3) frame, symmetry rotation)
</commit_message>
<xml_diff>
--- a/paper/symmc-flow_manuscript.docx
+++ b/paper/symmc-flow_manuscript.docx
@@ -702,7 +702,7 @@
         <w:t xml:space="preserve">symmetry</w:t>
       </w:r>
     </w:p>
-    <w:bookmarkStart w:id="10" w:name="introduction"/>
+    <w:bookmarkStart w:id="11" w:name="introduction"/>
     <w:p>
       <w:pPr>
         <w:pStyle w:val="Heading1"/>
@@ -1863,8 +1863,8 @@
         <w:t xml:space="preserve">ceiling is inference-limited, not representational.</w:t>
       </w:r>
     </w:p>
-    <w:bookmarkEnd w:id="10"/>
-    <w:bookmarkStart w:id="31" w:name="results"/>
+    <w:bookmarkEnd w:id="11"/>
+    <w:bookmarkStart w:id="32" w:name="results"/>
     <w:p>
       <w:pPr>
         <w:pStyle w:val="Heading1"/>
@@ -1873,7 +1873,7 @@
         <w:t xml:space="preserve">Results</w:t>
       </w:r>
     </w:p>
-    <w:bookmarkStart w:id="15" w:name="rigid-body-factorization-and-the-flow"/>
+    <w:bookmarkStart w:id="16" w:name="rigid-body-factorization-and-the-flow"/>
     <w:p>
       <w:pPr>
         <w:pStyle w:val="Heading2"/>
@@ -2504,7 +2504,7 @@
         <w:t xml:space="preserve">and centroid that train normally.</w:t>
       </w:r>
     </w:p>
-    <w:bookmarkStart w:id="14" w:name="fig:schematic"/>
+    <w:bookmarkStart w:id="15" w:name="fig:schematic"/>
     <w:p>
       <w:pPr>
         <w:pStyle w:val="CaptionedFigure"/>
@@ -2512,20 +2512,20 @@
       <w:r>
         <w:drawing>
           <wp:inline>
-            <wp:extent cx="5334000" cy="2280109"/>
+            <wp:extent cx="5334000" cy="2714300"/>
             <wp:effectExtent b="0" l="0" r="0" t="0"/>
-            <wp:docPr descr="" title="" id="12" name="Picture"/>
+            <wp:docPr descr="" title="" id="13" name="Picture"/>
             <a:graphic>
               <a:graphicData uri="http://schemas.openxmlformats.org/drawingml/2006/picture">
                 <pic:pic>
                   <pic:nvPicPr>
-                    <pic:cNvPr descr="figures/fig1_schematic.png" id="13" name="Picture"/>
+                    <pic:cNvPr descr="figures/fig1_schematic.png" id="14" name="Picture"/>
                     <pic:cNvPicPr>
                       <a:picLocks noChangeArrowheads="1" noChangeAspect="1"/>
                     </pic:cNvPicPr>
                   </pic:nvPicPr>
                   <pic:blipFill>
-                    <a:blip r:embed="rId11"/>
+                    <a:blip r:embed="rId12"/>
                     <a:stretch>
                       <a:fillRect/>
                     </a:stretch>
@@ -2533,7 +2533,7 @@
                   <pic:spPr bwMode="auto">
                     <a:xfrm>
                       <a:off x="0" y="0"/>
-                      <a:ext cx="5334000" cy="2280109"/>
+                      <a:ext cx="5334000" cy="2714300"/>
                     </a:xfrm>
                     <a:prstGeom prst="rect">
                       <a:avLst/>
@@ -2806,9 +2806,9 @@
         <w:t xml:space="preserve">packing.</w:t>
       </w:r>
     </w:p>
-    <w:bookmarkEnd w:id="14"/>
     <w:bookmarkEnd w:id="15"/>
-    <w:bookmarkStart w:id="17" w:name="X9bea20bf657ff1a02fc0d5b6264462ed84ab9f1"/>
+    <w:bookmarkEnd w:id="16"/>
+    <w:bookmarkStart w:id="18" w:name="X9bea20bf657ff1a02fc0d5b6264462ed84ab9f1"/>
     <w:p>
       <w:pPr>
         <w:pStyle w:val="Heading2"/>
@@ -3013,7 +3013,7 @@
         <w:t xml:space="preserve">single-atom benchmarks never exercise.</w:t>
       </w:r>
     </w:p>
-    <w:bookmarkStart w:id="16" w:name="tab:perhead"/>
+    <w:bookmarkStart w:id="17" w:name="tab:perhead"/>
     <w:p>
       <w:pPr>
         <w:pStyle w:val="TableCaption"/>
@@ -3368,9 +3368,9 @@
         </w:tc>
       </w:tr>
     </w:tbl>
-    <w:bookmarkEnd w:id="16"/>
     <w:bookmarkEnd w:id="17"/>
-    <w:bookmarkStart w:id="18" w:name="Xf2eac6c9a09d7d9171098ef97426ad3131dbaae"/>
+    <w:bookmarkEnd w:id="18"/>
+    <w:bookmarkStart w:id="19" w:name="Xf2eac6c9a09d7d9171098ef97426ad3131dbaae"/>
     <w:p>
       <w:pPr>
         <w:pStyle w:val="Heading2"/>
@@ -3711,8 +3711,8 @@
         <w:t xml:space="preserve">accident.</w:t>
       </w:r>
     </w:p>
-    <w:bookmarkEnd w:id="18"/>
-    <w:bookmarkStart w:id="20" w:name="X9ceaeac927e6cf9f5b0f24e4caf21dc6fed5798"/>
+    <w:bookmarkEnd w:id="19"/>
+    <w:bookmarkStart w:id="21" w:name="X9ceaeac927e6cf9f5b0f24e4caf21dc6fed5798"/>
     <w:p>
       <w:pPr>
         <w:pStyle w:val="Heading2"/>
@@ -4977,7 +4977,7 @@
         <w:t xml:space="preserve">.</w:t>
       </w:r>
     </w:p>
-    <w:bookmarkStart w:id="19" w:name="tab:twobytwo"/>
+    <w:bookmarkStart w:id="20" w:name="tab:twobytwo"/>
     <w:p>
       <w:pPr>
         <w:pStyle w:val="TableCaption"/>
@@ -5359,9 +5359,9 @@
         </w:tc>
       </w:tr>
     </w:tbl>
-    <w:bookmarkEnd w:id="19"/>
     <w:bookmarkEnd w:id="20"/>
-    <w:bookmarkStart w:id="22" w:name="Xb92a642a6d8ccac0c0043ad69dc3a973d316634"/>
+    <w:bookmarkEnd w:id="21"/>
+    <w:bookmarkStart w:id="23" w:name="Xb92a642a6d8ccac0c0043ad69dc3a973d316634"/>
     <w:p>
       <w:pPr>
         <w:pStyle w:val="Heading2"/>
@@ -6028,7 +6028,7 @@
         <w:t xml:space="preserve">confirming the reconstruction survives the leakage control.</w:t>
       </w:r>
     </w:p>
-    <w:bookmarkStart w:id="21" w:name="tab:matchrate"/>
+    <w:bookmarkStart w:id="22" w:name="tab:matchrate"/>
     <w:p>
       <w:pPr>
         <w:pStyle w:val="TableCaption"/>
@@ -6454,9 +6454,9 @@
         </w:tc>
       </w:tr>
     </w:tbl>
-    <w:bookmarkEnd w:id="21"/>
     <w:bookmarkEnd w:id="22"/>
-    <w:bookmarkStart w:id="28" w:name="X788f61e46781ba45615d6115726b84b54364e2f"/>
+    <w:bookmarkEnd w:id="23"/>
+    <w:bookmarkStart w:id="29" w:name="X788f61e46781ba45615d6115726b84b54364e2f"/>
     <w:p>
       <w:pPr>
         <w:pStyle w:val="Heading2"/>
@@ -7000,7 +7000,7 @@
         <w:t xml:space="preserve">realizing that gain in a sampler is left to future work.</w:t>
       </w:r>
     </w:p>
-    <w:bookmarkStart w:id="23" w:name="tab:strengthen"/>
+    <w:bookmarkStart w:id="24" w:name="tab:strengthen"/>
     <w:p>
       <w:pPr>
         <w:pStyle w:val="TableCaption"/>
@@ -7375,8 +7375,8 @@
         </w:tc>
       </w:tr>
     </w:tbl>
-    <w:bookmarkEnd w:id="23"/>
-    <w:bookmarkStart w:id="27" w:name="fig:results"/>
+    <w:bookmarkEnd w:id="24"/>
+    <w:bookmarkStart w:id="28" w:name="fig:results"/>
     <w:p>
       <w:pPr>
         <w:pStyle w:val="CaptionedFigure"/>
@@ -7386,18 +7386,18 @@
           <wp:inline>
             <wp:extent cx="5334000" cy="2226030"/>
             <wp:effectExtent b="0" l="0" r="0" t="0"/>
-            <wp:docPr descr="" title="" id="25" name="Picture"/>
+            <wp:docPr descr="" title="" id="26" name="Picture"/>
             <a:graphic>
               <a:graphicData uri="http://schemas.openxmlformats.org/drawingml/2006/picture">
                 <pic:pic>
                   <pic:nvPicPr>
-                    <pic:cNvPr descr="figures/fig2_results.png" id="26" name="Picture"/>
+                    <pic:cNvPr descr="figures/fig2_results.png" id="27" name="Picture"/>
                     <pic:cNvPicPr>
                       <a:picLocks noChangeArrowheads="1" noChangeAspect="1"/>
                     </pic:cNvPicPr>
                   </pic:nvPicPr>
                   <pic:blipFill>
-                    <a:blip r:embed="rId24"/>
+                    <a:blip r:embed="rId25"/>
                     <a:stretch>
                       <a:fillRect/>
                     </a:stretch>
@@ -7618,9 +7618,9 @@
         <w:t xml:space="preserve">rather than representational.</w:t>
       </w:r>
     </w:p>
-    <w:bookmarkEnd w:id="27"/>
     <w:bookmarkEnd w:id="28"/>
-    <w:bookmarkStart w:id="29" w:name="X92e08dda5a452b38fc400e8f4b5fff99a59848a"/>
+    <w:bookmarkEnd w:id="29"/>
+    <w:bookmarkStart w:id="30" w:name="X92e08dda5a452b38fc400e8f4b5fff99a59848a"/>
     <w:p>
       <w:pPr>
         <w:pStyle w:val="Heading2"/>
@@ -8336,8 +8336,8 @@
         <w:t xml:space="preserve">not a finished generator.</w:t>
       </w:r>
     </w:p>
-    <w:bookmarkEnd w:id="29"/>
-    <w:bookmarkStart w:id="30" w:name="X26082a8f309b6aa5a951d70201583dbbff0b5d2"/>
+    <w:bookmarkEnd w:id="30"/>
+    <w:bookmarkStart w:id="31" w:name="X26082a8f309b6aa5a951d70201583dbbff0b5d2"/>
     <w:p>
       <w:pPr>
         <w:pStyle w:val="Heading2"/>
@@ -8402,9 +8402,9 @@
         <w:t xml:space="preserve">confirm the flow and sampler are sound and are not the focus of this study.</w:t>
       </w:r>
     </w:p>
-    <w:bookmarkEnd w:id="30"/>
     <w:bookmarkEnd w:id="31"/>
-    <w:bookmarkStart w:id="32" w:name="discussion"/>
+    <w:bookmarkEnd w:id="32"/>
+    <w:bookmarkStart w:id="33" w:name="discussion"/>
     <w:p>
       <w:pPr>
         <w:pStyle w:val="Heading1"/>
@@ -9015,8 +9015,8 @@
         <w:t xml:space="preserve">assignment is available, as it is in template-based generation.</w:t>
       </w:r>
     </w:p>
-    <w:bookmarkEnd w:id="32"/>
-    <w:bookmarkStart w:id="42" w:name="methods"/>
+    <w:bookmarkEnd w:id="33"/>
+    <w:bookmarkStart w:id="43" w:name="methods"/>
     <w:p>
       <w:pPr>
         <w:pStyle w:val="Heading1"/>
@@ -9025,7 +9025,7 @@
         <w:t xml:space="preserve">Methods</w:t>
       </w:r>
     </w:p>
-    <w:bookmarkStart w:id="33" w:name="X97197145db4945f5faf6e0d2b94973879e212de"/>
+    <w:bookmarkStart w:id="34" w:name="X97197145db4945f5faf6e0d2b94973879e212de"/>
     <w:p>
       <w:pPr>
         <w:pStyle w:val="Heading2"/>
@@ -9160,8 +9160,8 @@
         <w:t xml:space="preserve">canonical frame.</w:t>
       </w:r>
     </w:p>
-    <w:bookmarkEnd w:id="33"/>
-    <w:bookmarkStart w:id="34" w:name="manifolds-and-flow-matching"/>
+    <w:bookmarkEnd w:id="34"/>
+    <w:bookmarkStart w:id="35" w:name="manifolds-and-flow-matching"/>
     <w:p>
       <w:pPr>
         <w:pStyle w:val="Heading2"/>
@@ -9551,8 +9551,8 @@
         <w:t xml:space="preserve">molecules.</w:t>
       </w:r>
     </w:p>
-    <w:bookmarkEnd w:id="34"/>
-    <w:bookmarkStart w:id="35" w:name="X5cba2d19fb6093dd286d99037f362ce7a67b02f"/>
+    <w:bookmarkEnd w:id="35"/>
+    <w:bookmarkStart w:id="36" w:name="X5cba2d19fb6093dd286d99037f362ce7a67b02f"/>
     <w:p>
       <w:pPr>
         <w:pStyle w:val="Heading2"/>
@@ -9680,8 +9680,8 @@
         <w:t xml:space="preserve">number is read from that run.</w:t>
       </w:r>
     </w:p>
-    <w:bookmarkEnd w:id="35"/>
-    <w:bookmarkStart w:id="36" w:name="network"/>
+    <w:bookmarkEnd w:id="36"/>
+    <w:bookmarkStart w:id="37" w:name="network"/>
     <w:p>
       <w:pPr>
         <w:pStyle w:val="Heading2"/>
@@ -9781,8 +9781,8 @@
         <w:t xml:space="preserve">when enabled.</w:t>
       </w:r>
     </w:p>
-    <w:bookmarkEnd w:id="36"/>
-    <w:bookmarkStart w:id="37" w:name="relative-gauge-and-coset-codebook"/>
+    <w:bookmarkEnd w:id="37"/>
+    <w:bookmarkStart w:id="38" w:name="relative-gauge-and-coset-codebook"/>
     <w:p>
       <w:pPr>
         <w:pStyle w:val="Heading2"/>
@@ -9938,8 +9938,8 @@
         <w:t xml:space="preserve">which become the per-molecule coset labels.</w:t>
       </w:r>
     </w:p>
-    <w:bookmarkEnd w:id="37"/>
-    <w:bookmarkStart w:id="38" w:name="training"/>
+    <w:bookmarkEnd w:id="38"/>
+    <w:bookmarkStart w:id="39" w:name="training"/>
     <w:p>
       <w:pPr>
         <w:pStyle w:val="Heading2"/>
@@ -10195,8 +10195,8 @@
         <w:t xml:space="preserve">the run reported here skipped a single step.</w:t>
       </w:r>
     </w:p>
-    <w:bookmarkEnd w:id="38"/>
-    <w:bookmarkStart w:id="39" w:name="Xf804d9ec23f9816c375c9bf696810bbfe4b176b"/>
+    <w:bookmarkEnd w:id="39"/>
+    <w:bookmarkStart w:id="40" w:name="Xf804d9ec23f9816c375c9bf696810bbfe4b176b"/>
     <w:p>
       <w:pPr>
         <w:pStyle w:val="Heading2"/>
@@ -10303,8 +10303,8 @@
         <w:t xml:space="preserve">its random-prior floor and the trained field.</w:t>
       </w:r>
     </w:p>
-    <w:bookmarkEnd w:id="39"/>
-    <w:bookmarkStart w:id="40" w:name="orientation-isolated-match-metric"/>
+    <w:bookmarkEnd w:id="40"/>
+    <w:bookmarkStart w:id="41" w:name="orientation-isolated-match-metric"/>
     <w:p>
       <w:pPr>
         <w:pStyle w:val="Heading2"/>
@@ -10556,8 +10556,8 @@
         <w:t xml:space="preserve">.</w:t>
       </w:r>
     </w:p>
-    <w:bookmarkEnd w:id="40"/>
-    <w:bookmarkStart w:id="41" w:name="data"/>
+    <w:bookmarkEnd w:id="41"/>
+    <w:bookmarkStart w:id="42" w:name="data"/>
     <w:p>
       <w:pPr>
         <w:pStyle w:val="Heading2"/>
@@ -10787,9 +10787,9 @@
         <w:t xml:space="preserve">the dataset from a licensed CSD installation.</w:t>
       </w:r>
     </w:p>
-    <w:bookmarkEnd w:id="41"/>
     <w:bookmarkEnd w:id="42"/>
-    <w:bookmarkStart w:id="43" w:name="data-availability"/>
+    <w:bookmarkEnd w:id="43"/>
+    <w:bookmarkStart w:id="44" w:name="data-availability"/>
     <w:p>
       <w:pPr>
         <w:pStyle w:val="Heading1"/>
@@ -10830,8 +10830,8 @@
         <w:t xml:space="preserve">CSD installation.</w:t>
       </w:r>
     </w:p>
-    <w:bookmarkEnd w:id="43"/>
-    <w:bookmarkStart w:id="45" w:name="code-availability"/>
+    <w:bookmarkEnd w:id="44"/>
+    <w:bookmarkStart w:id="47" w:name="code-availability"/>
     <w:p>
       <w:pPr>
         <w:pStyle w:val="Heading1"/>
@@ -10856,7 +10856,7 @@
       <w:r>
         <w:t xml:space="preserve"> </w:t>
       </w:r>
-      <w:hyperlink r:id="rId44">
+      <w:hyperlink r:id="rId45">
         <w:r>
           <w:rPr>
             <w:rStyle w:val="Hyperlink"/>
@@ -10865,11 +10865,28 @@
         </w:r>
       </w:hyperlink>
       <w:r>
+        <w:t xml:space="preserve"> </w:t>
+      </w:r>
+      <w:r>
+        <w:t xml:space="preserve">and archived at</w:t>
+      </w:r>
+      <w:r>
+        <w:t xml:space="preserve"> </w:t>
+      </w:r>
+      <w:hyperlink r:id="rId46">
+        <w:r>
+          <w:rPr>
+            <w:rStyle w:val="Hyperlink"/>
+          </w:rPr>
+          <w:t xml:space="preserve">https://doi.org/10.5281/zenodo.20822235</w:t>
+        </w:r>
+      </w:hyperlink>
+      <w:r>
         <w:t xml:space="preserve">.</w:t>
       </w:r>
     </w:p>
-    <w:bookmarkEnd w:id="45"/>
-    <w:bookmarkStart w:id="46" w:name="author-contributions"/>
+    <w:bookmarkEnd w:id="47"/>
+    <w:bookmarkStart w:id="48" w:name="author-contributions"/>
     <w:p>
       <w:pPr>
         <w:pStyle w:val="Heading1"/>
@@ -10892,8 +10909,8 @@
         <w:t xml:space="preserve">analysis, and wrote the manuscript.</w:t>
       </w:r>
     </w:p>
-    <w:bookmarkEnd w:id="46"/>
-    <w:bookmarkStart w:id="47" w:name="competing-interests"/>
+    <w:bookmarkEnd w:id="48"/>
+    <w:bookmarkStart w:id="49" w:name="competing-interests"/>
     <w:p>
       <w:pPr>
         <w:pStyle w:val="Heading1"/>
@@ -10910,8 +10927,8 @@
         <w:t xml:space="preserve">The author declares no competing interests.</w:t>
       </w:r>
     </w:p>
-    <w:bookmarkEnd w:id="47"/>
-    <w:bookmarkStart w:id="48" w:name="funding"/>
+    <w:bookmarkEnd w:id="49"/>
+    <w:bookmarkStart w:id="50" w:name="funding"/>
     <w:p>
       <w:pPr>
         <w:pStyle w:val="Heading1"/>
@@ -10934,8 +10951,8 @@
         <w:t xml:space="preserve">for model training was funded personally by the author.</w:t>
       </w:r>
     </w:p>
-    <w:bookmarkEnd w:id="48"/>
-    <w:bookmarkStart w:id="77" w:name="use-of-ai-tools"/>
+    <w:bookmarkEnd w:id="50"/>
+    <w:bookmarkStart w:id="79" w:name="use-of-ai-tools"/>
     <w:p>
       <w:pPr>
         <w:pStyle w:val="Heading1"/>
@@ -10970,8 +10987,8 @@
         <w:t xml:space="preserve">content.</w:t>
       </w:r>
     </w:p>
-    <w:bookmarkStart w:id="76" w:name="refs"/>
-    <w:bookmarkStart w:id="49" w:name="ref-xie2022cdvae"/>
+    <w:bookmarkStart w:id="78" w:name="refs"/>
+    <w:bookmarkStart w:id="51" w:name="ref-xie2022cdvae"/>
     <w:p>
       <w:pPr>
         <w:pStyle w:val="Bibliography"/>
@@ -11002,8 +11019,8 @@
         <w:t xml:space="preserve">, 2022.</w:t>
       </w:r>
     </w:p>
-    <w:bookmarkEnd w:id="49"/>
-    <w:bookmarkStart w:id="50" w:name="ref-jiao2023diffcsp"/>
+    <w:bookmarkEnd w:id="51"/>
+    <w:bookmarkStart w:id="52" w:name="ref-jiao2023diffcsp"/>
     <w:p>
       <w:pPr>
         <w:pStyle w:val="Bibliography"/>
@@ -11034,8 +11051,8 @@
         <w:t xml:space="preserve">, 2023.</w:t>
       </w:r>
     </w:p>
-    <w:bookmarkEnd w:id="50"/>
-    <w:bookmarkStart w:id="51" w:name="ref-miller2024flowmm"/>
+    <w:bookmarkEnd w:id="52"/>
+    <w:bookmarkStart w:id="53" w:name="ref-miller2024flowmm"/>
     <w:p>
       <w:pPr>
         <w:pStyle w:val="Bibliography"/>
@@ -11066,8 +11083,8 @@
         <w:t xml:space="preserve">, 2024.</w:t>
       </w:r>
     </w:p>
-    <w:bookmarkEnd w:id="51"/>
-    <w:bookmarkStart w:id="52" w:name="ref-lipman2023flowmatching"/>
+    <w:bookmarkEnd w:id="53"/>
+    <w:bookmarkStart w:id="54" w:name="ref-lipman2023flowmatching"/>
     <w:p>
       <w:pPr>
         <w:pStyle w:val="Bibliography"/>
@@ -11098,8 +11115,8 @@
         <w:t xml:space="preserve">, 2023.</w:t>
       </w:r>
     </w:p>
-    <w:bookmarkEnd w:id="52"/>
-    <w:bookmarkStart w:id="53" w:name="ref-chen2024riemannian"/>
+    <w:bookmarkEnd w:id="54"/>
+    <w:bookmarkStart w:id="55" w:name="ref-chen2024riemannian"/>
     <w:p>
       <w:pPr>
         <w:pStyle w:val="Bibliography"/>
@@ -11130,8 +11147,8 @@
         <w:t xml:space="preserve">, 2024.</w:t>
       </w:r>
     </w:p>
-    <w:bookmarkEnd w:id="53"/>
-    <w:bookmarkStart w:id="54" w:name="ref-yim2023se3diffusion"/>
+    <w:bookmarkEnd w:id="55"/>
+    <w:bookmarkStart w:id="56" w:name="ref-yim2023se3diffusion"/>
     <w:p>
       <w:pPr>
         <w:pStyle w:val="Bibliography"/>
@@ -11162,8 +11179,8 @@
         <w:t xml:space="preserve">, 2023.</w:t>
       </w:r>
     </w:p>
-    <w:bookmarkEnd w:id="54"/>
-    <w:bookmarkStart w:id="55" w:name="ref-yim2023frameflow"/>
+    <w:bookmarkEnd w:id="56"/>
+    <w:bookmarkStart w:id="57" w:name="ref-yim2023frameflow"/>
     <w:p>
       <w:pPr>
         <w:pStyle w:val="Bibliography"/>
@@ -11194,8 +11211,8 @@
         <w:t xml:space="preserve">.</w:t>
       </w:r>
     </w:p>
-    <w:bookmarkEnd w:id="55"/>
-    <w:bookmarkStart w:id="57" w:name="ref-price2023blindtest7"/>
+    <w:bookmarkEnd w:id="57"/>
+    <w:bookmarkStart w:id="59" w:name="ref-price2023blindtest7"/>
     <w:p>
       <w:pPr>
         <w:pStyle w:val="Bibliography"/>
@@ -11228,7 +11245,7 @@
       <w:r>
         <w:t xml:space="preserve">, DOI:</w:t>
       </w:r>
-      <w:hyperlink r:id="rId56">
+      <w:hyperlink r:id="rId58">
         <w:r>
           <w:rPr>
             <w:rStyle w:val="Hyperlink"/>
@@ -11240,8 +11257,8 @@
         <w:t xml:space="preserve">.</w:t>
       </w:r>
     </w:p>
-    <w:bookmarkEnd w:id="57"/>
-    <w:bookmarkStart w:id="59" w:name="ref-obrien2021dataefficient"/>
+    <w:bookmarkEnd w:id="59"/>
+    <w:bookmarkStart w:id="61" w:name="ref-obrien2021dataefficient"/>
     <w:p>
       <w:pPr>
         <w:pStyle w:val="Bibliography"/>
@@ -11255,7 +11272,7 @@
       <w:r>
         <w:t xml:space="preserve">	</w:t>
       </w:r>
-      <w:hyperlink r:id="rId58">
+      <w:hyperlink r:id="rId60">
         <w:r>
           <w:rPr>
             <w:rStyle w:val="Hyperlink"/>
@@ -11307,8 +11324,8 @@
         <w:t xml:space="preserve">.</w:t>
       </w:r>
     </w:p>
-    <w:bookmarkEnd w:id="59"/>
-    <w:bookmarkStart w:id="60" w:name="ref-jin2025oxtal"/>
+    <w:bookmarkEnd w:id="61"/>
+    <w:bookmarkStart w:id="62" w:name="ref-jin2025oxtal"/>
     <w:p>
       <w:pPr>
         <w:pStyle w:val="Bibliography"/>
@@ -11342,8 +11359,8 @@
         <w:t xml:space="preserve">.</w:t>
       </w:r>
     </w:p>
-    <w:bookmarkEnd w:id="60"/>
-    <w:bookmarkStart w:id="61" w:name="ref-subramanian2026packflow"/>
+    <w:bookmarkEnd w:id="62"/>
+    <w:bookmarkStart w:id="63" w:name="ref-subramanian2026packflow"/>
     <w:p>
       <w:pPr>
         <w:pStyle w:val="Bibliography"/>
@@ -11374,8 +11391,8 @@
         <w:t xml:space="preserve">.</w:t>
       </w:r>
     </w:p>
-    <w:bookmarkEnd w:id="61"/>
-    <w:bookmarkStart w:id="62" w:name="ref-kim2025mofflow"/>
+    <w:bookmarkEnd w:id="63"/>
+    <w:bookmarkStart w:id="64" w:name="ref-kim2025mofflow"/>
     <w:p>
       <w:pPr>
         <w:pStyle w:val="Bibliography"/>
@@ -11406,8 +11423,8 @@
         <w:t xml:space="preserve">, 2025.</w:t>
       </w:r>
     </w:p>
-    <w:bookmarkEnd w:id="62"/>
-    <w:bookmarkStart w:id="63" w:name="ref-leach2022so3"/>
+    <w:bookmarkEnd w:id="64"/>
+    <w:bookmarkStart w:id="65" w:name="ref-leach2022so3"/>
     <w:p>
       <w:pPr>
         <w:pStyle w:val="Bibliography"/>
@@ -11438,8 +11455,8 @@
         <w:t xml:space="preserve">, 2022.</w:t>
       </w:r>
     </w:p>
-    <w:bookmarkEnd w:id="63"/>
-    <w:bookmarkStart w:id="65" w:name="ref-groom2016csd"/>
+    <w:bookmarkEnd w:id="65"/>
+    <w:bookmarkStart w:id="67" w:name="ref-groom2016csd"/>
     <w:p>
       <w:pPr>
         <w:pStyle w:val="Bibliography"/>
@@ -11453,7 +11470,7 @@
       <w:r>
         <w:t xml:space="preserve">	</w:t>
       </w:r>
-      <w:hyperlink r:id="rId64">
+      <w:hyperlink r:id="rId66">
         <w:r>
           <w:rPr>
             <w:rStyle w:val="Hyperlink"/>
@@ -11505,8 +11522,8 @@
         <w:t xml:space="preserve">.</w:t>
       </w:r>
     </w:p>
-    <w:bookmarkEnd w:id="65"/>
-    <w:bookmarkStart w:id="66" w:name="ref-satorras2021egnn"/>
+    <w:bookmarkEnd w:id="67"/>
+    <w:bookmarkStart w:id="68" w:name="ref-satorras2021egnn"/>
     <w:p>
       <w:pPr>
         <w:pStyle w:val="Bibliography"/>
@@ -11537,8 +11554,8 @@
         <w:t xml:space="preserve">, 2021.</w:t>
       </w:r>
     </w:p>
-    <w:bookmarkEnd w:id="66"/>
-    <w:bookmarkStart w:id="68" w:name="ref-ong2013pymatgen"/>
+    <w:bookmarkEnd w:id="68"/>
+    <w:bookmarkStart w:id="70" w:name="ref-ong2013pymatgen"/>
     <w:p>
       <w:pPr>
         <w:pStyle w:val="Bibliography"/>
@@ -11552,7 +11569,7 @@
       <w:r>
         <w:t xml:space="preserve">	</w:t>
       </w:r>
-      <w:hyperlink r:id="rId67">
+      <w:hyperlink r:id="rId69">
         <w:r>
           <w:rPr>
             <w:rStyle w:val="Hyperlink"/>
@@ -11604,8 +11621,8 @@
         <w:t xml:space="preserve">.</w:t>
       </w:r>
     </w:p>
-    <w:bookmarkEnd w:id="68"/>
-    <w:bookmarkStart w:id="69" w:name="ref-martirossyan2025matching"/>
+    <w:bookmarkEnd w:id="70"/>
+    <w:bookmarkStart w:id="71" w:name="ref-martirossyan2025matching"/>
     <w:p>
       <w:pPr>
         <w:pStyle w:val="Bibliography"/>
@@ -11636,8 +11653,8 @@
         <w:t xml:space="preserve">.</w:t>
       </w:r>
     </w:p>
-    <w:bookmarkEnd w:id="69"/>
-    <w:bookmarkStart w:id="70" w:name="ref-jiao2024diffcsppp"/>
+    <w:bookmarkEnd w:id="71"/>
+    <w:bookmarkStart w:id="72" w:name="ref-jiao2024diffcsppp"/>
     <w:p>
       <w:pPr>
         <w:pStyle w:val="Bibliography"/>
@@ -11668,8 +11685,8 @@
         <w:t xml:space="preserve">, 2024.</w:t>
       </w:r>
     </w:p>
-    <w:bookmarkEnd w:id="70"/>
-    <w:bookmarkStart w:id="71" w:name="ref-wyckoffdiff2025"/>
+    <w:bookmarkEnd w:id="72"/>
+    <w:bookmarkStart w:id="73" w:name="ref-wyckoffdiff2025"/>
     <w:p>
       <w:pPr>
         <w:pStyle w:val="Bibliography"/>
@@ -11700,8 +11717,8 @@
         <w:t xml:space="preserve">.</w:t>
       </w:r>
     </w:p>
-    <w:bookmarkEnd w:id="71"/>
-    <w:bookmarkStart w:id="72" w:name="ref-symmcd2025"/>
+    <w:bookmarkEnd w:id="73"/>
+    <w:bookmarkStart w:id="74" w:name="ref-symmcd2025"/>
     <w:p>
       <w:pPr>
         <w:pStyle w:val="Bibliography"/>
@@ -11732,8 +11749,8 @@
         <w:t xml:space="preserve">.</w:t>
       </w:r>
     </w:p>
-    <w:bookmarkEnd w:id="72"/>
-    <w:bookmarkStart w:id="74" w:name="ref-deng2023chgnet"/>
+    <w:bookmarkEnd w:id="74"/>
+    <w:bookmarkStart w:id="76" w:name="ref-deng2023chgnet"/>
     <w:p>
       <w:pPr>
         <w:pStyle w:val="Bibliography"/>
@@ -11747,7 +11764,7 @@
       <w:r>
         <w:t xml:space="preserve">	</w:t>
       </w:r>
-      <w:hyperlink r:id="rId73">
+      <w:hyperlink r:id="rId75">
         <w:r>
           <w:rPr>
             <w:rStyle w:val="Hyperlink"/>
@@ -11799,8 +11816,8 @@
         <w:t xml:space="preserve">.</w:t>
       </w:r>
     </w:p>
-    <w:bookmarkEnd w:id="74"/>
-    <w:bookmarkStart w:id="75" w:name="ref-pooladian2023multisample"/>
+    <w:bookmarkEnd w:id="76"/>
+    <w:bookmarkStart w:id="77" w:name="ref-pooladian2023multisample"/>
     <w:p>
       <w:pPr>
         <w:pStyle w:val="Bibliography"/>
@@ -11831,9 +11848,9 @@
         <w:t xml:space="preserve">, 2023.</w:t>
       </w:r>
     </w:p>
-    <w:bookmarkEnd w:id="75"/>
-    <w:bookmarkEnd w:id="76"/>
     <w:bookmarkEnd w:id="77"/>
+    <w:bookmarkEnd w:id="78"/>
+    <w:bookmarkEnd w:id="79"/>
     <w:sectPr>
       <w:footnotePr>
         <w:numRestart w:val="eachSect"/>
@@ -11883,6 +11900,26 @@
         </w:rPr>
         <w:t xml:space="preserve">cai495@purdue.edu</w:t>
       </w:r>
+      <w:r>
+        <w:t xml:space="preserve">;</w:t>
+      </w:r>
+      <w:r>
+        <w:t xml:space="preserve"> </w:t>
+      </w:r>
+      <w:r>
+        <w:t xml:space="preserve">ORCID</w:t>
+      </w:r>
+      <w:r>
+        <w:t xml:space="preserve"> </w:t>
+      </w:r>
+      <w:hyperlink r:id="rId10">
+        <w:r>
+          <w:rPr>
+            <w:rStyle w:val="Hyperlink"/>
+          </w:rPr>
+          <w:t xml:space="preserve">0009-0004-7283-1915</w:t>
+        </w:r>
+      </w:hyperlink>
     </w:p>
   </w:footnote>
 </w:footnotes>

</xml_diff>

<commit_message>
Remove Fig 1 schematic entirely (figure, in-text reference, and asset files); rebuild DOCX
</commit_message>
<xml_diff>
--- a/paper/symmc-flow_manuscript.docx
+++ b/paper/symmc-flow_manuscript.docx
@@ -1864,7 +1864,7 @@
       </w:r>
     </w:p>
     <w:bookmarkEnd w:id="11"/>
-    <w:bookmarkStart w:id="32" w:name="results"/>
+    <w:bookmarkStart w:id="28" w:name="results"/>
     <w:p>
       <w:pPr>
         <w:pStyle w:val="Heading1"/>
@@ -1873,7 +1873,7 @@
         <w:t xml:space="preserve">Results</w:t>
       </w:r>
     </w:p>
-    <w:bookmarkStart w:id="16" w:name="rigid-body-factorization-and-the-flow"/>
+    <w:bookmarkStart w:id="12" w:name="rigid-body-factorization-and-the-flow"/>
     <w:p>
       <w:pPr>
         <w:pStyle w:val="Heading2"/>
@@ -2334,33 +2334,13 @@
         <w:t xml:space="preserve"> </w:t>
       </w:r>
       <w:r>
-        <w:t xml:space="preserve">mixes molecules within the cell. Figure </w:t>
-      </w:r>
-      <w:hyperlink w:anchor="fig:schematic">
-        <w:r>
-          <w:rPr>
-            <w:rStyle w:val="Hyperlink"/>
-          </w:rPr>
-          <w:t xml:space="preserve">1</w:t>
-        </w:r>
-      </w:hyperlink>
-      <w:r>
-        <w:t xml:space="preserve"> </w:t>
-      </w:r>
-      <w:r>
-        <w:t xml:space="preserve">summarizes the</w:t>
-      </w:r>
-      <w:r>
-        <w:t xml:space="preserve"> </w:t>
-      </w:r>
-      <w:r>
-        <w:t xml:space="preserve">factorization and the orientation decomposition developed below. Architecture,</w:t>
-      </w:r>
-      <w:r>
-        <w:t xml:space="preserve"> </w:t>
-      </w:r>
-      <w:r>
-        <w:t xml:space="preserve">manifold operations, and data are detailed in Methods.</w:t>
+        <w:t xml:space="preserve">mixes molecules within the cell. Architecture, manifold operations, and data</w:t>
+      </w:r>
+      <w:r>
+        <w:t xml:space="preserve"> </w:t>
+      </w:r>
+      <w:r>
+        <w:t xml:space="preserve">are detailed in Methods.</w:t>
       </w:r>
     </w:p>
     <w:p>
@@ -2504,311 +2484,8 @@
         <w:t xml:space="preserve">and centroid that train normally.</w:t>
       </w:r>
     </w:p>
-    <w:bookmarkStart w:id="15" w:name="fig:schematic"/>
-    <w:p>
-      <w:pPr>
-        <w:pStyle w:val="CaptionedFigure"/>
-      </w:pPr>
-      <w:r>
-        <w:drawing>
-          <wp:inline>
-            <wp:extent cx="5334000" cy="2714300"/>
-            <wp:effectExtent b="0" l="0" r="0" t="0"/>
-            <wp:docPr descr="" title="" id="13" name="Picture"/>
-            <a:graphic>
-              <a:graphicData uri="http://schemas.openxmlformats.org/drawingml/2006/picture">
-                <pic:pic>
-                  <pic:nvPicPr>
-                    <pic:cNvPr descr="figures/fig1_schematic.png" id="14" name="Picture"/>
-                    <pic:cNvPicPr>
-                      <a:picLocks noChangeArrowheads="1" noChangeAspect="1"/>
-                    </pic:cNvPicPr>
-                  </pic:nvPicPr>
-                  <pic:blipFill>
-                    <a:blip r:embed="rId12"/>
-                    <a:stretch>
-                      <a:fillRect/>
-                    </a:stretch>
-                  </pic:blipFill>
-                  <pic:spPr bwMode="auto">
-                    <a:xfrm>
-                      <a:off x="0" y="0"/>
-                      <a:ext cx="5334000" cy="2714300"/>
-                    </a:xfrm>
-                    <a:prstGeom prst="rect">
-                      <a:avLst/>
-                    </a:prstGeom>
-                    <a:noFill/>
-                    <a:ln w="9525">
-                      <a:noFill/>
-                      <a:headEnd/>
-                      <a:tailEnd/>
-                    </a:ln>
-                  </pic:spPr>
-                </pic:pic>
-              </a:graphicData>
-            </a:graphic>
-          </wp:inline>
-        </w:drawing>
-      </w:r>
-    </w:p>
-    <w:p>
-      <w:pPr>
-        <w:pStyle w:val="ImageCaption"/>
-      </w:pPr>
-      <w:r>
-        <w:t xml:space="preserve">Rigid-body factorization and the orientation decomposition.</w:t>
-      </w:r>
-      <w:r>
-        <w:t xml:space="preserve"> </w:t>
-      </w:r>
-      <w:r>
-        <w:t xml:space="preserve">(a) A molecular crystal is represented by a lattice</w:t>
-      </w:r>
-      <w:r>
-        <w:t xml:space="preserve"> </w:t>
-      </w:r>
-      <m:oMath>
-        <m:r>
-          <m:t>L</m:t>
-        </m:r>
-      </m:oMath>
-      <w:r>
-        <w:t xml:space="preserve">, a fractional centroid</w:t>
-      </w:r>
-      <w:r>
-        <w:t xml:space="preserve"> </w:t>
-      </w:r>
-      <m:oMath>
-        <m:sSub>
-          <m:e>
-            <m:r>
-              <m:t>c</m:t>
-            </m:r>
-          </m:e>
-          <m:sub>
-            <m:r>
-              <m:t>m</m:t>
-            </m:r>
-          </m:sub>
-        </m:sSub>
-        <m:r>
-          <m:rPr>
-            <m:sty m:val="p"/>
-          </m:rPr>
-          <m:t>∈</m:t>
-        </m:r>
-        <m:sSup>
-          <m:e>
-            <m:r>
-              <m:rPr>
-                <m:scr m:val="double-struck"/>
-                <m:sty m:val="p"/>
-              </m:rPr>
-              <m:t>T</m:t>
-            </m:r>
-          </m:e>
-          <m:sup>
-            <m:r>
-              <m:t>3</m:t>
-            </m:r>
-          </m:sup>
-        </m:sSup>
-      </m:oMath>
-      <w:r>
-        <w:t xml:space="preserve"> </w:t>
-      </w:r>
-      <w:r>
-        <w:t xml:space="preserve">per molecule, and an orientation</w:t>
-      </w:r>
-      <w:r>
-        <w:t xml:space="preserve"> </w:t>
-      </w:r>
-      <m:oMath>
-        <m:sSub>
-          <m:e>
-            <m:r>
-              <m:t>R</m:t>
-            </m:r>
-          </m:e>
-          <m:sub>
-            <m:r>
-              <m:t>m</m:t>
-            </m:r>
-          </m:sub>
-        </m:sSub>
-        <m:r>
-          <m:rPr>
-            <m:sty m:val="p"/>
-          </m:rPr>
-          <m:t>∈</m:t>
-        </m:r>
-        <m:r>
-          <m:rPr>
-            <m:sty m:val="p"/>
-          </m:rPr>
-          <m:t>S</m:t>
-        </m:r>
-        <m:r>
-          <m:rPr>
-            <m:sty m:val="p"/>
-          </m:rPr>
-          <m:t>O</m:t>
-        </m:r>
-        <m:r>
-          <m:rPr>
-            <m:sty m:val="p"/>
-          </m:rPr>
-          <m:t>(</m:t>
-        </m:r>
-        <m:r>
-          <m:t>3</m:t>
-        </m:r>
-        <m:r>
-          <m:rPr>
-            <m:sty m:val="p"/>
-          </m:rPr>
-          <m:t>)</m:t>
-        </m:r>
-      </m:oMath>
-      <w:r>
-        <w:t xml:space="preserve"> </w:t>
-      </w:r>
-      <w:r>
-        <w:t xml:space="preserve">acting on a shared body-frame conformer, with atoms reconstructed by</w:t>
-      </w:r>
-      <w:r>
-        <w:t xml:space="preserve"> </w:t>
-      </w:r>
-      <w:r>
-        <w:t xml:space="preserve">Eq. </w:t>
-      </w:r>
-      <w:hyperlink w:anchor="eq:factor">
-        <w:r>
-          <w:rPr>
-            <w:rStyle w:val="Hyperlink"/>
-          </w:rPr>
-          <w:t xml:space="preserve">[eq:factor]</w:t>
-        </w:r>
-      </w:hyperlink>
-      <w:r>
-        <w:t xml:space="preserve">. (b) The per-molecule orientation target factors as</w:t>
-      </w:r>
-      <w:r>
-        <w:t xml:space="preserve"> </w:t>
-      </w:r>
-      <m:oMath>
-        <m:sSub>
-          <m:e>
-            <m:r>
-              <m:t>R</m:t>
-            </m:r>
-          </m:e>
-          <m:sub>
-            <m:r>
-              <m:t>m</m:t>
-            </m:r>
-          </m:sub>
-        </m:sSub>
-        <m:r>
-          <m:rPr>
-            <m:sty m:val="p"/>
-          </m:rPr>
-          <m:t>=</m:t>
-        </m:r>
-        <m:r>
-          <m:rPr>
-            <m:sty m:val="p"/>
-          </m:rPr>
-          <m:t>r</m:t>
-        </m:r>
-        <m:r>
-          <m:rPr>
-            <m:sty m:val="p"/>
-          </m:rPr>
-          <m:t>o</m:t>
-        </m:r>
-        <m:r>
-          <m:rPr>
-            <m:sty m:val="p"/>
-          </m:rPr>
-          <m:t>t</m:t>
-        </m:r>
-        <m:r>
-          <m:rPr>
-            <m:sty m:val="p"/>
-          </m:rPr>
-          <m:t>(</m:t>
-        </m:r>
-        <m:sSub>
-          <m:e>
-            <m:r>
-              <m:t>g</m:t>
-            </m:r>
-          </m:e>
-          <m:sub>
-            <m:r>
-              <m:t>m</m:t>
-            </m:r>
-          </m:sub>
-        </m:sSub>
-        <m:r>
-          <m:rPr>
-            <m:sty m:val="p"/>
-          </m:rPr>
-          <m:t>)</m:t>
-        </m:r>
-        <m:r>
-          <m:rPr>
-            <m:sty m:val="p"/>
-          </m:rPr>
-          <m:t>⋅</m:t>
-        </m:r>
-        <m:sSub>
-          <m:e>
-            <m:r>
-              <m:t>R</m:t>
-            </m:r>
-          </m:e>
-          <m:sub>
-            <m:r>
-              <m:rPr>
-                <m:nor/>
-                <m:sty m:val="p"/>
-              </m:rPr>
-              <m:t>asym</m:t>
-            </m:r>
-          </m:sub>
-        </m:sSub>
-      </m:oMath>
-      <w:r>
-        <w:t xml:space="preserve"> </w:t>
-      </w:r>
-      <w:r>
-        <w:t xml:space="preserve">into a space-group-determined</w:t>
-      </w:r>
-      <w:r>
-        <w:t xml:space="preserve"> </w:t>
-      </w:r>
-      <w:r>
-        <w:t xml:space="preserve">relative rotation, which the flow learns, and the asymmetric unit’s free</w:t>
-      </w:r>
-      <w:r>
-        <w:t xml:space="preserve"> </w:t>
-      </w:r>
-      <w:r>
-        <w:t xml:space="preserve">orientation, which is gauge-arbitrary and not learnable from composition and</w:t>
-      </w:r>
-      <w:r>
-        <w:t xml:space="preserve"> </w:t>
-      </w:r>
-      <w:r>
-        <w:t xml:space="preserve">packing.</w:t>
-      </w:r>
-    </w:p>
-    <w:bookmarkEnd w:id="15"/>
-    <w:bookmarkEnd w:id="16"/>
-    <w:bookmarkStart w:id="18" w:name="X9bea20bf657ff1a02fc0d5b6264462ed84ab9f1"/>
+    <w:bookmarkEnd w:id="12"/>
+    <w:bookmarkStart w:id="14" w:name="X9bea20bf657ff1a02fc0d5b6264462ed84ab9f1"/>
     <w:p>
       <w:pPr>
         <w:pStyle w:val="Heading2"/>
@@ -3013,7 +2690,7 @@
         <w:t xml:space="preserve">single-atom benchmarks never exercise.</w:t>
       </w:r>
     </w:p>
-    <w:bookmarkStart w:id="17" w:name="tab:perhead"/>
+    <w:bookmarkStart w:id="13" w:name="tab:perhead"/>
     <w:p>
       <w:pPr>
         <w:pStyle w:val="TableCaption"/>
@@ -3368,9 +3045,9 @@
         </w:tc>
       </w:tr>
     </w:tbl>
-    <w:bookmarkEnd w:id="17"/>
-    <w:bookmarkEnd w:id="18"/>
-    <w:bookmarkStart w:id="19" w:name="Xf2eac6c9a09d7d9171098ef97426ad3131dbaae"/>
+    <w:bookmarkEnd w:id="13"/>
+    <w:bookmarkEnd w:id="14"/>
+    <w:bookmarkStart w:id="15" w:name="Xf2eac6c9a09d7d9171098ef97426ad3131dbaae"/>
     <w:p>
       <w:pPr>
         <w:pStyle w:val="Heading2"/>
@@ -3711,8 +3388,8 @@
         <w:t xml:space="preserve">accident.</w:t>
       </w:r>
     </w:p>
-    <w:bookmarkEnd w:id="19"/>
-    <w:bookmarkStart w:id="21" w:name="X9ceaeac927e6cf9f5b0f24e4caf21dc6fed5798"/>
+    <w:bookmarkEnd w:id="15"/>
+    <w:bookmarkStart w:id="17" w:name="X9ceaeac927e6cf9f5b0f24e4caf21dc6fed5798"/>
     <w:p>
       <w:pPr>
         <w:pStyle w:val="Heading2"/>
@@ -4977,7 +4654,7 @@
         <w:t xml:space="preserve">.</w:t>
       </w:r>
     </w:p>
-    <w:bookmarkStart w:id="20" w:name="tab:twobytwo"/>
+    <w:bookmarkStart w:id="16" w:name="tab:twobytwo"/>
     <w:p>
       <w:pPr>
         <w:pStyle w:val="TableCaption"/>
@@ -5359,9 +5036,9 @@
         </w:tc>
       </w:tr>
     </w:tbl>
-    <w:bookmarkEnd w:id="20"/>
-    <w:bookmarkEnd w:id="21"/>
-    <w:bookmarkStart w:id="23" w:name="Xb92a642a6d8ccac0c0043ad69dc3a973d316634"/>
+    <w:bookmarkEnd w:id="16"/>
+    <w:bookmarkEnd w:id="17"/>
+    <w:bookmarkStart w:id="19" w:name="Xb92a642a6d8ccac0c0043ad69dc3a973d316634"/>
     <w:p>
       <w:pPr>
         <w:pStyle w:val="Heading2"/>
@@ -5873,7 +5550,7 @@
           <w:rPr>
             <w:rStyle w:val="Hyperlink"/>
           </w:rPr>
-          <w:t xml:space="preserve">2</w:t>
+          <w:t xml:space="preserve">1</w:t>
         </w:r>
       </w:hyperlink>
       <w:r>
@@ -6028,7 +5705,7 @@
         <w:t xml:space="preserve">confirming the reconstruction survives the leakage control.</w:t>
       </w:r>
     </w:p>
-    <w:bookmarkStart w:id="22" w:name="tab:matchrate"/>
+    <w:bookmarkStart w:id="18" w:name="tab:matchrate"/>
     <w:p>
       <w:pPr>
         <w:pStyle w:val="TableCaption"/>
@@ -6454,9 +6131,9 @@
         </w:tc>
       </w:tr>
     </w:tbl>
-    <w:bookmarkEnd w:id="22"/>
-    <w:bookmarkEnd w:id="23"/>
-    <w:bookmarkStart w:id="29" w:name="X788f61e46781ba45615d6115726b84b54364e2f"/>
+    <w:bookmarkEnd w:id="18"/>
+    <w:bookmarkEnd w:id="19"/>
+    <w:bookmarkStart w:id="25" w:name="X788f61e46781ba45615d6115726b84b54364e2f"/>
     <w:p>
       <w:pPr>
         <w:pStyle w:val="Heading2"/>
@@ -6813,7 +6490,7 @@
           <w:rPr>
             <w:rStyle w:val="Hyperlink"/>
           </w:rPr>
-          <w:t xml:space="preserve">2</w:t>
+          <w:t xml:space="preserve">1</w:t>
         </w:r>
       </w:hyperlink>
       <w:r>
@@ -7000,7 +6677,7 @@
         <w:t xml:space="preserve">realizing that gain in a sampler is left to future work.</w:t>
       </w:r>
     </w:p>
-    <w:bookmarkStart w:id="24" w:name="tab:strengthen"/>
+    <w:bookmarkStart w:id="20" w:name="tab:strengthen"/>
     <w:p>
       <w:pPr>
         <w:pStyle w:val="TableCaption"/>
@@ -7375,8 +7052,8 @@
         </w:tc>
       </w:tr>
     </w:tbl>
-    <w:bookmarkEnd w:id="24"/>
-    <w:bookmarkStart w:id="28" w:name="fig:results"/>
+    <w:bookmarkEnd w:id="20"/>
+    <w:bookmarkStart w:id="24" w:name="fig:results"/>
     <w:p>
       <w:pPr>
         <w:pStyle w:val="CaptionedFigure"/>
@@ -7386,18 +7063,18 @@
           <wp:inline>
             <wp:extent cx="5334000" cy="2226030"/>
             <wp:effectExtent b="0" l="0" r="0" t="0"/>
-            <wp:docPr descr="" title="" id="26" name="Picture"/>
+            <wp:docPr descr="" title="" id="22" name="Picture"/>
             <a:graphic>
               <a:graphicData uri="http://schemas.openxmlformats.org/drawingml/2006/picture">
                 <pic:pic>
                   <pic:nvPicPr>
-                    <pic:cNvPr descr="figures/fig2_results.png" id="27" name="Picture"/>
+                    <pic:cNvPr descr="figures/fig2_results.png" id="23" name="Picture"/>
                     <pic:cNvPicPr>
                       <a:picLocks noChangeArrowheads="1" noChangeAspect="1"/>
                     </pic:cNvPicPr>
                   </pic:nvPicPr>
                   <pic:blipFill>
-                    <a:blip r:embed="rId25"/>
+                    <a:blip r:embed="rId21"/>
                     <a:stretch>
                       <a:fillRect/>
                     </a:stretch>
@@ -7618,9 +7295,9 @@
         <w:t xml:space="preserve">rather than representational.</w:t>
       </w:r>
     </w:p>
-    <w:bookmarkEnd w:id="28"/>
-    <w:bookmarkEnd w:id="29"/>
-    <w:bookmarkStart w:id="30" w:name="X92e08dda5a452b38fc400e8f4b5fff99a59848a"/>
+    <w:bookmarkEnd w:id="24"/>
+    <w:bookmarkEnd w:id="25"/>
+    <w:bookmarkStart w:id="26" w:name="X92e08dda5a452b38fc400e8f4b5fff99a59848a"/>
     <w:p>
       <w:pPr>
         <w:pStyle w:val="Heading2"/>
@@ -8336,8 +8013,8 @@
         <w:t xml:space="preserve">not a finished generator.</w:t>
       </w:r>
     </w:p>
-    <w:bookmarkEnd w:id="30"/>
-    <w:bookmarkStart w:id="31" w:name="X26082a8f309b6aa5a951d70201583dbbff0b5d2"/>
+    <w:bookmarkEnd w:id="26"/>
+    <w:bookmarkStart w:id="27" w:name="X26082a8f309b6aa5a951d70201583dbbff0b5d2"/>
     <w:p>
       <w:pPr>
         <w:pStyle w:val="Heading2"/>
@@ -8402,9 +8079,9 @@
         <w:t xml:space="preserve">confirm the flow and sampler are sound and are not the focus of this study.</w:t>
       </w:r>
     </w:p>
-    <w:bookmarkEnd w:id="31"/>
-    <w:bookmarkEnd w:id="32"/>
-    <w:bookmarkStart w:id="33" w:name="discussion"/>
+    <w:bookmarkEnd w:id="27"/>
+    <w:bookmarkEnd w:id="28"/>
+    <w:bookmarkStart w:id="29" w:name="discussion"/>
     <w:p>
       <w:pPr>
         <w:pStyle w:val="Heading1"/>
@@ -9015,8 +8692,8 @@
         <w:t xml:space="preserve">assignment is available, as it is in template-based generation.</w:t>
       </w:r>
     </w:p>
-    <w:bookmarkEnd w:id="33"/>
-    <w:bookmarkStart w:id="43" w:name="methods"/>
+    <w:bookmarkEnd w:id="29"/>
+    <w:bookmarkStart w:id="39" w:name="methods"/>
     <w:p>
       <w:pPr>
         <w:pStyle w:val="Heading1"/>
@@ -9025,7 +8702,7 @@
         <w:t xml:space="preserve">Methods</w:t>
       </w:r>
     </w:p>
-    <w:bookmarkStart w:id="34" w:name="X97197145db4945f5faf6e0d2b94973879e212de"/>
+    <w:bookmarkStart w:id="30" w:name="X97197145db4945f5faf6e0d2b94973879e212de"/>
     <w:p>
       <w:pPr>
         <w:pStyle w:val="Heading2"/>
@@ -9160,8 +8837,8 @@
         <w:t xml:space="preserve">canonical frame.</w:t>
       </w:r>
     </w:p>
-    <w:bookmarkEnd w:id="34"/>
-    <w:bookmarkStart w:id="35" w:name="manifolds-and-flow-matching"/>
+    <w:bookmarkEnd w:id="30"/>
+    <w:bookmarkStart w:id="31" w:name="manifolds-and-flow-matching"/>
     <w:p>
       <w:pPr>
         <w:pStyle w:val="Heading2"/>
@@ -9551,8 +9228,8 @@
         <w:t xml:space="preserve">molecules.</w:t>
       </w:r>
     </w:p>
-    <w:bookmarkEnd w:id="35"/>
-    <w:bookmarkStart w:id="36" w:name="X5cba2d19fb6093dd286d99037f362ce7a67b02f"/>
+    <w:bookmarkEnd w:id="31"/>
+    <w:bookmarkStart w:id="32" w:name="X5cba2d19fb6093dd286d99037f362ce7a67b02f"/>
     <w:p>
       <w:pPr>
         <w:pStyle w:val="Heading2"/>
@@ -9680,8 +9357,8 @@
         <w:t xml:space="preserve">number is read from that run.</w:t>
       </w:r>
     </w:p>
-    <w:bookmarkEnd w:id="36"/>
-    <w:bookmarkStart w:id="37" w:name="network"/>
+    <w:bookmarkEnd w:id="32"/>
+    <w:bookmarkStart w:id="33" w:name="network"/>
     <w:p>
       <w:pPr>
         <w:pStyle w:val="Heading2"/>
@@ -9781,8 +9458,8 @@
         <w:t xml:space="preserve">when enabled.</w:t>
       </w:r>
     </w:p>
-    <w:bookmarkEnd w:id="37"/>
-    <w:bookmarkStart w:id="38" w:name="relative-gauge-and-coset-codebook"/>
+    <w:bookmarkEnd w:id="33"/>
+    <w:bookmarkStart w:id="34" w:name="relative-gauge-and-coset-codebook"/>
     <w:p>
       <w:pPr>
         <w:pStyle w:val="Heading2"/>
@@ -9938,8 +9615,8 @@
         <w:t xml:space="preserve">which become the per-molecule coset labels.</w:t>
       </w:r>
     </w:p>
-    <w:bookmarkEnd w:id="38"/>
-    <w:bookmarkStart w:id="39" w:name="training"/>
+    <w:bookmarkEnd w:id="34"/>
+    <w:bookmarkStart w:id="35" w:name="training"/>
     <w:p>
       <w:pPr>
         <w:pStyle w:val="Heading2"/>
@@ -10195,8 +9872,8 @@
         <w:t xml:space="preserve">the run reported here skipped a single step.</w:t>
       </w:r>
     </w:p>
-    <w:bookmarkEnd w:id="39"/>
-    <w:bookmarkStart w:id="40" w:name="Xf804d9ec23f9816c375c9bf696810bbfe4b176b"/>
+    <w:bookmarkEnd w:id="35"/>
+    <w:bookmarkStart w:id="36" w:name="Xf804d9ec23f9816c375c9bf696810bbfe4b176b"/>
     <w:p>
       <w:pPr>
         <w:pStyle w:val="Heading2"/>
@@ -10303,8 +9980,8 @@
         <w:t xml:space="preserve">its random-prior floor and the trained field.</w:t>
       </w:r>
     </w:p>
-    <w:bookmarkEnd w:id="40"/>
-    <w:bookmarkStart w:id="41" w:name="orientation-isolated-match-metric"/>
+    <w:bookmarkEnd w:id="36"/>
+    <w:bookmarkStart w:id="37" w:name="orientation-isolated-match-metric"/>
     <w:p>
       <w:pPr>
         <w:pStyle w:val="Heading2"/>
@@ -10556,8 +10233,8 @@
         <w:t xml:space="preserve">.</w:t>
       </w:r>
     </w:p>
-    <w:bookmarkEnd w:id="41"/>
-    <w:bookmarkStart w:id="42" w:name="data"/>
+    <w:bookmarkEnd w:id="37"/>
+    <w:bookmarkStart w:id="38" w:name="data"/>
     <w:p>
       <w:pPr>
         <w:pStyle w:val="Heading2"/>
@@ -10787,9 +10464,9 @@
         <w:t xml:space="preserve">the dataset from a licensed CSD installation.</w:t>
       </w:r>
     </w:p>
-    <w:bookmarkEnd w:id="42"/>
-    <w:bookmarkEnd w:id="43"/>
-    <w:bookmarkStart w:id="44" w:name="data-availability"/>
+    <w:bookmarkEnd w:id="38"/>
+    <w:bookmarkEnd w:id="39"/>
+    <w:bookmarkStart w:id="40" w:name="data-availability"/>
     <w:p>
       <w:pPr>
         <w:pStyle w:val="Heading1"/>
@@ -10830,8 +10507,8 @@
         <w:t xml:space="preserve">CSD installation.</w:t>
       </w:r>
     </w:p>
-    <w:bookmarkEnd w:id="44"/>
-    <w:bookmarkStart w:id="47" w:name="code-availability"/>
+    <w:bookmarkEnd w:id="40"/>
+    <w:bookmarkStart w:id="43" w:name="code-availability"/>
     <w:p>
       <w:pPr>
         <w:pStyle w:val="Heading1"/>
@@ -10856,7 +10533,7 @@
       <w:r>
         <w:t xml:space="preserve"> </w:t>
       </w:r>
-      <w:hyperlink r:id="rId45">
+      <w:hyperlink r:id="rId41">
         <w:r>
           <w:rPr>
             <w:rStyle w:val="Hyperlink"/>
@@ -10873,7 +10550,7 @@
       <w:r>
         <w:t xml:space="preserve"> </w:t>
       </w:r>
-      <w:hyperlink r:id="rId46">
+      <w:hyperlink r:id="rId42">
         <w:r>
           <w:rPr>
             <w:rStyle w:val="Hyperlink"/>
@@ -10885,8 +10562,8 @@
         <w:t xml:space="preserve">.</w:t>
       </w:r>
     </w:p>
-    <w:bookmarkEnd w:id="47"/>
-    <w:bookmarkStart w:id="48" w:name="author-contributions"/>
+    <w:bookmarkEnd w:id="43"/>
+    <w:bookmarkStart w:id="44" w:name="author-contributions"/>
     <w:p>
       <w:pPr>
         <w:pStyle w:val="Heading1"/>
@@ -10909,8 +10586,8 @@
         <w:t xml:space="preserve">analysis, and wrote the manuscript.</w:t>
       </w:r>
     </w:p>
-    <w:bookmarkEnd w:id="48"/>
-    <w:bookmarkStart w:id="49" w:name="competing-interests"/>
+    <w:bookmarkEnd w:id="44"/>
+    <w:bookmarkStart w:id="45" w:name="competing-interests"/>
     <w:p>
       <w:pPr>
         <w:pStyle w:val="Heading1"/>
@@ -10927,8 +10604,8 @@
         <w:t xml:space="preserve">The author declares no competing interests.</w:t>
       </w:r>
     </w:p>
-    <w:bookmarkEnd w:id="49"/>
-    <w:bookmarkStart w:id="50" w:name="funding"/>
+    <w:bookmarkEnd w:id="45"/>
+    <w:bookmarkStart w:id="46" w:name="funding"/>
     <w:p>
       <w:pPr>
         <w:pStyle w:val="Heading1"/>
@@ -10951,8 +10628,8 @@
         <w:t xml:space="preserve">for model training was funded personally by the author.</w:t>
       </w:r>
     </w:p>
-    <w:bookmarkEnd w:id="50"/>
-    <w:bookmarkStart w:id="79" w:name="use-of-ai-tools"/>
+    <w:bookmarkEnd w:id="46"/>
+    <w:bookmarkStart w:id="75" w:name="use-of-ai-tools"/>
     <w:p>
       <w:pPr>
         <w:pStyle w:val="Heading1"/>
@@ -10987,8 +10664,8 @@
         <w:t xml:space="preserve">content.</w:t>
       </w:r>
     </w:p>
-    <w:bookmarkStart w:id="78" w:name="refs"/>
-    <w:bookmarkStart w:id="51" w:name="ref-xie2022cdvae"/>
+    <w:bookmarkStart w:id="74" w:name="refs"/>
+    <w:bookmarkStart w:id="47" w:name="ref-xie2022cdvae"/>
     <w:p>
       <w:pPr>
         <w:pStyle w:val="Bibliography"/>
@@ -11019,8 +10696,8 @@
         <w:t xml:space="preserve">, 2022.</w:t>
       </w:r>
     </w:p>
-    <w:bookmarkEnd w:id="51"/>
-    <w:bookmarkStart w:id="52" w:name="ref-jiao2023diffcsp"/>
+    <w:bookmarkEnd w:id="47"/>
+    <w:bookmarkStart w:id="48" w:name="ref-jiao2023diffcsp"/>
     <w:p>
       <w:pPr>
         <w:pStyle w:val="Bibliography"/>
@@ -11051,8 +10728,8 @@
         <w:t xml:space="preserve">, 2023.</w:t>
       </w:r>
     </w:p>
-    <w:bookmarkEnd w:id="52"/>
-    <w:bookmarkStart w:id="53" w:name="ref-miller2024flowmm"/>
+    <w:bookmarkEnd w:id="48"/>
+    <w:bookmarkStart w:id="49" w:name="ref-miller2024flowmm"/>
     <w:p>
       <w:pPr>
         <w:pStyle w:val="Bibliography"/>
@@ -11083,8 +10760,8 @@
         <w:t xml:space="preserve">, 2024.</w:t>
       </w:r>
     </w:p>
-    <w:bookmarkEnd w:id="53"/>
-    <w:bookmarkStart w:id="54" w:name="ref-lipman2023flowmatching"/>
+    <w:bookmarkEnd w:id="49"/>
+    <w:bookmarkStart w:id="50" w:name="ref-lipman2023flowmatching"/>
     <w:p>
       <w:pPr>
         <w:pStyle w:val="Bibliography"/>
@@ -11115,8 +10792,8 @@
         <w:t xml:space="preserve">, 2023.</w:t>
       </w:r>
     </w:p>
-    <w:bookmarkEnd w:id="54"/>
-    <w:bookmarkStart w:id="55" w:name="ref-chen2024riemannian"/>
+    <w:bookmarkEnd w:id="50"/>
+    <w:bookmarkStart w:id="51" w:name="ref-chen2024riemannian"/>
     <w:p>
       <w:pPr>
         <w:pStyle w:val="Bibliography"/>
@@ -11147,8 +10824,8 @@
         <w:t xml:space="preserve">, 2024.</w:t>
       </w:r>
     </w:p>
-    <w:bookmarkEnd w:id="55"/>
-    <w:bookmarkStart w:id="56" w:name="ref-yim2023se3diffusion"/>
+    <w:bookmarkEnd w:id="51"/>
+    <w:bookmarkStart w:id="52" w:name="ref-yim2023se3diffusion"/>
     <w:p>
       <w:pPr>
         <w:pStyle w:val="Bibliography"/>
@@ -11179,8 +10856,8 @@
         <w:t xml:space="preserve">, 2023.</w:t>
       </w:r>
     </w:p>
-    <w:bookmarkEnd w:id="56"/>
-    <w:bookmarkStart w:id="57" w:name="ref-yim2023frameflow"/>
+    <w:bookmarkEnd w:id="52"/>
+    <w:bookmarkStart w:id="53" w:name="ref-yim2023frameflow"/>
     <w:p>
       <w:pPr>
         <w:pStyle w:val="Bibliography"/>
@@ -11211,8 +10888,8 @@
         <w:t xml:space="preserve">.</w:t>
       </w:r>
     </w:p>
-    <w:bookmarkEnd w:id="57"/>
-    <w:bookmarkStart w:id="59" w:name="ref-price2023blindtest7"/>
+    <w:bookmarkEnd w:id="53"/>
+    <w:bookmarkStart w:id="55" w:name="ref-price2023blindtest7"/>
     <w:p>
       <w:pPr>
         <w:pStyle w:val="Bibliography"/>
@@ -11245,7 +10922,7 @@
       <w:r>
         <w:t xml:space="preserve">, DOI:</w:t>
       </w:r>
-      <w:hyperlink r:id="rId58">
+      <w:hyperlink r:id="rId54">
         <w:r>
           <w:rPr>
             <w:rStyle w:val="Hyperlink"/>
@@ -11257,8 +10934,8 @@
         <w:t xml:space="preserve">.</w:t>
       </w:r>
     </w:p>
-    <w:bookmarkEnd w:id="59"/>
-    <w:bookmarkStart w:id="61" w:name="ref-obrien2021dataefficient"/>
+    <w:bookmarkEnd w:id="55"/>
+    <w:bookmarkStart w:id="57" w:name="ref-obrien2021dataefficient"/>
     <w:p>
       <w:pPr>
         <w:pStyle w:val="Bibliography"/>
@@ -11272,7 +10949,7 @@
       <w:r>
         <w:t xml:space="preserve">	</w:t>
       </w:r>
-      <w:hyperlink r:id="rId60">
+      <w:hyperlink r:id="rId56">
         <w:r>
           <w:rPr>
             <w:rStyle w:val="Hyperlink"/>
@@ -11324,8 +11001,8 @@
         <w:t xml:space="preserve">.</w:t>
       </w:r>
     </w:p>
-    <w:bookmarkEnd w:id="61"/>
-    <w:bookmarkStart w:id="62" w:name="ref-jin2025oxtal"/>
+    <w:bookmarkEnd w:id="57"/>
+    <w:bookmarkStart w:id="58" w:name="ref-jin2025oxtal"/>
     <w:p>
       <w:pPr>
         <w:pStyle w:val="Bibliography"/>
@@ -11359,8 +11036,8 @@
         <w:t xml:space="preserve">.</w:t>
       </w:r>
     </w:p>
-    <w:bookmarkEnd w:id="62"/>
-    <w:bookmarkStart w:id="63" w:name="ref-subramanian2026packflow"/>
+    <w:bookmarkEnd w:id="58"/>
+    <w:bookmarkStart w:id="59" w:name="ref-subramanian2026packflow"/>
     <w:p>
       <w:pPr>
         <w:pStyle w:val="Bibliography"/>
@@ -11391,8 +11068,8 @@
         <w:t xml:space="preserve">.</w:t>
       </w:r>
     </w:p>
-    <w:bookmarkEnd w:id="63"/>
-    <w:bookmarkStart w:id="64" w:name="ref-kim2025mofflow"/>
+    <w:bookmarkEnd w:id="59"/>
+    <w:bookmarkStart w:id="60" w:name="ref-kim2025mofflow"/>
     <w:p>
       <w:pPr>
         <w:pStyle w:val="Bibliography"/>
@@ -11423,8 +11100,8 @@
         <w:t xml:space="preserve">, 2025.</w:t>
       </w:r>
     </w:p>
-    <w:bookmarkEnd w:id="64"/>
-    <w:bookmarkStart w:id="65" w:name="ref-leach2022so3"/>
+    <w:bookmarkEnd w:id="60"/>
+    <w:bookmarkStart w:id="61" w:name="ref-leach2022so3"/>
     <w:p>
       <w:pPr>
         <w:pStyle w:val="Bibliography"/>
@@ -11455,8 +11132,8 @@
         <w:t xml:space="preserve">, 2022.</w:t>
       </w:r>
     </w:p>
-    <w:bookmarkEnd w:id="65"/>
-    <w:bookmarkStart w:id="67" w:name="ref-groom2016csd"/>
+    <w:bookmarkEnd w:id="61"/>
+    <w:bookmarkStart w:id="63" w:name="ref-groom2016csd"/>
     <w:p>
       <w:pPr>
         <w:pStyle w:val="Bibliography"/>
@@ -11470,7 +11147,7 @@
       <w:r>
         <w:t xml:space="preserve">	</w:t>
       </w:r>
-      <w:hyperlink r:id="rId66">
+      <w:hyperlink r:id="rId62">
         <w:r>
           <w:rPr>
             <w:rStyle w:val="Hyperlink"/>
@@ -11522,8 +11199,8 @@
         <w:t xml:space="preserve">.</w:t>
       </w:r>
     </w:p>
-    <w:bookmarkEnd w:id="67"/>
-    <w:bookmarkStart w:id="68" w:name="ref-satorras2021egnn"/>
+    <w:bookmarkEnd w:id="63"/>
+    <w:bookmarkStart w:id="64" w:name="ref-satorras2021egnn"/>
     <w:p>
       <w:pPr>
         <w:pStyle w:val="Bibliography"/>
@@ -11554,8 +11231,8 @@
         <w:t xml:space="preserve">, 2021.</w:t>
       </w:r>
     </w:p>
-    <w:bookmarkEnd w:id="68"/>
-    <w:bookmarkStart w:id="70" w:name="ref-ong2013pymatgen"/>
+    <w:bookmarkEnd w:id="64"/>
+    <w:bookmarkStart w:id="66" w:name="ref-ong2013pymatgen"/>
     <w:p>
       <w:pPr>
         <w:pStyle w:val="Bibliography"/>
@@ -11569,7 +11246,7 @@
       <w:r>
         <w:t xml:space="preserve">	</w:t>
       </w:r>
-      <w:hyperlink r:id="rId69">
+      <w:hyperlink r:id="rId65">
         <w:r>
           <w:rPr>
             <w:rStyle w:val="Hyperlink"/>
@@ -11621,8 +11298,8 @@
         <w:t xml:space="preserve">.</w:t>
       </w:r>
     </w:p>
-    <w:bookmarkEnd w:id="70"/>
-    <w:bookmarkStart w:id="71" w:name="ref-martirossyan2025matching"/>
+    <w:bookmarkEnd w:id="66"/>
+    <w:bookmarkStart w:id="67" w:name="ref-martirossyan2025matching"/>
     <w:p>
       <w:pPr>
         <w:pStyle w:val="Bibliography"/>
@@ -11653,8 +11330,8 @@
         <w:t xml:space="preserve">.</w:t>
       </w:r>
     </w:p>
-    <w:bookmarkEnd w:id="71"/>
-    <w:bookmarkStart w:id="72" w:name="ref-jiao2024diffcsppp"/>
+    <w:bookmarkEnd w:id="67"/>
+    <w:bookmarkStart w:id="68" w:name="ref-jiao2024diffcsppp"/>
     <w:p>
       <w:pPr>
         <w:pStyle w:val="Bibliography"/>
@@ -11685,8 +11362,8 @@
         <w:t xml:space="preserve">, 2024.</w:t>
       </w:r>
     </w:p>
-    <w:bookmarkEnd w:id="72"/>
-    <w:bookmarkStart w:id="73" w:name="ref-wyckoffdiff2025"/>
+    <w:bookmarkEnd w:id="68"/>
+    <w:bookmarkStart w:id="69" w:name="ref-wyckoffdiff2025"/>
     <w:p>
       <w:pPr>
         <w:pStyle w:val="Bibliography"/>
@@ -11717,8 +11394,8 @@
         <w:t xml:space="preserve">.</w:t>
       </w:r>
     </w:p>
-    <w:bookmarkEnd w:id="73"/>
-    <w:bookmarkStart w:id="74" w:name="ref-symmcd2025"/>
+    <w:bookmarkEnd w:id="69"/>
+    <w:bookmarkStart w:id="70" w:name="ref-symmcd2025"/>
     <w:p>
       <w:pPr>
         <w:pStyle w:val="Bibliography"/>
@@ -11749,8 +11426,8 @@
         <w:t xml:space="preserve">.</w:t>
       </w:r>
     </w:p>
-    <w:bookmarkEnd w:id="74"/>
-    <w:bookmarkStart w:id="76" w:name="ref-deng2023chgnet"/>
+    <w:bookmarkEnd w:id="70"/>
+    <w:bookmarkStart w:id="72" w:name="ref-deng2023chgnet"/>
     <w:p>
       <w:pPr>
         <w:pStyle w:val="Bibliography"/>
@@ -11764,7 +11441,7 @@
       <w:r>
         <w:t xml:space="preserve">	</w:t>
       </w:r>
-      <w:hyperlink r:id="rId75">
+      <w:hyperlink r:id="rId71">
         <w:r>
           <w:rPr>
             <w:rStyle w:val="Hyperlink"/>
@@ -11816,8 +11493,8 @@
         <w:t xml:space="preserve">.</w:t>
       </w:r>
     </w:p>
-    <w:bookmarkEnd w:id="76"/>
-    <w:bookmarkStart w:id="77" w:name="ref-pooladian2023multisample"/>
+    <w:bookmarkEnd w:id="72"/>
+    <w:bookmarkStart w:id="73" w:name="ref-pooladian2023multisample"/>
     <w:p>
       <w:pPr>
         <w:pStyle w:val="Bibliography"/>
@@ -11848,9 +11525,9 @@
         <w:t xml:space="preserve">, 2023.</w:t>
       </w:r>
     </w:p>
-    <w:bookmarkEnd w:id="77"/>
-    <w:bookmarkEnd w:id="78"/>
-    <w:bookmarkEnd w:id="79"/>
+    <w:bookmarkEnd w:id="73"/>
+    <w:bookmarkEnd w:id="74"/>
+    <w:bookmarkEnd w:id="75"/>
     <w:sectPr>
       <w:footnotePr>
         <w:numRestart w:val="eachSect"/>

</xml_diff>

<commit_message>
paper: fix author ORCID/email to canonical (0009-0003-0041-1459, gmail); add Digital Discovery cover letter; rebuild manuscript DOCX
</commit_message>
<xml_diff>
--- a/paper/symmc-flow_manuscript.docx
+++ b/paper/symmc-flow_manuscript.docx
@@ -11575,7 +11575,7 @@
         <w:rPr>
           <w:rStyle w:val="VerbatimChar"/>
         </w:rPr>
-        <w:t xml:space="preserve">cai495@purdue.edu</w:t>
+        <w:t xml:space="preserve">frankyc11223@gmail.com</w:t>
       </w:r>
       <w:r>
         <w:t xml:space="preserve">;</w:t>
@@ -11594,7 +11594,7 @@
           <w:rPr>
             <w:rStyle w:val="Hyperlink"/>
           </w:rPr>
-          <w:t xml:space="preserve">0009-0004-7283-1915</w:t>
+          <w:t xml:space="preserve">0009-0003-0041-1459</w:t>
         </w:r>
       </w:hyperlink>
     </w:p>

</xml_diff>

<commit_message>
paper: rename Competing interests -> Conflicts of interest (RSC required heading); rebuild DOCX
</commit_message>
<xml_diff>
--- a/paper/symmc-flow_manuscript.docx
+++ b/paper/symmc-flow_manuscript.docx
@@ -749,12 +749,6 @@
         <w:t xml:space="preserve">diffusion variational autoencoder</w:t>
       </w:r>
       <w:r>
-        <w:rPr>
-          <w:vertAlign w:val="superscript"/>
-        </w:rPr>
-        <w:t xml:space="preserve">1</w:t>
-      </w:r>
-      <w:r>
         <w:t xml:space="preserve"> </w:t>
       </w:r>
       <w:r>
@@ -767,12 +761,6 @@
         <w:t xml:space="preserve">diffusion over lattices and fractional coordinates</w:t>
       </w:r>
       <w:r>
-        <w:rPr>
-          <w:vertAlign w:val="superscript"/>
-        </w:rPr>
-        <w:t xml:space="preserve">2</w:t>
-      </w:r>
-      <w:r>
         <w:t xml:space="preserve"> </w:t>
       </w:r>
       <w:r>
@@ -783,12 +771,6 @@
       </w:r>
       <w:r>
         <w:t xml:space="preserve">Riemannian flow matching for materials</w:t>
-      </w:r>
-      <w:r>
-        <w:rPr>
-          <w:vertAlign w:val="superscript"/>
-        </w:rPr>
-        <w:t xml:space="preserve">3</w:t>
       </w:r>
       <w:r>
         <w:t xml:space="preserve"> </w:t>
@@ -847,12 +829,6 @@
         <w:t xml:space="preserve">steps</w:t>
       </w:r>
       <w:r>
-        <w:rPr>
-          <w:vertAlign w:val="superscript"/>
-        </w:rPr>
-        <w:t xml:space="preserve">4,5</w:t>
-      </w:r>
-      <w:r>
         <w:t xml:space="preserve">. The same advantage drove</w:t>
       </w:r>
       <w:r>
@@ -948,12 +924,6 @@
       </w:r>
       <w:r>
         <w:t xml:space="preserve">better quality</w:t>
-      </w:r>
-      <w:r>
-        <w:rPr>
-          <w:vertAlign w:val="superscript"/>
-        </w:rPr>
-        <w:t xml:space="preserve">6,7</w:t>
       </w:r>
       <w:r>
         <w:t xml:space="preserve">. A factorized,</w:t>
@@ -1009,12 +979,6 @@
         <w:t xml:space="preserve">bottleneck in community blind tests</w:t>
       </w:r>
       <w:r>
-        <w:rPr>
-          <w:vertAlign w:val="superscript"/>
-        </w:rPr>
-        <w:t xml:space="preserve">8</w:t>
-      </w:r>
-      <w:r>
         <w:t xml:space="preserve"> </w:t>
       </w:r>
       <w:r>
@@ -1027,12 +991,6 @@
         <w:t xml:space="preserve">data-efficient learned models</w:t>
       </w:r>
       <w:r>
-        <w:rPr>
-          <w:vertAlign w:val="superscript"/>
-        </w:rPr>
-        <w:t xml:space="preserve">9</w:t>
-      </w:r>
-      <w:r>
         <w:t xml:space="preserve">. Two design choices</w:t>
       </w:r>
       <w:r>
@@ -1048,12 +1006,6 @@
         <w:t xml:space="preserve">generators predict every atomic coordinate jointly: OXtal</w:t>
       </w:r>
       <w:r>
-        <w:rPr>
-          <w:vertAlign w:val="superscript"/>
-        </w:rPr>
-        <w:t xml:space="preserve">10</w:t>
-      </w:r>
-      <w:r>
         <w:t xml:space="preserve"> </w:t>
       </w:r>
       <w:r>
@@ -1066,12 +1018,6 @@
         <w:t xml:space="preserve">lattice-free diffusion model, and PackFlow</w:t>
       </w:r>
       <w:r>
-        <w:rPr>
-          <w:vertAlign w:val="superscript"/>
-        </w:rPr>
-        <w:t xml:space="preserve">11</w:t>
-      </w:r>
-      <w:r>
         <w:t xml:space="preserve"> </w:t>
       </w:r>
       <w:r>
@@ -1096,12 +1042,6 @@
         <w:t xml:space="preserve">rigid and predict only their pose. MOFFlow</w:t>
       </w:r>
       <w:r>
-        <w:rPr>
-          <w:vertAlign w:val="superscript"/>
-        </w:rPr>
-        <w:t xml:space="preserve">12</w:t>
-      </w:r>
-      <w:r>
         <w:t xml:space="preserve"> </w:t>
       </w:r>
       <w:r>
@@ -1170,12 +1110,6 @@
         <w:t xml:space="preserve">group</w:t>
       </w:r>
       <w:r>
-        <w:rPr>
-          <w:vertAlign w:val="superscript"/>
-        </w:rPr>
-        <w:t xml:space="preserve">13</w:t>
-      </w:r>
-      <w:r>
         <w:t xml:space="preserve"> </w:t>
       </w:r>
       <w:r>
@@ -1186,12 +1120,6 @@
       </w:r>
       <w:r>
         <w:t xml:space="preserve">backbones</w:t>
-      </w:r>
-      <w:r>
-        <w:rPr>
-          <w:vertAlign w:val="superscript"/>
-        </w:rPr>
-        <w:t xml:space="preserve">6,7</w:t>
       </w:r>
       <w:r>
         <w:t xml:space="preserve">.</w:t>
@@ -1223,12 +1151,6 @@
         <w:t xml:space="preserve">characteristic of flow matching</w:t>
       </w:r>
       <w:r>
-        <w:rPr>
-          <w:vertAlign w:val="superscript"/>
-        </w:rPr>
-        <w:t xml:space="preserve">4,5</w:t>
-      </w:r>
-      <w:r>
         <w:t xml:space="preserve">.</w:t>
       </w:r>
       <w:r>
@@ -1383,12 +1305,6 @@
         <w:t xml:space="preserve">variable</w:t>
       </w:r>
       <w:r>
-        <w:rPr>
-          <w:vertAlign w:val="superscript"/>
-        </w:rPr>
-        <w:t xml:space="preserve">8,9</w:t>
-      </w:r>
-      <w:r>
         <w:t xml:space="preserve">. The decomposition</w:t>
       </w:r>
       <w:r>
@@ -1551,12 +1467,6 @@
       </w:r>
       <w:r>
         <w:t xml:space="preserve">Database (CSD)</w:t>
-      </w:r>
-      <w:r>
-        <w:rPr>
-          <w:vertAlign w:val="superscript"/>
-        </w:rPr>
-        <w:t xml:space="preserve">14</w:t>
       </w:r>
       <w:r>
         <w:t xml:space="preserve">. The lattice and centroid flows learn; the</w:t>
@@ -2210,12 +2120,6 @@
         <w:t xml:space="preserve">pose. A conditional flow-matching objective</w:t>
       </w:r>
       <w:r>
-        <w:rPr>
-          <w:vertAlign w:val="superscript"/>
-        </w:rPr>
-        <w:t xml:space="preserve">4</w:t>
-      </w:r>
-      <w:r>
         <w:t xml:space="preserve"> </w:t>
       </w:r>
       <w:r>
@@ -2317,12 +2221,6 @@
       </w:r>
       <w:r>
         <w:t xml:space="preserve">encoder</w:t>
-      </w:r>
-      <w:r>
-        <w:rPr>
-          <w:vertAlign w:val="superscript"/>
-        </w:rPr>
-        <w:t xml:space="preserve">15</w:t>
       </w:r>
       <w:r>
         <w:t xml:space="preserve"> </w:t>
@@ -5117,12 +5015,6 @@
         <w:t xml:space="preserve">pymatgen’s StructureMatcher</w:t>
       </w:r>
       <w:r>
-        <w:rPr>
-          <w:vertAlign w:val="superscript"/>
-        </w:rPr>
-        <w:t xml:space="preserve">16</w:t>
-      </w:r>
-      <w:r>
         <w:t xml:space="preserve">. The symmetry-induced relative</w:t>
       </w:r>
       <w:r>
@@ -5226,12 +5118,6 @@
         <w:t xml:space="preserve">rotations and inversions</w:t>
       </w:r>
       <w:r>
-        <w:rPr>
-          <w:vertAlign w:val="superscript"/>
-        </w:rPr>
-        <w:t xml:space="preserve">14</w:t>
-      </w:r>
-      <w:r>
         <w:t xml:space="preserve">, so a single deterministic</w:t>
       </w:r>
       <w:r>
@@ -5280,12 +5166,6 @@
       </w:r>
       <w:r>
         <w:t xml:space="preserve">metrics</w:t>
-      </w:r>
-      <w:r>
-        <w:rPr>
-          <w:vertAlign w:val="superscript"/>
-        </w:rPr>
-        <w:t xml:space="preserve">17</w:t>
       </w:r>
       <w:r>
         <w:t xml:space="preserve">.</w:t>
@@ -6344,12 +6224,6 @@
         <w:t xml:space="preserve">generation</w:t>
       </w:r>
       <w:r>
-        <w:rPr>
-          <w:vertAlign w:val="superscript"/>
-        </w:rPr>
-        <w:t xml:space="preserve">18–20</w:t>
-      </w:r>
-      <w:r>
         <w:t xml:space="preserve">, rather than the</w:t>
       </w:r>
       <w:r>
@@ -6660,12 +6534,6 @@
       </w:r>
       <w:r>
         <w:t xml:space="preserve">template-based generators already provide</w:t>
-      </w:r>
-      <w:r>
-        <w:rPr>
-          <w:vertAlign w:val="superscript"/>
-        </w:rPr>
-        <w:t xml:space="preserve">18–20</w:t>
       </w:r>
       <w:r>
         <w:t xml:space="preserve">;</w:t>
@@ -7061,14 +6929,14 @@
       <w:r>
         <w:drawing>
           <wp:inline>
-            <wp:extent cx="5334000" cy="2226030"/>
+            <wp:extent cx="5334000" cy="2227855"/>
             <wp:effectExtent b="0" l="0" r="0" t="0"/>
             <wp:docPr descr="" title="" id="22" name="Picture"/>
             <a:graphic>
               <a:graphicData uri="http://schemas.openxmlformats.org/drawingml/2006/picture">
                 <pic:pic>
                   <pic:nvPicPr>
-                    <pic:cNvPr descr="figures/fig2_results.png" id="23" name="Picture"/>
+                    <pic:cNvPr descr="figures/fig2_results.pdf" id="23" name="Picture"/>
                     <pic:cNvPicPr>
                       <a:picLocks noChangeArrowheads="1" noChangeAspect="1"/>
                     </pic:cNvPicPr>
@@ -7082,7 +6950,7 @@
                   <pic:spPr bwMode="auto">
                     <a:xfrm>
                       <a:off x="0" y="0"/>
-                      <a:ext cx="5334000" cy="2226030"/>
+                      <a:ext cx="5334000" cy="2227855"/>
                     </a:xfrm>
                     <a:prstGeom prst="rect">
                       <a:avLst/>
@@ -7744,12 +7612,6 @@
         <w:t xml:space="preserve">generators</w:t>
       </w:r>
       <w:r>
-        <w:rPr>
-          <w:vertAlign w:val="superscript"/>
-        </w:rPr>
-        <w:t xml:space="preserve">10,11</w:t>
-      </w:r>
-      <w:r>
         <w:t xml:space="preserve">. Despite its lattice and</w:t>
       </w:r>
       <w:r>
@@ -7918,12 +7780,6 @@
       </w:r>
       <w:r>
         <w:t xml:space="preserve">all-atom generators</w:t>
-      </w:r>
-      <w:r>
-        <w:rPr>
-          <w:vertAlign w:val="superscript"/>
-        </w:rPr>
-        <w:t xml:space="preserve">10,11</w:t>
       </w:r>
       <w:r>
         <w:t xml:space="preserve">, which are trained</w:t>
@@ -8047,12 +7903,6 @@
       </w:r>
       <w:r>
         <w:t xml:space="preserve">diffusion</w:t>
-      </w:r>
-      <w:r>
-        <w:rPr>
-          <w:vertAlign w:val="superscript"/>
-        </w:rPr>
-        <w:t xml:space="preserve">2</w:t>
       </w:r>
       <w:r>
         <w:t xml:space="preserve"> </w:t>
@@ -8148,12 +7998,6 @@
         <w:t xml:space="preserve">generators</w:t>
       </w:r>
       <w:r>
-        <w:rPr>
-          <w:vertAlign w:val="superscript"/>
-        </w:rPr>
-        <w:t xml:space="preserve">10,11</w:t>
-      </w:r>
-      <w:r>
         <w:t xml:space="preserve"> </w:t>
       </w:r>
       <w:r>
@@ -8199,12 +8043,6 @@
         <w:t xml:space="preserve">without a gauge obstruction. MOFFlow</w:t>
       </w:r>
       <w:r>
-        <w:rPr>
-          <w:vertAlign w:val="superscript"/>
-        </w:rPr>
-        <w:t xml:space="preserve">12</w:t>
-      </w:r>
-      <w:r>
         <w:t xml:space="preserve"> </w:t>
       </w:r>
       <w:r>
@@ -8357,12 +8195,6 @@
         <w:t xml:space="preserve">summary</w:t>
       </w:r>
       <w:r>
-        <w:rPr>
-          <w:vertAlign w:val="superscript"/>
-        </w:rPr>
-        <w:t xml:space="preserve">17</w:t>
-      </w:r>
-      <w:r>
         <w:t xml:space="preserve">: the learnable signal is visible only</w:t>
       </w:r>
       <w:r>
@@ -8433,12 +8265,6 @@
         <w:t xml:space="preserve">sites</w:t>
       </w:r>
       <w:r>
-        <w:rPr>
-          <w:vertAlign w:val="superscript"/>
-        </w:rPr>
-        <w:t xml:space="preserve">18–20</w:t>
-      </w:r>
-      <w:r>
         <w:t xml:space="preserve">, converts the</w:t>
       </w:r>
       <w:r>
@@ -8502,12 +8328,6 @@
       </w:r>
       <w:r>
         <w:t xml:space="preserve">are trained on inorganic data</w:t>
-      </w:r>
-      <w:r>
-        <w:rPr>
-          <w:vertAlign w:val="superscript"/>
-        </w:rPr>
-        <w:t xml:space="preserve">21</w:t>
       </w:r>
       <w:r>
         <w:t xml:space="preserve"> </w:t>
@@ -8911,12 +8731,6 @@
         <w:t xml:space="preserve">matching</w:t>
       </w:r>
       <w:r>
-        <w:rPr>
-          <w:vertAlign w:val="superscript"/>
-        </w:rPr>
-        <w:t xml:space="preserve">4</w:t>
-      </w:r>
-      <w:r>
         <w:t xml:space="preserve"> </w:t>
       </w:r>
       <w:r>
@@ -8929,12 +8743,6 @@
         <w:t xml:space="preserve">exchangeable prior and data within each crystal</w:t>
       </w:r>
       <w:r>
-        <w:rPr>
-          <w:vertAlign w:val="superscript"/>
-        </w:rPr>
-        <w:t xml:space="preserve">22</w:t>
-      </w:r>
-      <w:r>
         <w:t xml:space="preserve">.</w:t>
       </w:r>
       <w:r>
@@ -9040,12 +8848,6 @@
         <w:t xml:space="preserve">matching</w:t>
       </w:r>
       <w:r>
-        <w:rPr>
-          <w:vertAlign w:val="superscript"/>
-        </w:rPr>
-        <w:t xml:space="preserve">5</w:t>
-      </w:r>
-      <w:r>
         <w:t xml:space="preserve"> </w:t>
       </w:r>
       <w:r>
@@ -9058,12 +8860,6 @@
         <w:t xml:space="preserve">for proteins</w:t>
       </w:r>
       <w:r>
-        <w:rPr>
-          <w:vertAlign w:val="superscript"/>
-        </w:rPr>
-        <w:t xml:space="preserve">6,7</w:t>
-      </w:r>
-      <w:r>
         <w:t xml:space="preserve"> </w:t>
       </w:r>
       <w:r>
@@ -9074,12 +8870,6 @@
       </w:r>
       <w:r>
         <w:t xml:space="preserve">frameworks</w:t>
-      </w:r>
-      <w:r>
-        <w:rPr>
-          <w:vertAlign w:val="superscript"/>
-        </w:rPr>
-        <w:t xml:space="preserve">12</w:t>
       </w:r>
       <w:r>
         <w:t xml:space="preserve">. The orientation target is the constant-velocity</w:t>
@@ -9404,12 +9194,6 @@
         <w:t xml:space="preserve">-equivariant graph network</w:t>
       </w:r>
       <w:r>
-        <w:rPr>
-          <w:vertAlign w:val="superscript"/>
-        </w:rPr>
-        <w:t xml:space="preserve">15</w:t>
-      </w:r>
-      <w:r>
         <w:t xml:space="preserve"> </w:t>
       </w:r>
       <w:r>
@@ -10074,12 +9858,6 @@
         <w:t xml:space="preserve">StructureMatcher</w:t>
       </w:r>
       <w:r>
-        <w:rPr>
-          <w:vertAlign w:val="superscript"/>
-        </w:rPr>
-        <w:t xml:space="preserve">16</w:t>
-      </w:r>
-      <w:r>
         <w:t xml:space="preserve"> </w:t>
       </w:r>
       <w:r>
@@ -10255,12 +10033,6 @@
       </w:r>
       <w:r>
         <w:t xml:space="preserve">via the CSD Python API)</w:t>
-      </w:r>
-      <w:r>
-        <w:rPr>
-          <w:vertAlign w:val="superscript"/>
-        </w:rPr>
-        <w:t xml:space="preserve">14</w:t>
       </w:r>
       <w:r>
         <w:t xml:space="preserve"> </w:t>
@@ -10587,13 +10359,13 @@
       </w:r>
     </w:p>
     <w:bookmarkEnd w:id="44"/>
-    <w:bookmarkStart w:id="45" w:name="competing-interests"/>
+    <w:bookmarkStart w:id="45" w:name="conflicts-of-interest"/>
     <w:p>
       <w:pPr>
         <w:pStyle w:val="Heading1"/>
       </w:pPr>
       <w:r>
-        <w:t xml:space="preserve">Competing interests</w:t>
+        <w:t xml:space="preserve">Conflicts of interest</w:t>
       </w:r>
     </w:p>
     <w:p>
@@ -10601,7 +10373,7 @@
         <w:pStyle w:val="FirstParagraph"/>
       </w:pPr>
       <w:r>
-        <w:t xml:space="preserve">The author declares no competing interests.</w:t>
+        <w:t xml:space="preserve">The author declares no conflicts of interest.</w:t>
       </w:r>
     </w:p>
     <w:bookmarkEnd w:id="45"/>
@@ -10629,7 +10401,7 @@
       </w:r>
     </w:p>
     <w:bookmarkEnd w:id="46"/>
-    <w:bookmarkStart w:id="75" w:name="use-of-ai-tools"/>
+    <w:bookmarkStart w:id="47" w:name="use-of-ai-tools"/>
     <w:p>
       <w:pPr>
         <w:pStyle w:val="Heading1"/>
@@ -10664,870 +10436,7 @@
         <w:t xml:space="preserve">content.</w:t>
       </w:r>
     </w:p>
-    <w:bookmarkStart w:id="74" w:name="refs"/>
-    <w:bookmarkStart w:id="47" w:name="ref-xie2022cdvae"/>
-    <w:p>
-      <w:pPr>
-        <w:pStyle w:val="Bibliography"/>
-      </w:pPr>
-      <w:r>
-        <w:t xml:space="preserve">1</w:t>
-      </w:r>
-      <w:r>
-        <w:t xml:space="preserve"> </w:t>
-      </w:r>
-      <w:r>
-        <w:t xml:space="preserve">	</w:t>
-      </w:r>
-      <w:r>
-        <w:t xml:space="preserve">T. Xie, X. Fu, O.-E. Ganea, R. Barzilay and T. Jaakkola, in</w:t>
-      </w:r>
-      <w:r>
-        <w:t xml:space="preserve"> </w:t>
-      </w:r>
-      <w:r>
-        <w:rPr>
-          <w:i/>
-          <w:iCs/>
-        </w:rPr>
-        <w:t xml:space="preserve">International conference on learning representations (ICLR)</w:t>
-      </w:r>
-      <w:r>
-        <w:t xml:space="preserve">, 2022.</w:t>
-      </w:r>
-    </w:p>
     <w:bookmarkEnd w:id="47"/>
-    <w:bookmarkStart w:id="48" w:name="ref-jiao2023diffcsp"/>
-    <w:p>
-      <w:pPr>
-        <w:pStyle w:val="Bibliography"/>
-      </w:pPr>
-      <w:r>
-        <w:t xml:space="preserve">2</w:t>
-      </w:r>
-      <w:r>
-        <w:t xml:space="preserve"> </w:t>
-      </w:r>
-      <w:r>
-        <w:t xml:space="preserve">	</w:t>
-      </w:r>
-      <w:r>
-        <w:t xml:space="preserve">R. Jiao, W. Huang, P. Lin, J. Han, P. Chen, Y. Lu and Y. Liu, in</w:t>
-      </w:r>
-      <w:r>
-        <w:t xml:space="preserve"> </w:t>
-      </w:r>
-      <w:r>
-        <w:rPr>
-          <w:i/>
-          <w:iCs/>
-        </w:rPr>
-        <w:t xml:space="preserve">Advances in neural information processing systems (NeurIPS)</w:t>
-      </w:r>
-      <w:r>
-        <w:t xml:space="preserve">, 2023.</w:t>
-      </w:r>
-    </w:p>
-    <w:bookmarkEnd w:id="48"/>
-    <w:bookmarkStart w:id="49" w:name="ref-miller2024flowmm"/>
-    <w:p>
-      <w:pPr>
-        <w:pStyle w:val="Bibliography"/>
-      </w:pPr>
-      <w:r>
-        <w:t xml:space="preserve">3</w:t>
-      </w:r>
-      <w:r>
-        <w:t xml:space="preserve"> </w:t>
-      </w:r>
-      <w:r>
-        <w:t xml:space="preserve">	</w:t>
-      </w:r>
-      <w:r>
-        <w:t xml:space="preserve">B. K. Miller, R. T. Q. Chen, A. Sriram and B. M. Wood, in</w:t>
-      </w:r>
-      <w:r>
-        <w:t xml:space="preserve"> </w:t>
-      </w:r>
-      <w:r>
-        <w:rPr>
-          <w:i/>
-          <w:iCs/>
-        </w:rPr>
-        <w:t xml:space="preserve">International conference on machine learning (ICML)</w:t>
-      </w:r>
-      <w:r>
-        <w:t xml:space="preserve">, 2024.</w:t>
-      </w:r>
-    </w:p>
-    <w:bookmarkEnd w:id="49"/>
-    <w:bookmarkStart w:id="50" w:name="ref-lipman2023flowmatching"/>
-    <w:p>
-      <w:pPr>
-        <w:pStyle w:val="Bibliography"/>
-      </w:pPr>
-      <w:r>
-        <w:t xml:space="preserve">4</w:t>
-      </w:r>
-      <w:r>
-        <w:t xml:space="preserve"> </w:t>
-      </w:r>
-      <w:r>
-        <w:t xml:space="preserve">	</w:t>
-      </w:r>
-      <w:r>
-        <w:t xml:space="preserve">Y. Lipman, R. T. Q. Chen, H. Ben-Hamu, M. Nickel and M. Le, in</w:t>
-      </w:r>
-      <w:r>
-        <w:t xml:space="preserve"> </w:t>
-      </w:r>
-      <w:r>
-        <w:rPr>
-          <w:i/>
-          <w:iCs/>
-        </w:rPr>
-        <w:t xml:space="preserve">International conference on learning representations (ICLR)</w:t>
-      </w:r>
-      <w:r>
-        <w:t xml:space="preserve">, 2023.</w:t>
-      </w:r>
-    </w:p>
-    <w:bookmarkEnd w:id="50"/>
-    <w:bookmarkStart w:id="51" w:name="ref-chen2024riemannian"/>
-    <w:p>
-      <w:pPr>
-        <w:pStyle w:val="Bibliography"/>
-      </w:pPr>
-      <w:r>
-        <w:t xml:space="preserve">5</w:t>
-      </w:r>
-      <w:r>
-        <w:t xml:space="preserve"> </w:t>
-      </w:r>
-      <w:r>
-        <w:t xml:space="preserve">	</w:t>
-      </w:r>
-      <w:r>
-        <w:t xml:space="preserve">R. T. Q. Chen and Y. Lipman, in</w:t>
-      </w:r>
-      <w:r>
-        <w:t xml:space="preserve"> </w:t>
-      </w:r>
-      <w:r>
-        <w:rPr>
-          <w:i/>
-          <w:iCs/>
-        </w:rPr>
-        <w:t xml:space="preserve">International conference on learning representations (ICLR)</w:t>
-      </w:r>
-      <w:r>
-        <w:t xml:space="preserve">, 2024.</w:t>
-      </w:r>
-    </w:p>
-    <w:bookmarkEnd w:id="51"/>
-    <w:bookmarkStart w:id="52" w:name="ref-yim2023se3diffusion"/>
-    <w:p>
-      <w:pPr>
-        <w:pStyle w:val="Bibliography"/>
-      </w:pPr>
-      <w:r>
-        <w:t xml:space="preserve">6</w:t>
-      </w:r>
-      <w:r>
-        <w:t xml:space="preserve"> </w:t>
-      </w:r>
-      <w:r>
-        <w:t xml:space="preserve">	</w:t>
-      </w:r>
-      <w:r>
-        <w:t xml:space="preserve">J. Yim, B. L. Trippe, V. De Bortoli, E. Mathieu, A. Doucet, R. Barzilay and T. Jaakkola, in</w:t>
-      </w:r>
-      <w:r>
-        <w:t xml:space="preserve"> </w:t>
-      </w:r>
-      <w:r>
-        <w:rPr>
-          <w:i/>
-          <w:iCs/>
-        </w:rPr>
-        <w:t xml:space="preserve">International conference on machine learning (ICML)</w:t>
-      </w:r>
-      <w:r>
-        <w:t xml:space="preserve">, 2023.</w:t>
-      </w:r>
-    </w:p>
-    <w:bookmarkEnd w:id="52"/>
-    <w:bookmarkStart w:id="53" w:name="ref-yim2023frameflow"/>
-    <w:p>
-      <w:pPr>
-        <w:pStyle w:val="Bibliography"/>
-      </w:pPr>
-      <w:r>
-        <w:t xml:space="preserve">7</w:t>
-      </w:r>
-      <w:r>
-        <w:t xml:space="preserve"> </w:t>
-      </w:r>
-      <w:r>
-        <w:t xml:space="preserve">	</w:t>
-      </w:r>
-      <w:r>
-        <w:t xml:space="preserve">J. Yim, A. Campbell, A. Y. K. Foong, M. Gastegger, J. Jiménez-Luna, S. Lewis, V. G. Satorras, B. S. Veeling, R. Barzilay, T. Jaakkola and F. Noé,</w:t>
-      </w:r>
-      <w:r>
-        <w:t xml:space="preserve"> </w:t>
-      </w:r>
-      <w:r>
-        <w:rPr>
-          <w:i/>
-          <w:iCs/>
-        </w:rPr>
-        <w:t xml:space="preserve">arXiv preprint arXiv:2310.05297</w:t>
-      </w:r>
-      <w:r>
-        <w:t xml:space="preserve">.</w:t>
-      </w:r>
-    </w:p>
-    <w:bookmarkEnd w:id="53"/>
-    <w:bookmarkStart w:id="55" w:name="ref-price2023blindtest7"/>
-    <w:p>
-      <w:pPr>
-        <w:pStyle w:val="Bibliography"/>
-      </w:pPr>
-      <w:r>
-        <w:t xml:space="preserve">8</w:t>
-      </w:r>
-      <w:r>
-        <w:t xml:space="preserve"> </w:t>
-      </w:r>
-      <w:r>
-        <w:t xml:space="preserve">	</w:t>
-      </w:r>
-      <w:r>
-        <w:t xml:space="preserve">L. M. Hunnisett and others</w:t>
-      </w:r>
-      <w:r>
-        <w:t xml:space="preserve">,</w:t>
-      </w:r>
-      <w:r>
-        <w:t xml:space="preserve"> </w:t>
-      </w:r>
-      <w:r>
-        <w:rPr>
-          <w:i/>
-          <w:iCs/>
-        </w:rPr>
-        <w:t xml:space="preserve">Acta Crystallographica Section B</w:t>
-      </w:r>
-      <w:r>
-        <w:t xml:space="preserve">, DOI:</w:t>
-      </w:r>
-      <w:hyperlink r:id="rId54">
-        <w:r>
-          <w:rPr>
-            <w:rStyle w:val="Hyperlink"/>
-          </w:rPr>
-          <w:t xml:space="preserve">10.1107/S2052520624007492</w:t>
-        </w:r>
-      </w:hyperlink>
-      <w:r>
-        <w:t xml:space="preserve">.</w:t>
-      </w:r>
-    </w:p>
-    <w:bookmarkEnd w:id="55"/>
-    <w:bookmarkStart w:id="57" w:name="ref-obrien2021dataefficient"/>
-    <w:p>
-      <w:pPr>
-        <w:pStyle w:val="Bibliography"/>
-      </w:pPr>
-      <w:r>
-        <w:t xml:space="preserve">9</w:t>
-      </w:r>
-      <w:r>
-        <w:t xml:space="preserve"> </w:t>
-      </w:r>
-      <w:r>
-        <w:t xml:space="preserve">	</w:t>
-      </w:r>
-      <w:hyperlink r:id="rId56">
-        <w:r>
-          <w:rPr>
-            <w:rStyle w:val="Hyperlink"/>
-          </w:rPr>
-          <w:t xml:space="preserve">S. Wengert, G. Csányi, K. Reuter and J. T. Margraf,</w:t>
-        </w:r>
-        <w:r>
-          <w:rPr>
-            <w:rStyle w:val="Hyperlink"/>
-          </w:rPr>
-          <w:t xml:space="preserve"> </w:t>
-        </w:r>
-        <w:r>
-          <w:rPr>
-            <w:rStyle w:val="Hyperlink"/>
-            <w:i/>
-            <w:iCs/>
-          </w:rPr>
-          <w:t xml:space="preserve">Chemical Science</w:t>
-        </w:r>
-        <w:r>
-          <w:rPr>
-            <w:rStyle w:val="Hyperlink"/>
-          </w:rPr>
-          <w:t xml:space="preserve">, 2021,</w:t>
-        </w:r>
-        <w:r>
-          <w:rPr>
-            <w:rStyle w:val="Hyperlink"/>
-          </w:rPr>
-          <w:t xml:space="preserve"> </w:t>
-        </w:r>
-        <w:r>
-          <w:rPr>
-            <w:rStyle w:val="Hyperlink"/>
-            <w:b/>
-            <w:bCs/>
-          </w:rPr>
-          <w:t xml:space="preserve">12</w:t>
-        </w:r>
-        <w:r>
-          <w:rPr>
-            <w:rStyle w:val="Hyperlink"/>
-          </w:rPr>
-          <w:t xml:space="preserve">, 4536–4546</w:t>
-        </w:r>
-      </w:hyperlink>
-      <w:r>
-        <w:t xml:space="preserve">.</w:t>
-      </w:r>
-    </w:p>
-    <w:bookmarkEnd w:id="57"/>
-    <w:bookmarkStart w:id="58" w:name="ref-jin2025oxtal"/>
-    <w:p>
-      <w:pPr>
-        <w:pStyle w:val="Bibliography"/>
-      </w:pPr>
-      <w:r>
-        <w:t xml:space="preserve">10</w:t>
-      </w:r>
-      <w:r>
-        <w:t xml:space="preserve"> </w:t>
-      </w:r>
-      <w:r>
-        <w:t xml:space="preserve">	</w:t>
-      </w:r>
-      <w:r>
-        <w:t xml:space="preserve">E. Jin, A. C. Nica, M. Galkin and others</w:t>
-      </w:r>
-      <w:r>
-        <w:t xml:space="preserve">,</w:t>
-      </w:r>
-      <w:r>
-        <w:t xml:space="preserve"> </w:t>
-      </w:r>
-      <w:r>
-        <w:rPr>
-          <w:i/>
-          <w:iCs/>
-        </w:rPr>
-        <w:t xml:space="preserve">arXiv preprint arXiv:2512.06987</w:t>
-      </w:r>
-      <w:r>
-        <w:t xml:space="preserve">.</w:t>
-      </w:r>
-    </w:p>
-    <w:bookmarkEnd w:id="58"/>
-    <w:bookmarkStart w:id="59" w:name="ref-subramanian2026packflow"/>
-    <w:p>
-      <w:pPr>
-        <w:pStyle w:val="Bibliography"/>
-      </w:pPr>
-      <w:r>
-        <w:t xml:space="preserve">11</w:t>
-      </w:r>
-      <w:r>
-        <w:t xml:space="preserve"> </w:t>
-      </w:r>
-      <w:r>
-        <w:t xml:space="preserve">	</w:t>
-      </w:r>
-      <w:r>
-        <w:t xml:space="preserve">A. Subramanian, E. Pan, J. Nam, M. Weiler, S. Qu, C. W. Park, T. S. Jaakkola, E. Olivetti and R. Gomez-Bombarelli,</w:t>
-      </w:r>
-      <w:r>
-        <w:t xml:space="preserve"> </w:t>
-      </w:r>
-      <w:r>
-        <w:rPr>
-          <w:i/>
-          <w:iCs/>
-        </w:rPr>
-        <w:t xml:space="preserve">arXiv preprint arXiv:2602.20140</w:t>
-      </w:r>
-      <w:r>
-        <w:t xml:space="preserve">.</w:t>
-      </w:r>
-    </w:p>
-    <w:bookmarkEnd w:id="59"/>
-    <w:bookmarkStart w:id="60" w:name="ref-kim2025mofflow"/>
-    <w:p>
-      <w:pPr>
-        <w:pStyle w:val="Bibliography"/>
-      </w:pPr>
-      <w:r>
-        <w:t xml:space="preserve">12</w:t>
-      </w:r>
-      <w:r>
-        <w:t xml:space="preserve"> </w:t>
-      </w:r>
-      <w:r>
-        <w:t xml:space="preserve">	</w:t>
-      </w:r>
-      <w:r>
-        <w:t xml:space="preserve">N. Kim, S. Kim, M. Kim, J. Park and S. Ahn, in</w:t>
-      </w:r>
-      <w:r>
-        <w:t xml:space="preserve"> </w:t>
-      </w:r>
-      <w:r>
-        <w:rPr>
-          <w:i/>
-          <w:iCs/>
-        </w:rPr>
-        <w:t xml:space="preserve">International conference on learning representations (ICLR)</w:t>
-      </w:r>
-      <w:r>
-        <w:t xml:space="preserve">, 2025.</w:t>
-      </w:r>
-    </w:p>
-    <w:bookmarkEnd w:id="60"/>
-    <w:bookmarkStart w:id="61" w:name="ref-leach2022so3"/>
-    <w:p>
-      <w:pPr>
-        <w:pStyle w:val="Bibliography"/>
-      </w:pPr>
-      <w:r>
-        <w:t xml:space="preserve">13</w:t>
-      </w:r>
-      <w:r>
-        <w:t xml:space="preserve"> </w:t>
-      </w:r>
-      <w:r>
-        <w:t xml:space="preserve">	</w:t>
-      </w:r>
-      <w:r>
-        <w:t xml:space="preserve">A. Leach, S. M. Schmon, M. T. Degiacomi and C. G. Willcocks, in</w:t>
-      </w:r>
-      <w:r>
-        <w:t xml:space="preserve"> </w:t>
-      </w:r>
-      <w:r>
-        <w:rPr>
-          <w:i/>
-          <w:iCs/>
-        </w:rPr>
-        <w:t xml:space="preserve">ICLR 2022 workshop on geometrical and topological representation learning</w:t>
-      </w:r>
-      <w:r>
-        <w:t xml:space="preserve">, 2022.</w:t>
-      </w:r>
-    </w:p>
-    <w:bookmarkEnd w:id="61"/>
-    <w:bookmarkStart w:id="63" w:name="ref-groom2016csd"/>
-    <w:p>
-      <w:pPr>
-        <w:pStyle w:val="Bibliography"/>
-      </w:pPr>
-      <w:r>
-        <w:t xml:space="preserve">14</w:t>
-      </w:r>
-      <w:r>
-        <w:t xml:space="preserve"> </w:t>
-      </w:r>
-      <w:r>
-        <w:t xml:space="preserve">	</w:t>
-      </w:r>
-      <w:hyperlink r:id="rId62">
-        <w:r>
-          <w:rPr>
-            <w:rStyle w:val="Hyperlink"/>
-          </w:rPr>
-          <w:t xml:space="preserve">C. R. Groom, I. J. Bruno, M. P. Lightfoot and S. C. Ward,</w:t>
-        </w:r>
-        <w:r>
-          <w:rPr>
-            <w:rStyle w:val="Hyperlink"/>
-          </w:rPr>
-          <w:t xml:space="preserve"> </w:t>
-        </w:r>
-        <w:r>
-          <w:rPr>
-            <w:rStyle w:val="Hyperlink"/>
-            <w:i/>
-            <w:iCs/>
-          </w:rPr>
-          <w:t xml:space="preserve">Acta Crystallographica Section B</w:t>
-        </w:r>
-        <w:r>
-          <w:rPr>
-            <w:rStyle w:val="Hyperlink"/>
-          </w:rPr>
-          <w:t xml:space="preserve">, 2016,</w:t>
-        </w:r>
-        <w:r>
-          <w:rPr>
-            <w:rStyle w:val="Hyperlink"/>
-          </w:rPr>
-          <w:t xml:space="preserve"> </w:t>
-        </w:r>
-        <w:r>
-          <w:rPr>
-            <w:rStyle w:val="Hyperlink"/>
-            <w:b/>
-            <w:bCs/>
-          </w:rPr>
-          <w:t xml:space="preserve">72</w:t>
-        </w:r>
-        <w:r>
-          <w:rPr>
-            <w:rStyle w:val="Hyperlink"/>
-          </w:rPr>
-          <w:t xml:space="preserve">, 171–179</w:t>
-        </w:r>
-      </w:hyperlink>
-      <w:r>
-        <w:t xml:space="preserve">.</w:t>
-      </w:r>
-    </w:p>
-    <w:bookmarkEnd w:id="63"/>
-    <w:bookmarkStart w:id="64" w:name="ref-satorras2021egnn"/>
-    <w:p>
-      <w:pPr>
-        <w:pStyle w:val="Bibliography"/>
-      </w:pPr>
-      <w:r>
-        <w:t xml:space="preserve">15</w:t>
-      </w:r>
-      <w:r>
-        <w:t xml:space="preserve"> </w:t>
-      </w:r>
-      <w:r>
-        <w:t xml:space="preserve">	</w:t>
-      </w:r>
-      <w:r>
-        <w:t xml:space="preserve">V. G. Satorras, E. Hoogeboom and M. Welling, in</w:t>
-      </w:r>
-      <w:r>
-        <w:t xml:space="preserve"> </w:t>
-      </w:r>
-      <w:r>
-        <w:rPr>
-          <w:i/>
-          <w:iCs/>
-        </w:rPr>
-        <w:t xml:space="preserve">International conference on machine learning (ICML)</w:t>
-      </w:r>
-      <w:r>
-        <w:t xml:space="preserve">, 2021.</w:t>
-      </w:r>
-    </w:p>
-    <w:bookmarkEnd w:id="64"/>
-    <w:bookmarkStart w:id="66" w:name="ref-ong2013pymatgen"/>
-    <w:p>
-      <w:pPr>
-        <w:pStyle w:val="Bibliography"/>
-      </w:pPr>
-      <w:r>
-        <w:t xml:space="preserve">16</w:t>
-      </w:r>
-      <w:r>
-        <w:t xml:space="preserve"> </w:t>
-      </w:r>
-      <w:r>
-        <w:t xml:space="preserve">	</w:t>
-      </w:r>
-      <w:hyperlink r:id="rId65">
-        <w:r>
-          <w:rPr>
-            <w:rStyle w:val="Hyperlink"/>
-          </w:rPr>
-          <w:t xml:space="preserve">S. P. Ong, W. D. Richards, A. Jain, G. Hautier, M. Kocher, S. Cholia, D. Gunter, V. L. Chevrier, K. A. Persson and G. Ceder,</w:t>
-        </w:r>
-        <w:r>
-          <w:rPr>
-            <w:rStyle w:val="Hyperlink"/>
-          </w:rPr>
-          <w:t xml:space="preserve"> </w:t>
-        </w:r>
-        <w:r>
-          <w:rPr>
-            <w:rStyle w:val="Hyperlink"/>
-            <w:i/>
-            <w:iCs/>
-          </w:rPr>
-          <w:t xml:space="preserve">Computational Materials Science</w:t>
-        </w:r>
-        <w:r>
-          <w:rPr>
-            <w:rStyle w:val="Hyperlink"/>
-          </w:rPr>
-          <w:t xml:space="preserve">, 2013,</w:t>
-        </w:r>
-        <w:r>
-          <w:rPr>
-            <w:rStyle w:val="Hyperlink"/>
-          </w:rPr>
-          <w:t xml:space="preserve"> </w:t>
-        </w:r>
-        <w:r>
-          <w:rPr>
-            <w:rStyle w:val="Hyperlink"/>
-            <w:b/>
-            <w:bCs/>
-          </w:rPr>
-          <w:t xml:space="preserve">68</w:t>
-        </w:r>
-        <w:r>
-          <w:rPr>
-            <w:rStyle w:val="Hyperlink"/>
-          </w:rPr>
-          <w:t xml:space="preserve">, 314–319</w:t>
-        </w:r>
-      </w:hyperlink>
-      <w:r>
-        <w:t xml:space="preserve">.</w:t>
-      </w:r>
-    </w:p>
-    <w:bookmarkEnd w:id="66"/>
-    <w:bookmarkStart w:id="67" w:name="ref-martirossyan2025matching"/>
-    <w:p>
-      <w:pPr>
-        <w:pStyle w:val="Bibliography"/>
-      </w:pPr>
-      <w:r>
-        <w:t xml:space="preserve">17</w:t>
-      </w:r>
-      <w:r>
-        <w:t xml:space="preserve"> </w:t>
-      </w:r>
-      <w:r>
-        <w:t xml:space="preserve">	</w:t>
-      </w:r>
-      <w:r>
-        <w:t xml:space="preserve">M. M. Martirossyan, T. Egg, P. Hoellmer, G. Karypis, M. Transtrum, A. Roitberg, M. Liu, R. G. Hennig, E. B. Tadmor and S. Martiniani,</w:t>
-      </w:r>
-      <w:r>
-        <w:t xml:space="preserve"> </w:t>
-      </w:r>
-      <w:r>
-        <w:rPr>
-          <w:i/>
-          <w:iCs/>
-        </w:rPr>
-        <w:t xml:space="preserve">arXiv preprint arXiv:2509.12178</w:t>
-      </w:r>
-      <w:r>
-        <w:t xml:space="preserve">.</w:t>
-      </w:r>
-    </w:p>
-    <w:bookmarkEnd w:id="67"/>
-    <w:bookmarkStart w:id="68" w:name="ref-jiao2024diffcsppp"/>
-    <w:p>
-      <w:pPr>
-        <w:pStyle w:val="Bibliography"/>
-      </w:pPr>
-      <w:r>
-        <w:t xml:space="preserve">18</w:t>
-      </w:r>
-      <w:r>
-        <w:t xml:space="preserve"> </w:t>
-      </w:r>
-      <w:r>
-        <w:t xml:space="preserve">	</w:t>
-      </w:r>
-      <w:r>
-        <w:t xml:space="preserve">R. Jiao, W. Huang, Y. Liu, D. Zhao and Y. Liu, in</w:t>
-      </w:r>
-      <w:r>
-        <w:t xml:space="preserve"> </w:t>
-      </w:r>
-      <w:r>
-        <w:rPr>
-          <w:i/>
-          <w:iCs/>
-        </w:rPr>
-        <w:t xml:space="preserve">International conference on learning representations (ICLR)</w:t>
-      </w:r>
-      <w:r>
-        <w:t xml:space="preserve">, 2024.</w:t>
-      </w:r>
-    </w:p>
-    <w:bookmarkEnd w:id="68"/>
-    <w:bookmarkStart w:id="69" w:name="ref-wyckoffdiff2025"/>
-    <w:p>
-      <w:pPr>
-        <w:pStyle w:val="Bibliography"/>
-      </w:pPr>
-      <w:r>
-        <w:t xml:space="preserve">19</w:t>
-      </w:r>
-      <w:r>
-        <w:t xml:space="preserve"> </w:t>
-      </w:r>
-      <w:r>
-        <w:t xml:space="preserve">	</w:t>
-      </w:r>
-      <w:r>
-        <w:t xml:space="preserve">F. E. Kelvinius, O. B. Andersson, A. S. Parackal, D. Qian, R. Armiento and F. Lindsten,</w:t>
-      </w:r>
-      <w:r>
-        <w:t xml:space="preserve"> </w:t>
-      </w:r>
-      <w:r>
-        <w:rPr>
-          <w:i/>
-          <w:iCs/>
-        </w:rPr>
-        <w:t xml:space="preserve">arXiv preprint arXiv:2502.06485</w:t>
-      </w:r>
-      <w:r>
-        <w:t xml:space="preserve">.</w:t>
-      </w:r>
-    </w:p>
-    <w:bookmarkEnd w:id="69"/>
-    <w:bookmarkStart w:id="70" w:name="ref-symmcd2025"/>
-    <w:p>
-      <w:pPr>
-        <w:pStyle w:val="Bibliography"/>
-      </w:pPr>
-      <w:r>
-        <w:t xml:space="preserve">20</w:t>
-      </w:r>
-      <w:r>
-        <w:t xml:space="preserve"> </w:t>
-      </w:r>
-      <w:r>
-        <w:t xml:space="preserve">	</w:t>
-      </w:r>
-      <w:r>
-        <w:t xml:space="preserve">D. Levy, S. S. Panigrahi, S.-O. Kaba, Q. Zhu, K. L. K. Lee, M. Galkin, S. Miret and S. Ravanbakhsh,</w:t>
-      </w:r>
-      <w:r>
-        <w:t xml:space="preserve"> </w:t>
-      </w:r>
-      <w:r>
-        <w:rPr>
-          <w:i/>
-          <w:iCs/>
-        </w:rPr>
-        <w:t xml:space="preserve">arXiv preprint arXiv:2502.03638</w:t>
-      </w:r>
-      <w:r>
-        <w:t xml:space="preserve">.</w:t>
-      </w:r>
-    </w:p>
-    <w:bookmarkEnd w:id="70"/>
-    <w:bookmarkStart w:id="72" w:name="ref-deng2023chgnet"/>
-    <w:p>
-      <w:pPr>
-        <w:pStyle w:val="Bibliography"/>
-      </w:pPr>
-      <w:r>
-        <w:t xml:space="preserve">21</w:t>
-      </w:r>
-      <w:r>
-        <w:t xml:space="preserve"> </w:t>
-      </w:r>
-      <w:r>
-        <w:t xml:space="preserve">	</w:t>
-      </w:r>
-      <w:hyperlink r:id="rId71">
-        <w:r>
-          <w:rPr>
-            <w:rStyle w:val="Hyperlink"/>
-          </w:rPr>
-          <w:t xml:space="preserve">B. Deng, P. Zhong, K. Jun, J. Riebesell, K. Han, C. J. Bartel and G. Ceder,</w:t>
-        </w:r>
-        <w:r>
-          <w:rPr>
-            <w:rStyle w:val="Hyperlink"/>
-          </w:rPr>
-          <w:t xml:space="preserve"> </w:t>
-        </w:r>
-        <w:r>
-          <w:rPr>
-            <w:rStyle w:val="Hyperlink"/>
-            <w:i/>
-            <w:iCs/>
-          </w:rPr>
-          <w:t xml:space="preserve">Nature Machine Intelligence</w:t>
-        </w:r>
-        <w:r>
-          <w:rPr>
-            <w:rStyle w:val="Hyperlink"/>
-          </w:rPr>
-          <w:t xml:space="preserve">, 2023,</w:t>
-        </w:r>
-        <w:r>
-          <w:rPr>
-            <w:rStyle w:val="Hyperlink"/>
-          </w:rPr>
-          <w:t xml:space="preserve"> </w:t>
-        </w:r>
-        <w:r>
-          <w:rPr>
-            <w:rStyle w:val="Hyperlink"/>
-            <w:b/>
-            <w:bCs/>
-          </w:rPr>
-          <w:t xml:space="preserve">5</w:t>
-        </w:r>
-        <w:r>
-          <w:rPr>
-            <w:rStyle w:val="Hyperlink"/>
-          </w:rPr>
-          <w:t xml:space="preserve">, 1031–1041</w:t>
-        </w:r>
-      </w:hyperlink>
-      <w:r>
-        <w:t xml:space="preserve">.</w:t>
-      </w:r>
-    </w:p>
-    <w:bookmarkEnd w:id="72"/>
-    <w:bookmarkStart w:id="73" w:name="ref-pooladian2023multisample"/>
-    <w:p>
-      <w:pPr>
-        <w:pStyle w:val="Bibliography"/>
-      </w:pPr>
-      <w:r>
-        <w:t xml:space="preserve">22</w:t>
-      </w:r>
-      <w:r>
-        <w:t xml:space="preserve"> </w:t>
-      </w:r>
-      <w:r>
-        <w:t xml:space="preserve">	</w:t>
-      </w:r>
-      <w:r>
-        <w:t xml:space="preserve">A.-A. Pooladian, H. Ben-Hamu, C. Domingo-Enrich, B. Amos, Y. Lipman and R. T. Q. Chen, in</w:t>
-      </w:r>
-      <w:r>
-        <w:t xml:space="preserve"> </w:t>
-      </w:r>
-      <w:r>
-        <w:rPr>
-          <w:i/>
-          <w:iCs/>
-        </w:rPr>
-        <w:t xml:space="preserve">International conference on machine learning (ICML)</w:t>
-      </w:r>
-      <w:r>
-        <w:t xml:space="preserve">, 2023.</w:t>
-      </w:r>
-    </w:p>
-    <w:bookmarkEnd w:id="73"/>
-    <w:bookmarkEnd w:id="74"/>
-    <w:bookmarkEnd w:id="75"/>
     <w:sectPr>
       <w:footnotePr>
         <w:numRestart w:val="eachSect"/>

</xml_diff>

<commit_message>
paper: trim abstract to ~266 words per RSC norm; add TOC graphic (8x4cm, 600dpi TIFF) + blurb
</commit_message>
<xml_diff>
--- a/paper/symmc-flow_manuscript.docx
+++ b/paper/symmc-flow_manuscript.docx
@@ -132,25 +132,19 @@
         </m:r>
       </m:oMath>
       <w:r>
-        <w:t xml:space="preserve">, a low-dimensional target amenable to fast</w:t>
-      </w:r>
-      <w:r>
-        <w:t xml:space="preserve"> </w:t>
-      </w:r>
-      <w:r>
-        <w:t xml:space="preserve">flow-matching samplers. Whether the orientation field is actually learnable on</w:t>
-      </w:r>
-      <w:r>
-        <w:t xml:space="preserve"> </w:t>
-      </w:r>
-      <w:r>
-        <w:t xml:space="preserve">real molecular crystals has not been examined. We introduce SymMC-Flow, a</w:t>
-      </w:r>
-      <w:r>
-        <w:t xml:space="preserve"> </w:t>
-      </w:r>
-      <w:r>
-        <w:t xml:space="preserve">space-group-conditioned rigid-body flow on</w:t>
+        <w:t xml:space="preserve">. Whether the orientation field is actually</w:t>
+      </w:r>
+      <w:r>
+        <w:t xml:space="preserve"> </w:t>
+      </w:r>
+      <w:r>
+        <w:t xml:space="preserve">learnable on real molecular crystals has not been examined. We introduce</w:t>
+      </w:r>
+      <w:r>
+        <w:t xml:space="preserve"> </w:t>
+      </w:r>
+      <w:r>
+        <w:t xml:space="preserve">SymMC-Flow, a space-group-conditioned rigid-body flow on</w:t>
       </w:r>
       <w:r>
         <w:t xml:space="preserve"> </w:t>
@@ -220,19 +214,13 @@
         </m:r>
       </m:oMath>
       <w:r>
-        <w:t xml:space="preserve">, and use it as a</w:t>
-      </w:r>
-      <w:r>
-        <w:t xml:space="preserve"> </w:t>
-      </w:r>
-      <w:r>
-        <w:t xml:space="preserve">diagnostic study to characterize what the orientation field can and cannot</w:t>
-      </w:r>
-      <w:r>
-        <w:t xml:space="preserve"> </w:t>
-      </w:r>
-      <w:r>
-        <w:t xml:space="preserve">learn on</w:t>
+        <w:t xml:space="preserve">, used as a diagnostic</w:t>
+      </w:r>
+      <w:r>
+        <w:t xml:space="preserve"> </w:t>
+      </w:r>
+      <w:r>
+        <w:t xml:space="preserve">study on</w:t>
       </w:r>
       <w:r>
         <w:t xml:space="preserve"> </w:t>
@@ -255,25 +243,25 @@
         <w:t xml:space="preserve"> </w:t>
       </w:r>
       <w:r>
-        <w:t xml:space="preserve">crystals exported from the</w:t>
-      </w:r>
-      <w:r>
-        <w:t xml:space="preserve"> </w:t>
-      </w:r>
-      <w:r>
-        <w:t xml:space="preserve">Cambridge Structural Database. The lattice and centroid flows learn normally,</w:t>
-      </w:r>
-      <w:r>
-        <w:t xml:space="preserve"> </w:t>
-      </w:r>
-      <w:r>
-        <w:t xml:space="preserve">but the absolute per-molecule orientation flow remains at its predict-zero</w:t>
-      </w:r>
-      <w:r>
-        <w:t xml:space="preserve"> </w:t>
-      </w:r>
-      <w:r>
-        <w:t xml:space="preserve">floor. We trace this to a decomposition of the orientation target,</w:t>
+        <w:t xml:space="preserve">crystals from the Cambridge Structural Database. The</w:t>
+      </w:r>
+      <w:r>
+        <w:t xml:space="preserve"> </w:t>
+      </w:r>
+      <w:r>
+        <w:t xml:space="preserve">lattice and centroid flows learn normally, but the absolute per-molecule</w:t>
+      </w:r>
+      <w:r>
+        <w:t xml:space="preserve"> </w:t>
+      </w:r>
+      <w:r>
+        <w:t xml:space="preserve">orientation flow remains at its predict-zero floor. We trace this to a</w:t>
+      </w:r>
+      <w:r>
+        <w:t xml:space="preserve"> </w:t>
+      </w:r>
+      <w:r>
+        <w:t xml:space="preserve">decomposition of the orientation target,</w:t>
       </w:r>
       <w:r>
         <w:t xml:space="preserve"> </w:t>
@@ -369,25 +357,19 @@
         <w:t xml:space="preserve"> </w:t>
       </w:r>
       <w:r>
-        <w:t xml:space="preserve">relative rotation between symmetry copies and the asymmetric unit’s free</w:t>
-      </w:r>
-      <w:r>
-        <w:t xml:space="preserve"> </w:t>
-      </w:r>
-      <w:r>
-        <w:t xml:space="preserve">orientation in the cell. The free part is gauge-arbitrary and is not learnable</w:t>
-      </w:r>
-      <w:r>
-        <w:t xml:space="preserve"> </w:t>
-      </w:r>
-      <w:r>
-        <w:t xml:space="preserve">from composition and packing here; the relative part is learnable. Re-gauging to</w:t>
-      </w:r>
-      <w:r>
-        <w:t xml:space="preserve"> </w:t>
-      </w:r>
-      <w:r>
-        <w:t xml:space="preserve">cancel the free part lifts the</w:t>
+        <w:t xml:space="preserve">relative rotation between symmetry copies and the asymmetric unit’s</w:t>
+      </w:r>
+      <w:r>
+        <w:t xml:space="preserve"> </w:t>
+      </w:r>
+      <w:r>
+        <w:t xml:space="preserve">gauge-arbitrary free orientation, which is not learnable from composition and</w:t>
+      </w:r>
+      <w:r>
+        <w:t xml:space="preserve"> </w:t>
+      </w:r>
+      <w:r>
+        <w:t xml:space="preserve">packing; the relative part is. Re-gauging to cancel the free part lifts</w:t>
       </w:r>
       <w:r>
         <w:t xml:space="preserve"> </w:t>
@@ -448,7 +430,7 @@
         <w:t xml:space="preserve"> </w:t>
       </w:r>
       <w:r>
-        <w:t xml:space="preserve">absolute target) and, in an orientation-isolated evaluation, reconstructs</w:t>
+        <w:t xml:space="preserve">absolute target) and reconstructs</w:t>
       </w:r>
       <w:r>
         <w:t xml:space="preserve"> </w:t>
@@ -468,13 +450,13 @@
         <w:t xml:space="preserve"> </w:t>
       </w:r>
       <w:r>
-        <w:t xml:space="preserve">(mean over three seeds) of held-out multi-copy packings exactly under</w:t>
-      </w:r>
-      <w:r>
-        <w:t xml:space="preserve"> </w:t>
-      </w:r>
-      <w:r>
-        <w:t xml:space="preserve">StructureMatcher against</w:t>
+        <w:t xml:space="preserve">(mean over three seeds) of</w:t>
+      </w:r>
+      <w:r>
+        <w:t xml:space="preserve"> </w:t>
+      </w:r>
+      <w:r>
+        <w:t xml:space="preserve">held-out multi-copy packings exactly under StructureMatcher, against</w:t>
       </w:r>
       <w:r>
         <w:t xml:space="preserve"> </w:t>
@@ -494,13 +476,13 @@
         <w:t xml:space="preserve"> </w:t>
       </w:r>
       <w:r>
-        <w:t xml:space="preserve">for the predict-floor baseline. Conditioning on a discrete space-group</w:t>
-      </w:r>
-      <w:r>
-        <w:t xml:space="preserve"> </w:t>
-      </w:r>
-      <w:r>
-        <w:t xml:space="preserve">coset identity raises the learnable signal to roughly</w:t>
+        <w:t xml:space="preserve">for the predict-floor baseline. Conditioning on a discrete space-group coset</w:t>
+      </w:r>
+      <w:r>
+        <w:t xml:space="preserve"> </w:t>
+      </w:r>
+      <w:r>
+        <w:t xml:space="preserve">identity raises the learnable signal to roughly</w:t>
       </w:r>
       <w:r>
         <w:t xml:space="preserve"> </w:t>
@@ -526,13 +508,7 @@
         <w:t xml:space="preserve"> </w:t>
       </w:r>
       <w:r>
-        <w:t xml:space="preserve">showing the residual</w:t>
-      </w:r>
-      <w:r>
-        <w:t xml:space="preserve"> </w:t>
-      </w:r>
-      <w:r>
-        <w:t xml:space="preserve">ceiling is set by the difficulty of</w:t>
+        <w:t xml:space="preserve">showing the residual ceiling is set by the difficulty of</w:t>
       </w:r>
       <w:r>
         <w:t xml:space="preserve"> </w:t>
@@ -548,37 +524,25 @@
         <w:t xml:space="preserve"> </w:t>
       </w:r>
       <w:r>
-        <w:t xml:space="preserve">the symmetry operation</w:t>
-      </w:r>
-      <w:r>
-        <w:t xml:space="preserve"> </w:t>
-      </w:r>
-      <w:r>
-        <w:t xml:space="preserve">from packing rather than by the network’s capacity to represent the rotation.</w:t>
-      </w:r>
-      <w:r>
-        <w:t xml:space="preserve"> </w:t>
-      </w:r>
-      <w:r>
-        <w:t xml:space="preserve">End-to-end joint generation, which must also sample the lattice and centroids,</w:t>
-      </w:r>
-      <w:r>
-        <w:t xml:space="preserve"> </w:t>
-      </w:r>
-      <w:r>
-        <w:t xml:space="preserve">does not yet reconstruct packings exactly, placing the orientation result as a</w:t>
-      </w:r>
-      <w:r>
-        <w:t xml:space="preserve"> </w:t>
-      </w:r>
-      <w:r>
-        <w:t xml:space="preserve">characterization rather than a finished generator.</w:t>
-      </w:r>
-      <w:r>
-        <w:t xml:space="preserve"> </w:t>
-      </w:r>
-      <w:r>
-        <w:t xml:space="preserve">The result maps out what a rigid-body</w:t>
+        <w:t xml:space="preserve">the symmetry operation from packing rather than by network capacity.</w:t>
+      </w:r>
+      <w:r>
+        <w:t xml:space="preserve"> </w:t>
+      </w:r>
+      <w:r>
+        <w:t xml:space="preserve">End-to-end joint generation does not yet reconstruct packings exactly,</w:t>
+      </w:r>
+      <w:r>
+        <w:t xml:space="preserve"> </w:t>
+      </w:r>
+      <w:r>
+        <w:t xml:space="preserve">placing this as a characterization rather than a finished generator. The</w:t>
+      </w:r>
+      <w:r>
+        <w:t xml:space="preserve"> </w:t>
+      </w:r>
+      <w:r>
+        <w:t xml:space="preserve">result maps what a rigid-body</w:t>
       </w:r>
       <w:r>
         <w:t xml:space="preserve"> </w:t>
@@ -616,19 +580,19 @@
         <w:t xml:space="preserve"> </w:t>
       </w:r>
       <w:r>
-        <w:t xml:space="preserve">flow can and</w:t>
-      </w:r>
-      <w:r>
-        <w:t xml:space="preserve"> </w:t>
-      </w:r>
-      <w:r>
-        <w:t xml:space="preserve">cannot contribute to molecular-crystal generation, and suggests that such</w:t>
-      </w:r>
-      <w:r>
-        <w:t xml:space="preserve"> </w:t>
-      </w:r>
-      <w:r>
-        <w:t xml:space="preserve">generators should condition on crystal symmetry for the relative orientation and</w:t>
+        <w:t xml:space="preserve">flow can and cannot</w:t>
+      </w:r>
+      <w:r>
+        <w:t xml:space="preserve"> </w:t>
+      </w:r>
+      <w:r>
+        <w:t xml:space="preserve">contribute to molecular-crystal generation, and suggests such generators</w:t>
+      </w:r>
+      <w:r>
+        <w:t xml:space="preserve"> </w:t>
+      </w:r>
+      <w:r>
+        <w:t xml:space="preserve">should condition on crystal symmetry for the relative orientation and</w:t>
       </w:r>
       <w:r>
         <w:t xml:space="preserve"> </w:t>

</xml_diff>